<commit_message>
Day 2 Finished (Exam)
Finished in college Tuesday 10 March 12:10
</commit_message>
<xml_diff>
--- a/Task 1/Task 1a/Task1_Proposal_LL-000020914__Naser_A.docx
+++ b/Task 1/Task 1a/Task1_Proposal_LL-000020914__Naser_A.docx
@@ -3621,7 +3621,45 @@
           <w:tcPr>
             <w:tcW w:w="2976" w:type="dxa"/>
           </w:tcPr>
-          <w:p/>
+          <w:p>
+            <w:pPr>
+              <w:pStyle w:val="ListParagraph"/>
+              <w:numPr>
+                <w:ilvl w:val="0"/>
+                <w:numId w:val="11"/>
+              </w:numPr>
+            </w:pPr>
+            <w:r>
+              <w:t>Access</w:t>
+            </w:r>
+            <w:r>
+              <w:t xml:space="preserve"> the homepage</w:t>
+            </w:r>
+          </w:p>
+          <w:p>
+            <w:pPr>
+              <w:pStyle w:val="ListParagraph"/>
+              <w:numPr>
+                <w:ilvl w:val="0"/>
+                <w:numId w:val="11"/>
+              </w:numPr>
+            </w:pPr>
+            <w:r>
+              <w:t xml:space="preserve">Navigate to </w:t>
+            </w:r>
+            <w:r>
+              <w:t>the shop page</w:t>
+            </w:r>
+          </w:p>
+          <w:p>
+            <w:pPr>
+              <w:pStyle w:val="ListParagraph"/>
+              <w:numPr>
+                <w:ilvl w:val="0"/>
+                <w:numId w:val="11"/>
+              </w:numPr>
+            </w:pPr>
+          </w:p>
         </w:tc>
         <w:tc>
           <w:tcPr>
@@ -3944,6 +3982,46 @@
           </w:tcPr>
           <w:p>
             <w:r>
+              <w:t>Loyalty Scheme</w:t>
+            </w:r>
+          </w:p>
+        </w:tc>
+        <w:tc>
+          <w:tcPr>
+            <w:tcW w:w="1733" w:type="dxa"/>
+          </w:tcPr>
+          <w:p>
+            <w:r>
+              <w:t xml:space="preserve">As </w:t>
+            </w:r>
+            <w:r>
+              <w:t>Merinda</w:t>
+            </w:r>
+            <w:r>
+              <w:t xml:space="preserve"> I want to get discounts and special offers after purchasing so that I</w:t>
+            </w:r>
+          </w:p>
+        </w:tc>
+        <w:tc>
+          <w:tcPr>
+            <w:tcW w:w="2976" w:type="dxa"/>
+          </w:tcPr>
+          <w:p/>
+        </w:tc>
+        <w:tc>
+          <w:tcPr>
+            <w:tcW w:w="2784" w:type="dxa"/>
+          </w:tcPr>
+          <w:p/>
+        </w:tc>
+      </w:tr>
+      <w:tr>
+        <w:tc>
+          <w:tcPr>
+            <w:tcW w:w="1523" w:type="dxa"/>
+          </w:tcPr>
+          <w:p>
+            <w:r>
               <w:t>Accessibility Features</w:t>
             </w:r>
           </w:p>
@@ -3952,7 +4030,60 @@
           <w:tcPr>
             <w:tcW w:w="1733" w:type="dxa"/>
           </w:tcPr>
-          <w:p/>
+          <w:p>
+            <w:r>
+              <w:t xml:space="preserve">As Merinda I want </w:t>
+            </w:r>
+            <w:r>
+              <w:t xml:space="preserve">to have access to accessibility features </w:t>
+            </w:r>
+            <w:r>
+              <w:t>so that I</w:t>
+            </w:r>
+          </w:p>
+        </w:tc>
+        <w:tc>
+          <w:tcPr>
+            <w:tcW w:w="2976" w:type="dxa"/>
+          </w:tcPr>
+          <w:p/>
+        </w:tc>
+        <w:tc>
+          <w:tcPr>
+            <w:tcW w:w="2784" w:type="dxa"/>
+          </w:tcPr>
+          <w:p/>
+        </w:tc>
+      </w:tr>
+      <w:tr>
+        <w:tc>
+          <w:tcPr>
+            <w:tcW w:w="1523" w:type="dxa"/>
+          </w:tcPr>
+          <w:p>
+            <w:r>
+              <w:t>Accessibility Features</w:t>
+            </w:r>
+          </w:p>
+        </w:tc>
+        <w:tc>
+          <w:tcPr>
+            <w:tcW w:w="1733" w:type="dxa"/>
+          </w:tcPr>
+          <w:p>
+            <w:r>
+              <w:t xml:space="preserve">As </w:t>
+            </w:r>
+            <w:r>
+              <w:t>Jack</w:t>
+            </w:r>
+            <w:r>
+              <w:t xml:space="preserve"> I want to have access to accessibility features so that I</w:t>
+            </w:r>
+            <w:r>
+              <w:t xml:space="preserve"> can turn the website into dark mode</w:t>
+            </w:r>
+          </w:p>
         </w:tc>
         <w:tc>
           <w:tcPr>
@@ -4037,19 +4168,64 @@
           <w:tcPr>
             <w:tcW w:w="3005" w:type="dxa"/>
           </w:tcPr>
-          <w:p/>
+          <w:p>
+            <w:pPr>
+              <w:jc w:val="center"/>
+              <w:rPr>
+                <w:b/>
+                <w:bCs/>
+              </w:rPr>
+            </w:pPr>
+            <w:r>
+              <w:rPr>
+                <w:b/>
+                <w:bCs/>
+              </w:rPr>
+              <w:t>Non-Functional Requirement</w:t>
+            </w:r>
+          </w:p>
         </w:tc>
         <w:tc>
           <w:tcPr>
             <w:tcW w:w="3005" w:type="dxa"/>
           </w:tcPr>
-          <w:p/>
+          <w:p>
+            <w:pPr>
+              <w:jc w:val="center"/>
+              <w:rPr>
+                <w:b/>
+                <w:bCs/>
+              </w:rPr>
+            </w:pPr>
+            <w:r>
+              <w:rPr>
+                <w:b/>
+                <w:bCs/>
+              </w:rPr>
+              <w:t>Justification</w:t>
+            </w:r>
+          </w:p>
         </w:tc>
         <w:tc>
           <w:tcPr>
             <w:tcW w:w="3006" w:type="dxa"/>
           </w:tcPr>
-          <w:p/>
+          <w:p>
+            <w:pPr>
+              <w:jc w:val="center"/>
+              <w:rPr>
+                <w:b/>
+                <w:bCs/>
+              </w:rPr>
+            </w:pPr>
+            <w:r>
+              <w:rPr>
+                <w:b/>
+                <w:bCs/>
+              </w:rPr>
+              <w:t>KPI</w:t>
+            </w:r>
+          </w:p>
         </w:tc>
       </w:tr>
       <w:tr>
@@ -4057,13 +4233,24 @@
           <w:tcPr>
             <w:tcW w:w="3005" w:type="dxa"/>
           </w:tcPr>
-          <w:p/>
+          <w:p>
+            <w:r>
+              <w:t>Latency of the solution</w:t>
+            </w:r>
+          </w:p>
         </w:tc>
         <w:tc>
           <w:tcPr>
             <w:tcW w:w="3005" w:type="dxa"/>
           </w:tcPr>
-          <w:p/>
+          <w:p>
+            <w:r>
+              <w:t xml:space="preserve">The solution must have consistent low latency speed, in order for the users to have a seamless experience without any frustration. </w:t>
+            </w:r>
+            <w:r>
+              <w:t>The digital solution should maintain fast service especially for simple activities.</w:t>
+            </w:r>
+          </w:p>
         </w:tc>
         <w:tc>
           <w:tcPr>
@@ -4077,7 +4264,11 @@
           <w:tcPr>
             <w:tcW w:w="3005" w:type="dxa"/>
           </w:tcPr>
-          <w:p/>
+          <w:p>
+            <w:r>
+              <w:t>Industry standard load time</w:t>
+            </w:r>
+          </w:p>
         </w:tc>
         <w:tc>
           <w:tcPr>
@@ -4097,7 +4288,35 @@
           <w:tcPr>
             <w:tcW w:w="3005" w:type="dxa"/>
           </w:tcPr>
-          <w:p/>
+          <w:p>
+            <w:r>
+              <w:t>Fast ordering processing</w:t>
+            </w:r>
+          </w:p>
+        </w:tc>
+        <w:tc>
+          <w:tcPr>
+            <w:tcW w:w="3005" w:type="dxa"/>
+          </w:tcPr>
+          <w:p/>
+        </w:tc>
+        <w:tc>
+          <w:tcPr>
+            <w:tcW w:w="3006" w:type="dxa"/>
+          </w:tcPr>
+          <w:p/>
+        </w:tc>
+      </w:tr>
+      <w:tr>
+        <w:tc>
+          <w:tcPr>
+            <w:tcW w:w="3005" w:type="dxa"/>
+          </w:tcPr>
+          <w:p>
+            <w:r>
+              <w:t>Efficient filtering products performance</w:t>
+            </w:r>
+          </w:p>
         </w:tc>
         <w:tc>
           <w:tcPr>
@@ -4161,19 +4380,43 @@
           <w:tcPr>
             <w:tcW w:w="3005" w:type="dxa"/>
           </w:tcPr>
-          <w:p/>
+          <w:p>
+            <w:r>
+              <w:rPr>
+                <w:b/>
+                <w:bCs/>
+              </w:rPr>
+              <w:t>Non-Functional Requirement</w:t>
+            </w:r>
+          </w:p>
         </w:tc>
         <w:tc>
           <w:tcPr>
             <w:tcW w:w="3005" w:type="dxa"/>
           </w:tcPr>
-          <w:p/>
+          <w:p>
+            <w:r>
+              <w:rPr>
+                <w:b/>
+                <w:bCs/>
+              </w:rPr>
+              <w:t>Justification</w:t>
+            </w:r>
+          </w:p>
         </w:tc>
         <w:tc>
           <w:tcPr>
             <w:tcW w:w="3006" w:type="dxa"/>
           </w:tcPr>
-          <w:p/>
+          <w:p>
+            <w:r>
+              <w:rPr>
+                <w:b/>
+                <w:bCs/>
+              </w:rPr>
+              <w:t>KPI</w:t>
+            </w:r>
+          </w:p>
         </w:tc>
       </w:tr>
       <w:tr>
@@ -4181,7 +4424,11 @@
           <w:tcPr>
             <w:tcW w:w="3005" w:type="dxa"/>
           </w:tcPr>
-          <w:p/>
+          <w:p>
+            <w:r>
+              <w:t>Authorisation</w:t>
+            </w:r>
+          </w:p>
         </w:tc>
         <w:tc>
           <w:tcPr>
@@ -4201,7 +4448,11 @@
           <w:tcPr>
             <w:tcW w:w="3005" w:type="dxa"/>
           </w:tcPr>
-          <w:p/>
+          <w:p>
+            <w:r>
+              <w:t>Unauthorised access prevention</w:t>
+            </w:r>
+          </w:p>
         </w:tc>
         <w:tc>
           <w:tcPr>
@@ -4221,7 +4472,50 @@
           <w:tcPr>
             <w:tcW w:w="3005" w:type="dxa"/>
           </w:tcPr>
-          <w:p/>
+          <w:p>
+            <w:r>
+              <w:t xml:space="preserve">Data </w:t>
+            </w:r>
+            <w:r>
+              <w:t>p</w:t>
+            </w:r>
+            <w:r>
+              <w:t>rotection</w:t>
+            </w:r>
+          </w:p>
+        </w:tc>
+        <w:tc>
+          <w:tcPr>
+            <w:tcW w:w="3005" w:type="dxa"/>
+          </w:tcPr>
+          <w:p/>
+        </w:tc>
+        <w:tc>
+          <w:tcPr>
+            <w:tcW w:w="3006" w:type="dxa"/>
+          </w:tcPr>
+          <w:p/>
+        </w:tc>
+      </w:tr>
+      <w:tr>
+        <w:tc>
+          <w:tcPr>
+            <w:tcW w:w="3005" w:type="dxa"/>
+          </w:tcPr>
+          <w:p>
+            <w:r>
+              <w:t>Two</w:t>
+            </w:r>
+            <w:r>
+              <w:t xml:space="preserve">-factor </w:t>
+            </w:r>
+            <w:r>
+              <w:t>a</w:t>
+            </w:r>
+            <w:r>
+              <w:t>uthentication</w:t>
+            </w:r>
+          </w:p>
         </w:tc>
         <w:tc>
           <w:tcPr>
@@ -4285,27 +4579,58 @@
           <w:tcPr>
             <w:tcW w:w="3005" w:type="dxa"/>
           </w:tcPr>
-          <w:p/>
+          <w:p>
+            <w:r>
+              <w:rPr>
+                <w:b/>
+                <w:bCs/>
+              </w:rPr>
+              <w:t>Non-Functional Requirement</w:t>
+            </w:r>
+          </w:p>
         </w:tc>
         <w:tc>
           <w:tcPr>
             <w:tcW w:w="3005" w:type="dxa"/>
           </w:tcPr>
-          <w:p/>
+          <w:p>
+            <w:r>
+              <w:rPr>
+                <w:b/>
+                <w:bCs/>
+              </w:rPr>
+              <w:t>Justification</w:t>
+            </w:r>
+          </w:p>
         </w:tc>
         <w:tc>
           <w:tcPr>
             <w:tcW w:w="3006" w:type="dxa"/>
           </w:tcPr>
-          <w:p/>
+          <w:p>
+            <w:r>
+              <w:rPr>
+                <w:b/>
+                <w:bCs/>
+              </w:rPr>
+              <w:t>KPI</w:t>
+            </w:r>
+          </w:p>
         </w:tc>
       </w:tr>
       <w:tr>
+        <w:trPr>
+          <w:trHeight w:val="483"/>
+        </w:trPr>
         <w:tc>
           <w:tcPr>
             <w:tcW w:w="3005" w:type="dxa"/>
           </w:tcPr>
-          <w:p/>
+          <w:p>
+            <w:r>
+              <w:t>Order processing capacity</w:t>
+            </w:r>
+          </w:p>
         </w:tc>
         <w:tc>
           <w:tcPr>
@@ -4325,7 +4650,11 @@
           <w:tcPr>
             <w:tcW w:w="3005" w:type="dxa"/>
           </w:tcPr>
-          <w:p/>
+          <w:p>
+            <w:r>
+              <w:t>Load tolerance</w:t>
+            </w:r>
+          </w:p>
         </w:tc>
         <w:tc>
           <w:tcPr>
@@ -4345,7 +4674,50 @@
           <w:tcPr>
             <w:tcW w:w="3005" w:type="dxa"/>
           </w:tcPr>
-          <w:p/>
+          <w:p>
+            <w:r>
+              <w:t xml:space="preserve">Data </w:t>
+            </w:r>
+            <w:r>
+              <w:t>v</w:t>
+            </w:r>
+            <w:r>
+              <w:t xml:space="preserve">olume </w:t>
+            </w:r>
+            <w:r>
+              <w:t>s</w:t>
+            </w:r>
+            <w:r>
+              <w:t>calability</w:t>
+            </w:r>
+          </w:p>
+        </w:tc>
+        <w:tc>
+          <w:tcPr>
+            <w:tcW w:w="3005" w:type="dxa"/>
+          </w:tcPr>
+          <w:p/>
+        </w:tc>
+        <w:tc>
+          <w:tcPr>
+            <w:tcW w:w="3006" w:type="dxa"/>
+          </w:tcPr>
+          <w:p/>
+        </w:tc>
+      </w:tr>
+      <w:tr>
+        <w:tc>
+          <w:tcPr>
+            <w:tcW w:w="3005" w:type="dxa"/>
+          </w:tcPr>
+          <w:p>
+            <w:r>
+              <w:t xml:space="preserve">Simultaneous </w:t>
+            </w:r>
+            <w:r>
+              <w:t>producer access</w:t>
+            </w:r>
+          </w:p>
         </w:tc>
         <w:tc>
           <w:tcPr>
@@ -4409,7 +4781,56 @@
           <w:tcPr>
             <w:tcW w:w="3005" w:type="dxa"/>
           </w:tcPr>
-          <w:p/>
+          <w:p>
+            <w:r>
+              <w:rPr>
+                <w:b/>
+                <w:bCs/>
+              </w:rPr>
+              <w:lastRenderedPageBreak/>
+              <w:t>Non-Functional Requirement</w:t>
+            </w:r>
+          </w:p>
+        </w:tc>
+        <w:tc>
+          <w:tcPr>
+            <w:tcW w:w="3005" w:type="dxa"/>
+          </w:tcPr>
+          <w:p>
+            <w:r>
+              <w:rPr>
+                <w:b/>
+                <w:bCs/>
+              </w:rPr>
+              <w:t>Justification</w:t>
+            </w:r>
+          </w:p>
+        </w:tc>
+        <w:tc>
+          <w:tcPr>
+            <w:tcW w:w="3006" w:type="dxa"/>
+          </w:tcPr>
+          <w:p>
+            <w:r>
+              <w:rPr>
+                <w:b/>
+                <w:bCs/>
+              </w:rPr>
+              <w:t>KPI</w:t>
+            </w:r>
+          </w:p>
+        </w:tc>
+      </w:tr>
+      <w:tr>
+        <w:tc>
+          <w:tcPr>
+            <w:tcW w:w="3005" w:type="dxa"/>
+          </w:tcPr>
+          <w:p>
+            <w:r>
+              <w:t>User account capacity</w:t>
+            </w:r>
+          </w:p>
         </w:tc>
         <w:tc>
           <w:tcPr>
@@ -4533,19 +4954,43 @@
           <w:tcPr>
             <w:tcW w:w="3005" w:type="dxa"/>
           </w:tcPr>
-          <w:p/>
+          <w:p>
+            <w:r>
+              <w:rPr>
+                <w:b/>
+                <w:bCs/>
+              </w:rPr>
+              <w:t>Non-Functional Requirement</w:t>
+            </w:r>
+          </w:p>
         </w:tc>
         <w:tc>
           <w:tcPr>
             <w:tcW w:w="3005" w:type="dxa"/>
           </w:tcPr>
-          <w:p/>
+          <w:p>
+            <w:r>
+              <w:rPr>
+                <w:b/>
+                <w:bCs/>
+              </w:rPr>
+              <w:t>Justification</w:t>
+            </w:r>
+          </w:p>
         </w:tc>
         <w:tc>
           <w:tcPr>
             <w:tcW w:w="3006" w:type="dxa"/>
           </w:tcPr>
-          <w:p/>
+          <w:p>
+            <w:r>
+              <w:rPr>
+                <w:b/>
+                <w:bCs/>
+              </w:rPr>
+              <w:t>KPI</w:t>
+            </w:r>
+          </w:p>
         </w:tc>
       </w:tr>
       <w:tr>
@@ -4657,19 +5102,43 @@
           <w:tcPr>
             <w:tcW w:w="3005" w:type="dxa"/>
           </w:tcPr>
-          <w:p/>
+          <w:p>
+            <w:r>
+              <w:rPr>
+                <w:b/>
+                <w:bCs/>
+              </w:rPr>
+              <w:t>Non-Functional Requirement</w:t>
+            </w:r>
+          </w:p>
         </w:tc>
         <w:tc>
           <w:tcPr>
             <w:tcW w:w="3005" w:type="dxa"/>
           </w:tcPr>
-          <w:p/>
+          <w:p>
+            <w:r>
+              <w:rPr>
+                <w:b/>
+                <w:bCs/>
+              </w:rPr>
+              <w:t>Justification</w:t>
+            </w:r>
+          </w:p>
         </w:tc>
         <w:tc>
           <w:tcPr>
             <w:tcW w:w="3006" w:type="dxa"/>
           </w:tcPr>
-          <w:p/>
+          <w:p>
+            <w:r>
+              <w:rPr>
+                <w:b/>
+                <w:bCs/>
+              </w:rPr>
+              <w:t>KPI</w:t>
+            </w:r>
+          </w:p>
         </w:tc>
       </w:tr>
       <w:tr>
@@ -4781,19 +5250,43 @@
           <w:tcPr>
             <w:tcW w:w="3005" w:type="dxa"/>
           </w:tcPr>
-          <w:p/>
+          <w:p>
+            <w:r>
+              <w:rPr>
+                <w:b/>
+                <w:bCs/>
+              </w:rPr>
+              <w:t>Non-Functional Requirement</w:t>
+            </w:r>
+          </w:p>
         </w:tc>
         <w:tc>
           <w:tcPr>
             <w:tcW w:w="3005" w:type="dxa"/>
           </w:tcPr>
-          <w:p/>
+          <w:p>
+            <w:r>
+              <w:rPr>
+                <w:b/>
+                <w:bCs/>
+              </w:rPr>
+              <w:t>Justification</w:t>
+            </w:r>
+          </w:p>
         </w:tc>
         <w:tc>
           <w:tcPr>
             <w:tcW w:w="3006" w:type="dxa"/>
           </w:tcPr>
-          <w:p/>
+          <w:p>
+            <w:r>
+              <w:rPr>
+                <w:b/>
+                <w:bCs/>
+              </w:rPr>
+              <w:t>KPI</w:t>
+            </w:r>
+          </w:p>
         </w:tc>
       </w:tr>
       <w:tr>
@@ -4903,7 +5396,6 @@
         <w:rPr>
           <w:noProof/>
         </w:rPr>
-        <w:lastRenderedPageBreak/>
         <w:drawing>
           <wp:inline distT="0" distB="0" distL="0" distR="0" wp14:anchorId="430B06B4" wp14:editId="434BE920">
             <wp:extent cx="5731510" cy="3943985"/>
@@ -4960,6 +5452,7 @@
       </w:pPr>
       <w:bookmarkStart w:id="6" w:name="_Toc223991160"/>
       <w:r>
+        <w:lastRenderedPageBreak/>
         <w:t>UI Considerations</w:t>
       </w:r>
       <w:bookmarkEnd w:id="6"/>
@@ -4995,19 +5488,68 @@
         </w:rPr>
         <w:t xml:space="preserve"> without too much information on the pages which could lead to confused users. For the designing phase I have considered some key aspects which are the colour scheme, images, fonts and spacing. </w:t>
       </w:r>
-      <w:r>
-        <w:rPr>
-          <w:rFonts w:ascii="Calibri" w:hAnsi="Calibri" w:cs="Calibri"/>
-        </w:rPr>
-        <w:t>First of all, the colour scheme I am planning to use is clean, industry standard and is connected to nature. The main colours I am using are dark green, white/cream, and a dark charcoal/brown colour.</w:t>
-      </w:r>
     </w:p>
     <w:p>
       <w:pPr>
+        <w:spacing w:before="240"/>
         <w:rPr>
           <w:rFonts w:ascii="Calibri" w:hAnsi="Calibri" w:cs="Calibri"/>
         </w:rPr>
       </w:pPr>
+      <w:r>
+        <w:rPr>
+          <w:rFonts w:ascii="Calibri" w:hAnsi="Calibri" w:cs="Calibri"/>
+        </w:rPr>
+        <w:t>First of all, the colour scheme I am planning to use is clean, industry standard and is connected to nature. The main colours I am using are white/cream,</w:t>
+      </w:r>
+      <w:r>
+        <w:rPr>
+          <w:rFonts w:ascii="Calibri" w:hAnsi="Calibri" w:cs="Calibri"/>
+        </w:rPr>
+        <w:t xml:space="preserve"> dark green</w:t>
+      </w:r>
+      <w:r>
+        <w:rPr>
+          <w:rFonts w:ascii="Calibri" w:hAnsi="Calibri" w:cs="Calibri"/>
+        </w:rPr>
+        <w:t>.</w:t>
+      </w:r>
+      <w:r>
+        <w:rPr>
+          <w:rFonts w:ascii="Calibri" w:hAnsi="Calibri" w:cs="Calibri"/>
+        </w:rPr>
+        <w:t xml:space="preserve"> The white and cream colours are bright and welcoming creating a sense of cleanliness and professionalism, they help making key elements in the pages easy to read and stand out.</w:t>
+      </w:r>
+      <w:r>
+        <w:rPr>
+          <w:rFonts w:ascii="Calibri" w:hAnsi="Calibri" w:cs="Calibri"/>
+        </w:rPr>
+        <w:t xml:space="preserve"> The dark green I am planning to use will add a sense of freshness, and a connection to organic, high-quality products. It will be mainly used on key elements to draw the users-attention </w:t>
+      </w:r>
+      <w:r>
+        <w:rPr>
+          <w:rFonts w:ascii="Calibri" w:hAnsi="Calibri" w:cs="Calibri"/>
+        </w:rPr>
+        <w:t xml:space="preserve">such as the register button, “Browse the shop” button or the add to cart and in this </w:t>
+      </w:r>
+      <w:r>
+        <w:rPr>
+          <w:rFonts w:ascii="Calibri" w:hAnsi="Calibri" w:cs="Calibri"/>
+        </w:rPr>
+        <w:t>way,</w:t>
+      </w:r>
+      <w:r>
+        <w:rPr>
+          <w:rFonts w:ascii="Calibri" w:hAnsi="Calibri" w:cs="Calibri"/>
+        </w:rPr>
+        <w:t xml:space="preserve"> it will guide the users through the ordering process. The dark greens hex code I am planning to use is this</w:t>
+      </w:r>
+      <w:r>
+        <w:rPr>
+          <w:rFonts w:ascii="Calibri" w:hAnsi="Calibri" w:cs="Calibri"/>
+        </w:rPr>
+        <w:t xml:space="preserve"> #1B4D3F also called English Green, and I believe this dark forest green accent colour will give the website a luxury feeling grabbing the attention of the users. </w:t>
+      </w:r>
     </w:p>
     <w:p>
       <w:pPr>
@@ -5015,6 +5557,54 @@
           <w:rFonts w:ascii="Calibri" w:hAnsi="Calibri" w:cs="Calibri"/>
         </w:rPr>
       </w:pPr>
+      <w:r>
+        <w:rPr>
+          <w:rFonts w:ascii="Calibri" w:hAnsi="Calibri" w:cs="Calibri"/>
+        </w:rPr>
+        <w:t xml:space="preserve">The fonts I am planning to use </w:t>
+      </w:r>
+      <w:r>
+        <w:rPr>
+          <w:rFonts w:ascii="Calibri" w:hAnsi="Calibri" w:cs="Calibri"/>
+        </w:rPr>
+        <w:t xml:space="preserve">on my visual design are mainly sans-serif fonts, and I am mostly using Montserrat that is a recognised font </w:t>
+      </w:r>
+      <w:r>
+        <w:rPr>
+          <w:rFonts w:ascii="Calibri" w:hAnsi="Calibri" w:cs="Calibri"/>
+        </w:rPr>
+        <w:t xml:space="preserve">widely </w:t>
+      </w:r>
+      <w:r>
+        <w:rPr>
+          <w:rFonts w:ascii="Calibri" w:hAnsi="Calibri" w:cs="Calibri"/>
+        </w:rPr>
+        <w:t>used by many people</w:t>
+      </w:r>
+      <w:r>
+        <w:rPr>
+          <w:rFonts w:ascii="Calibri" w:hAnsi="Calibri" w:cs="Calibri"/>
+        </w:rPr>
+        <w:t xml:space="preserve">. People come across it daily on popular website and programs like Word, which creates a feeling of familiarity. The font is </w:t>
+      </w:r>
+      <w:r>
+        <w:rPr>
+          <w:rFonts w:ascii="Calibri" w:hAnsi="Calibri" w:cs="Calibri"/>
+        </w:rPr>
+        <w:t>industry standard</w:t>
+      </w:r>
+      <w:r>
+        <w:rPr>
+          <w:rFonts w:ascii="Calibri" w:hAnsi="Calibri" w:cs="Calibri"/>
+        </w:rPr>
+        <w:t xml:space="preserve"> and simple which </w:t>
+      </w:r>
+      <w:r>
+        <w:rPr>
+          <w:rFonts w:ascii="Calibri" w:hAnsi="Calibri" w:cs="Calibri"/>
+        </w:rPr>
+        <w:t xml:space="preserve">makes it </w:t>
+      </w:r>
     </w:p>
     <w:p>
       <w:pPr>
@@ -5044,6 +5634,13 @@
         </w:rPr>
       </w:pPr>
     </w:p>
+    <w:p>
+      <w:pPr>
+        <w:rPr>
+          <w:rFonts w:ascii="Calibri" w:hAnsi="Calibri" w:cs="Calibri"/>
+        </w:rPr>
+      </w:pPr>
+    </w:p>
     <w:p/>
     <w:p>
       <w:pPr>
@@ -5063,7 +5660,6 @@
       </w:pPr>
       <w:bookmarkStart w:id="8" w:name="_Toc223991162"/>
       <w:r>
-        <w:lastRenderedPageBreak/>
         <w:t>Risk Matrix</w:t>
       </w:r>
       <w:bookmarkEnd w:id="8"/>
@@ -5585,6 +6181,7 @@
           </w:tcPr>
           <w:p>
             <w:r>
+              <w:lastRenderedPageBreak/>
               <w:t>Consumer Protection from Unfair Trading Regulations 2008</w:t>
             </w:r>
           </w:p>
@@ -6061,6 +6658,119 @@
     </w:lvl>
   </w:abstractNum>
   <w:abstractNum w:abstractNumId="4" w15:restartNumberingAfterBreak="0">
+    <w:nsid w:val="3037689D"/>
+    <w:multiLevelType w:val="hybridMultilevel"/>
+    <w:tmpl w:val="29642C6C"/>
+    <w:lvl w:ilvl="0" w:tplc="08090001">
+      <w:start w:val="1"/>
+      <w:numFmt w:val="bullet"/>
+      <w:lvlText w:val=""/>
+      <w:lvlJc w:val="left"/>
+      <w:pPr>
+        <w:ind w:left="360" w:hanging="360"/>
+      </w:pPr>
+      <w:rPr>
+        <w:rFonts w:ascii="Symbol" w:hAnsi="Symbol" w:hint="default"/>
+      </w:rPr>
+    </w:lvl>
+    <w:lvl w:ilvl="1" w:tplc="08090003" w:tentative="1">
+      <w:start w:val="1"/>
+      <w:numFmt w:val="bullet"/>
+      <w:lvlText w:val="o"/>
+      <w:lvlJc w:val="left"/>
+      <w:pPr>
+        <w:ind w:left="1080" w:hanging="360"/>
+      </w:pPr>
+      <w:rPr>
+        <w:rFonts w:ascii="Courier New" w:hAnsi="Courier New" w:cs="Courier New" w:hint="default"/>
+      </w:rPr>
+    </w:lvl>
+    <w:lvl w:ilvl="2" w:tplc="08090005" w:tentative="1">
+      <w:start w:val="1"/>
+      <w:numFmt w:val="bullet"/>
+      <w:lvlText w:val=""/>
+      <w:lvlJc w:val="left"/>
+      <w:pPr>
+        <w:ind w:left="1800" w:hanging="360"/>
+      </w:pPr>
+      <w:rPr>
+        <w:rFonts w:ascii="Wingdings" w:hAnsi="Wingdings" w:hint="default"/>
+      </w:rPr>
+    </w:lvl>
+    <w:lvl w:ilvl="3" w:tplc="08090001" w:tentative="1">
+      <w:start w:val="1"/>
+      <w:numFmt w:val="bullet"/>
+      <w:lvlText w:val=""/>
+      <w:lvlJc w:val="left"/>
+      <w:pPr>
+        <w:ind w:left="2520" w:hanging="360"/>
+      </w:pPr>
+      <w:rPr>
+        <w:rFonts w:ascii="Symbol" w:hAnsi="Symbol" w:hint="default"/>
+      </w:rPr>
+    </w:lvl>
+    <w:lvl w:ilvl="4" w:tplc="08090003" w:tentative="1">
+      <w:start w:val="1"/>
+      <w:numFmt w:val="bullet"/>
+      <w:lvlText w:val="o"/>
+      <w:lvlJc w:val="left"/>
+      <w:pPr>
+        <w:ind w:left="3240" w:hanging="360"/>
+      </w:pPr>
+      <w:rPr>
+        <w:rFonts w:ascii="Courier New" w:hAnsi="Courier New" w:cs="Courier New" w:hint="default"/>
+      </w:rPr>
+    </w:lvl>
+    <w:lvl w:ilvl="5" w:tplc="08090005" w:tentative="1">
+      <w:start w:val="1"/>
+      <w:numFmt w:val="bullet"/>
+      <w:lvlText w:val=""/>
+      <w:lvlJc w:val="left"/>
+      <w:pPr>
+        <w:ind w:left="3960" w:hanging="360"/>
+      </w:pPr>
+      <w:rPr>
+        <w:rFonts w:ascii="Wingdings" w:hAnsi="Wingdings" w:hint="default"/>
+      </w:rPr>
+    </w:lvl>
+    <w:lvl w:ilvl="6" w:tplc="08090001" w:tentative="1">
+      <w:start w:val="1"/>
+      <w:numFmt w:val="bullet"/>
+      <w:lvlText w:val=""/>
+      <w:lvlJc w:val="left"/>
+      <w:pPr>
+        <w:ind w:left="4680" w:hanging="360"/>
+      </w:pPr>
+      <w:rPr>
+        <w:rFonts w:ascii="Symbol" w:hAnsi="Symbol" w:hint="default"/>
+      </w:rPr>
+    </w:lvl>
+    <w:lvl w:ilvl="7" w:tplc="08090003" w:tentative="1">
+      <w:start w:val="1"/>
+      <w:numFmt w:val="bullet"/>
+      <w:lvlText w:val="o"/>
+      <w:lvlJc w:val="left"/>
+      <w:pPr>
+        <w:ind w:left="5400" w:hanging="360"/>
+      </w:pPr>
+      <w:rPr>
+        <w:rFonts w:ascii="Courier New" w:hAnsi="Courier New" w:cs="Courier New" w:hint="default"/>
+      </w:rPr>
+    </w:lvl>
+    <w:lvl w:ilvl="8" w:tplc="08090005" w:tentative="1">
+      <w:start w:val="1"/>
+      <w:numFmt w:val="bullet"/>
+      <w:lvlText w:val=""/>
+      <w:lvlJc w:val="left"/>
+      <w:pPr>
+        <w:ind w:left="6120" w:hanging="360"/>
+      </w:pPr>
+      <w:rPr>
+        <w:rFonts w:ascii="Wingdings" w:hAnsi="Wingdings" w:hint="default"/>
+      </w:rPr>
+    </w:lvl>
+  </w:abstractNum>
+  <w:abstractNum w:abstractNumId="5" w15:restartNumberingAfterBreak="0">
     <w:nsid w:val="40DD2DEA"/>
     <w:multiLevelType w:val="hybridMultilevel"/>
     <w:tmpl w:val="4D4E024E"/>
@@ -6149,7 +6859,7 @@
       </w:pPr>
     </w:lvl>
   </w:abstractNum>
-  <w:abstractNum w:abstractNumId="5" w15:restartNumberingAfterBreak="0">
+  <w:abstractNum w:abstractNumId="6" w15:restartNumberingAfterBreak="0">
     <w:nsid w:val="45964BD0"/>
     <w:multiLevelType w:val="hybridMultilevel"/>
     <w:tmpl w:val="DE10AA60"/>
@@ -6262,7 +6972,7 @@
       </w:rPr>
     </w:lvl>
   </w:abstractNum>
-  <w:abstractNum w:abstractNumId="6" w15:restartNumberingAfterBreak="0">
+  <w:abstractNum w:abstractNumId="7" w15:restartNumberingAfterBreak="0">
     <w:nsid w:val="4B7051F5"/>
     <w:multiLevelType w:val="hybridMultilevel"/>
     <w:tmpl w:val="B4C6B37A"/>
@@ -6351,7 +7061,7 @@
       </w:pPr>
     </w:lvl>
   </w:abstractNum>
-  <w:abstractNum w:abstractNumId="7" w15:restartNumberingAfterBreak="0">
+  <w:abstractNum w:abstractNumId="8" w15:restartNumberingAfterBreak="0">
     <w:nsid w:val="4CCB478E"/>
     <w:multiLevelType w:val="hybridMultilevel"/>
     <w:tmpl w:val="F32A2A9E"/>
@@ -6464,7 +7174,7 @@
       </w:rPr>
     </w:lvl>
   </w:abstractNum>
-  <w:abstractNum w:abstractNumId="8" w15:restartNumberingAfterBreak="0">
+  <w:abstractNum w:abstractNumId="9" w15:restartNumberingAfterBreak="0">
     <w:nsid w:val="53871932"/>
     <w:multiLevelType w:val="hybridMultilevel"/>
     <w:tmpl w:val="A67A36CE"/>
@@ -6577,7 +7287,7 @@
       </w:rPr>
     </w:lvl>
   </w:abstractNum>
-  <w:abstractNum w:abstractNumId="9" w15:restartNumberingAfterBreak="0">
+  <w:abstractNum w:abstractNumId="10" w15:restartNumberingAfterBreak="0">
     <w:nsid w:val="5F186F0E"/>
     <w:multiLevelType w:val="hybridMultilevel"/>
     <w:tmpl w:val="3042A60A"/>
@@ -6690,25 +7400,25 @@
     </w:lvl>
   </w:abstractNum>
   <w:num w:numId="1">
-    <w:abstractNumId w:val="7"/>
+    <w:abstractNumId w:val="8"/>
   </w:num>
   <w:num w:numId="2">
     <w:abstractNumId w:val="0"/>
   </w:num>
   <w:num w:numId="3">
-    <w:abstractNumId w:val="9"/>
+    <w:abstractNumId w:val="10"/>
   </w:num>
   <w:num w:numId="4">
     <w:abstractNumId w:val="2"/>
   </w:num>
   <w:num w:numId="5">
+    <w:abstractNumId w:val="6"/>
+  </w:num>
+  <w:num w:numId="6">
     <w:abstractNumId w:val="5"/>
   </w:num>
-  <w:num w:numId="6">
-    <w:abstractNumId w:val="4"/>
-  </w:num>
   <w:num w:numId="7">
-    <w:abstractNumId w:val="6"/>
+    <w:abstractNumId w:val="7"/>
   </w:num>
   <w:num w:numId="8">
     <w:abstractNumId w:val="3"/>
@@ -6717,7 +7427,10 @@
     <w:abstractNumId w:val="1"/>
   </w:num>
   <w:num w:numId="10">
-    <w:abstractNumId w:val="8"/>
+    <w:abstractNumId w:val="9"/>
+  </w:num>
+  <w:num w:numId="11">
+    <w:abstractNumId w:val="4"/>
   </w:num>
 </w:numbering>
 </file>
@@ -7167,7 +7880,6 @@
   <w:style w:type="character" w:default="1" w:styleId="DefaultParagraphFont">
     <w:name w:val="Default Paragraph Font"/>
     <w:uiPriority w:val="1"/>
-    <w:semiHidden/>
     <w:unhideWhenUsed/>
   </w:style>
   <w:style w:type="table" w:default="1" w:styleId="TableNormal">
@@ -7454,7 +8166,7 @@
     <w:charset w:val="00"/>
     <w:family w:val="roman"/>
     <w:pitch w:val="variable"/>
-    <w:sig w:usb0="E0002EFF" w:usb1="C000785B" w:usb2="00000009" w:usb3="00000000" w:csb0="000001FF" w:csb1="00000000"/>
+    <w:sig w:usb0="E0002AFF" w:usb1="C0007843" w:usb2="00000009" w:usb3="00000000" w:csb0="000001FF" w:csb1="00000000"/>
   </w:font>
   <w:font w:name="Courier New">
     <w:panose1 w:val="02070309020205020404"/>
@@ -7475,21 +8187,21 @@
     <w:charset w:val="00"/>
     <w:family w:val="swiss"/>
     <w:pitch w:val="variable"/>
-    <w:sig w:usb0="E4002EFF" w:usb1="C200247B" w:usb2="00000009" w:usb3="00000000" w:csb0="000001FF" w:csb1="00000000"/>
+    <w:sig w:usb0="E0002AFF" w:usb1="4000ACFF" w:usb2="00000001" w:usb3="00000000" w:csb0="000001FF" w:csb1="00000000"/>
   </w:font>
   <w:font w:name="Arial">
     <w:panose1 w:val="020B0604020202020204"/>
     <w:charset w:val="00"/>
     <w:family w:val="swiss"/>
     <w:pitch w:val="variable"/>
-    <w:sig w:usb0="E0002EFF" w:usb1="C000785B" w:usb2="00000009" w:usb3="00000000" w:csb0="000001FF" w:csb1="00000000"/>
+    <w:sig w:usb0="E0002AFF" w:usb1="C0007843" w:usb2="00000009" w:usb3="00000000" w:csb0="000001FF" w:csb1="00000000"/>
   </w:font>
   <w:font w:name="Calibri Light">
     <w:panose1 w:val="020F0302020204030204"/>
     <w:charset w:val="00"/>
     <w:family w:val="swiss"/>
     <w:pitch w:val="variable"/>
-    <w:sig w:usb0="E4002EFF" w:usb1="C200247B" w:usb2="00000009" w:usb3="00000000" w:csb0="000001FF" w:csb1="00000000"/>
+    <w:sig w:usb0="A0002AEF" w:usb1="4000207B" w:usb2="00000000" w:usb3="00000000" w:csb0="000001FF" w:csb1="00000000"/>
   </w:font>
 </w:fonts>
 </file>
@@ -7514,7 +8226,7 @@
     <w:rsid w:val="002E5903"/>
     <w:rsid w:val="009D2B66"/>
     <w:rsid w:val="00B03F3A"/>
-    <w:rsid w:val="00C05D7F"/>
+    <w:rsid w:val="00EC41CE"/>
     <w:rsid w:val="00ED6983"/>
     <w:rsid w:val="00F9325C"/>
   </w:rsids>

</xml_diff>

<commit_message>
Thursday before day before exam
Thursday 12 March day before 3rd day of exam.
</commit_message>
<xml_diff>
--- a/Task 1/Task 1a/Task1_Proposal_LL-000020914__Naser_A.docx
+++ b/Task 1/Task 1a/Task1_Proposal_LL-000020914__Naser_A.docx
@@ -51,7 +51,7 @@
                         <pic:cNvPicPr/>
                       </pic:nvPicPr>
                       <pic:blipFill>
-                        <a:blip r:embed="rId6" cstate="print">
+                        <a:blip r:embed="rId8" cstate="print">
                           <a:duotone>
                             <a:schemeClr val="accent1">
                               <a:shade val="45000"/>
@@ -212,7 +212,7 @@
                         <pic:cNvPicPr/>
                       </pic:nvPicPr>
                       <pic:blipFill>
-                        <a:blip r:embed="rId7" cstate="print">
+                        <a:blip r:embed="rId9" cstate="print">
                           <a:duotone>
                             <a:schemeClr val="accent1">
                               <a:shade val="45000"/>
@@ -308,7 +308,7 @@
           <w:r>
             <w:fldChar w:fldCharType="separate"/>
           </w:r>
-          <w:hyperlink w:anchor="_Toc223991154" w:history="1">
+          <w:hyperlink w:anchor="_Toc224242718" w:history="1">
             <w:r>
               <w:rPr>
                 <w:rStyle w:val="Hyperlink"/>
@@ -335,7 +335,7 @@
                 <w:noProof/>
                 <w:webHidden/>
               </w:rPr>
-              <w:instrText xml:space="preserve"> PAGEREF _Toc223991154 \h </w:instrText>
+              <w:instrText xml:space="preserve"> PAGEREF _Toc224242718 \h </w:instrText>
             </w:r>
             <w:r>
               <w:rPr>
@@ -382,7 +382,7 @@
               <w14:ligatures w14:val="standardContextual"/>
             </w:rPr>
           </w:pPr>
-          <w:hyperlink w:anchor="_Toc223991155" w:history="1">
+          <w:hyperlink w:anchor="_Toc224242719" w:history="1">
             <w:r>
               <w:rPr>
                 <w:rStyle w:val="Hyperlink"/>
@@ -409,7 +409,7 @@
                 <w:noProof/>
                 <w:webHidden/>
               </w:rPr>
-              <w:instrText xml:space="preserve"> PAGEREF _Toc223991155 \h </w:instrText>
+              <w:instrText xml:space="preserve"> PAGEREF _Toc224242719 \h </w:instrText>
             </w:r>
             <w:r>
               <w:rPr>
@@ -456,7 +456,7 @@
               <w14:ligatures w14:val="standardContextual"/>
             </w:rPr>
           </w:pPr>
-          <w:hyperlink w:anchor="_Toc223991156" w:history="1">
+          <w:hyperlink w:anchor="_Toc224242720" w:history="1">
             <w:r>
               <w:rPr>
                 <w:rStyle w:val="Hyperlink"/>
@@ -483,7 +483,7 @@
                 <w:noProof/>
                 <w:webHidden/>
               </w:rPr>
-              <w:instrText xml:space="preserve"> PAGEREF _Toc223991156 \h </w:instrText>
+              <w:instrText xml:space="preserve"> PAGEREF _Toc224242720 \h </w:instrText>
             </w:r>
             <w:r>
               <w:rPr>
@@ -530,7 +530,7 @@
               <w14:ligatures w14:val="standardContextual"/>
             </w:rPr>
           </w:pPr>
-          <w:hyperlink w:anchor="_Toc223991157" w:history="1">
+          <w:hyperlink w:anchor="_Toc224242721" w:history="1">
             <w:r>
               <w:rPr>
                 <w:rStyle w:val="Hyperlink"/>
@@ -557,7 +557,7 @@
                 <w:noProof/>
                 <w:webHidden/>
               </w:rPr>
-              <w:instrText xml:space="preserve"> PAGEREF _Toc223991157 \h </w:instrText>
+              <w:instrText xml:space="preserve"> PAGEREF _Toc224242721 \h </w:instrText>
             </w:r>
             <w:r>
               <w:rPr>
@@ -604,7 +604,7 @@
               <w14:ligatures w14:val="standardContextual"/>
             </w:rPr>
           </w:pPr>
-          <w:hyperlink w:anchor="_Toc223991158" w:history="1">
+          <w:hyperlink w:anchor="_Toc224242722" w:history="1">
             <w:r>
               <w:rPr>
                 <w:rStyle w:val="Hyperlink"/>
@@ -631,7 +631,7 @@
                 <w:noProof/>
                 <w:webHidden/>
               </w:rPr>
-              <w:instrText xml:space="preserve"> PAGEREF _Toc223991158 \h </w:instrText>
+              <w:instrText xml:space="preserve"> PAGEREF _Toc224242722 \h </w:instrText>
             </w:r>
             <w:r>
               <w:rPr>
@@ -651,7 +651,7 @@
                 <w:noProof/>
                 <w:webHidden/>
               </w:rPr>
-              <w:t>7</w:t>
+              <w:t>10</w:t>
             </w:r>
             <w:r>
               <w:rPr>
@@ -678,7 +678,7 @@
               <w14:ligatures w14:val="standardContextual"/>
             </w:rPr>
           </w:pPr>
-          <w:hyperlink w:anchor="_Toc223991159" w:history="1">
+          <w:hyperlink w:anchor="_Toc224242723" w:history="1">
             <w:r>
               <w:rPr>
                 <w:rStyle w:val="Hyperlink"/>
@@ -705,7 +705,7 @@
                 <w:noProof/>
                 <w:webHidden/>
               </w:rPr>
-              <w:instrText xml:space="preserve"> PAGEREF _Toc223991159 \h </w:instrText>
+              <w:instrText xml:space="preserve"> PAGEREF _Toc224242723 \h </w:instrText>
             </w:r>
             <w:r>
               <w:rPr>
@@ -725,7 +725,7 @@
                 <w:noProof/>
                 <w:webHidden/>
               </w:rPr>
-              <w:t>9</w:t>
+              <w:t>12</w:t>
             </w:r>
             <w:r>
               <w:rPr>
@@ -752,7 +752,7 @@
               <w14:ligatures w14:val="standardContextual"/>
             </w:rPr>
           </w:pPr>
-          <w:hyperlink w:anchor="_Toc223991160" w:history="1">
+          <w:hyperlink w:anchor="_Toc224242724" w:history="1">
             <w:r>
               <w:rPr>
                 <w:rStyle w:val="Hyperlink"/>
@@ -779,7 +779,7 @@
                 <w:noProof/>
                 <w:webHidden/>
               </w:rPr>
-              <w:instrText xml:space="preserve"> PAGEREF _Toc223991160 \h </w:instrText>
+              <w:instrText xml:space="preserve"> PAGEREF _Toc224242724 \h </w:instrText>
             </w:r>
             <w:r>
               <w:rPr>
@@ -799,7 +799,7 @@
                 <w:noProof/>
                 <w:webHidden/>
               </w:rPr>
-              <w:t>9</w:t>
+              <w:t>13</w:t>
             </w:r>
             <w:r>
               <w:rPr>
@@ -826,7 +826,7 @@
               <w14:ligatures w14:val="standardContextual"/>
             </w:rPr>
           </w:pPr>
-          <w:hyperlink w:anchor="_Toc223991161" w:history="1">
+          <w:hyperlink w:anchor="_Toc224242725" w:history="1">
             <w:r>
               <w:rPr>
                 <w:rStyle w:val="Hyperlink"/>
@@ -853,7 +853,7 @@
                 <w:noProof/>
                 <w:webHidden/>
               </w:rPr>
-              <w:instrText xml:space="preserve"> PAGEREF _Toc223991161 \h </w:instrText>
+              <w:instrText xml:space="preserve"> PAGEREF _Toc224242725 \h </w:instrText>
             </w:r>
             <w:r>
               <w:rPr>
@@ -873,7 +873,7 @@
                 <w:noProof/>
                 <w:webHidden/>
               </w:rPr>
-              <w:t>10</w:t>
+              <w:t>13</w:t>
             </w:r>
             <w:r>
               <w:rPr>
@@ -900,7 +900,7 @@
               <w14:ligatures w14:val="standardContextual"/>
             </w:rPr>
           </w:pPr>
-          <w:hyperlink w:anchor="_Toc223991162" w:history="1">
+          <w:hyperlink w:anchor="_Toc224242726" w:history="1">
             <w:r>
               <w:rPr>
                 <w:rStyle w:val="Hyperlink"/>
@@ -927,7 +927,7 @@
                 <w:noProof/>
                 <w:webHidden/>
               </w:rPr>
-              <w:instrText xml:space="preserve"> PAGEREF _Toc223991162 \h </w:instrText>
+              <w:instrText xml:space="preserve"> PAGEREF _Toc224242726 \h </w:instrText>
             </w:r>
             <w:r>
               <w:rPr>
@@ -947,7 +947,7 @@
                 <w:noProof/>
                 <w:webHidden/>
               </w:rPr>
-              <w:t>10</w:t>
+              <w:t>13</w:t>
             </w:r>
             <w:r>
               <w:rPr>
@@ -974,7 +974,7 @@
               <w14:ligatures w14:val="standardContextual"/>
             </w:rPr>
           </w:pPr>
-          <w:hyperlink w:anchor="_Toc223991163" w:history="1">
+          <w:hyperlink w:anchor="_Toc224242727" w:history="1">
             <w:r>
               <w:rPr>
                 <w:rStyle w:val="Hyperlink"/>
@@ -1001,7 +1001,7 @@
                 <w:noProof/>
                 <w:webHidden/>
               </w:rPr>
-              <w:instrText xml:space="preserve"> PAGEREF _Toc223991163 \h </w:instrText>
+              <w:instrText xml:space="preserve"> PAGEREF _Toc224242727 \h </w:instrText>
             </w:r>
             <w:r>
               <w:rPr>
@@ -1021,7 +1021,7 @@
                 <w:noProof/>
                 <w:webHidden/>
               </w:rPr>
-              <w:t>11</w:t>
+              <w:t>15</w:t>
             </w:r>
             <w:r>
               <w:rPr>
@@ -1066,7 +1066,7 @@
       <w:pPr>
         <w:pStyle w:val="Heading1"/>
       </w:pPr>
-      <w:bookmarkStart w:id="0" w:name="_Toc223991154"/>
+      <w:bookmarkStart w:id="0" w:name="_Toc224242718"/>
       <w:r>
         <w:lastRenderedPageBreak/>
         <w:t>Research</w:t>
@@ -1119,7 +1119,7 @@
       <w:pPr>
         <w:pStyle w:val="Heading1"/>
       </w:pPr>
-      <w:bookmarkStart w:id="1" w:name="_Toc223991155"/>
+      <w:bookmarkStart w:id="1" w:name="_Toc224242719"/>
       <w:r>
         <w:lastRenderedPageBreak/>
         <w:t>Business Context</w:t>
@@ -1150,195 +1150,116 @@
       </w:r>
     </w:p>
     <w:p>
+      <w:r>
+        <w:rPr>
+          <w:rFonts w:ascii="Calibri" w:hAnsi="Calibri" w:cs="Calibri"/>
+        </w:rPr>
+        <w:t>Many competitors</w:t>
+      </w:r>
+      <w:r>
+        <w:rPr>
+          <w:rFonts w:ascii="Calibri" w:hAnsi="Calibri" w:cs="Calibri"/>
+        </w:rPr>
+        <w:t xml:space="preserve"> </w:t>
+      </w:r>
+      <w:r>
+        <w:rPr>
+          <w:rFonts w:ascii="Calibri" w:hAnsi="Calibri" w:cs="Calibri"/>
+        </w:rPr>
+        <w:t xml:space="preserve">in the local farming and food producing industry fail to </w:t>
+      </w:r>
+      <w:r>
+        <w:rPr>
+          <w:rFonts w:ascii="Calibri" w:hAnsi="Calibri" w:cs="Calibri"/>
+        </w:rPr>
+        <w:t xml:space="preserve">clearly </w:t>
+      </w:r>
+      <w:r>
+        <w:t xml:space="preserve">provide </w:t>
+      </w:r>
+      <w:r>
+        <w:t>detailed</w:t>
+      </w:r>
+      <w:r>
+        <w:t xml:space="preserve"> information in their </w:t>
+      </w:r>
+      <w:r>
+        <w:t>digital solution</w:t>
+      </w:r>
+      <w:r>
+        <w:t xml:space="preserve">. </w:t>
+      </w:r>
+      <w:r>
+        <w:t xml:space="preserve">They </w:t>
+      </w:r>
+      <w:r>
+        <w:t xml:space="preserve">lack transparency about </w:t>
+      </w:r>
+      <w:r>
+        <w:t>the</w:t>
+      </w:r>
+      <w:r>
+        <w:t xml:space="preserve">ir </w:t>
+      </w:r>
+      <w:r>
+        <w:t xml:space="preserve">producers, as well as the methods they </w:t>
+      </w:r>
+      <w:r>
+        <w:t>use to produce</w:t>
+      </w:r>
+      <w:r>
+        <w:t>,</w:t>
+      </w:r>
+      <w:r>
+        <w:t xml:space="preserve"> and </w:t>
+      </w:r>
+      <w:r>
+        <w:t xml:space="preserve">they also fail to bring up all the benefits of buying locally. </w:t>
+      </w:r>
+      <w:r>
+        <w:t xml:space="preserve">This results in customers being hesitant, the connection and trust with the customer reduces, abandoned shopping carts or even preferring to shop from competitors. </w:t>
+      </w:r>
+      <w:r>
+        <w:t xml:space="preserve">Therefore, the client, Greenfield Local Hub has requested for the digital solution to include </w:t>
+      </w:r>
+      <w:r>
+        <w:t xml:space="preserve">producer profiles and </w:t>
+      </w:r>
+      <w:r>
+        <w:t xml:space="preserve">all the important information needed. This is </w:t>
+      </w:r>
+      <w:r>
+        <w:t>for</w:t>
+      </w:r>
+      <w:r>
+        <w:t xml:space="preserve"> customers to have a more in-depth idea of the local hub and what they strive for, but also to convey a message to </w:t>
+      </w:r>
+      <w:r>
+        <w:t xml:space="preserve">society on how we must support the locals to boost the </w:t>
+      </w:r>
+      <w:r>
+        <w:t>economy,</w:t>
+      </w:r>
+      <w:r>
+        <w:t xml:space="preserve"> so the money stays within the community. By buying locally, it supports small businesses and new jobs are created, it also helps the environment by reducing transport emissions</w:t>
+      </w:r>
+      <w:r>
+        <w:t xml:space="preserve">. </w:t>
+      </w:r>
+      <w:r>
+        <w:t>Including this information in the solution, will encourage customers to buy locally and help small businesses, it will also enhance the user experience and lead to higher revenue.</w:t>
+      </w:r>
+      <w:r>
+        <w:t xml:space="preserve"> Greenfield Local Hub will then become credible in the community, securing a strong position in the industry. </w:t>
+      </w:r>
+    </w:p>
+    <w:p>
       <w:pPr>
         <w:pStyle w:val="Subtitle"/>
         <w:rPr>
-          <w:rFonts w:ascii="Calibri" w:hAnsi="Calibri" w:cs="Calibri"/>
           <w:color w:val="0D0D0D" w:themeColor="text1" w:themeTint="F2"/>
         </w:rPr>
       </w:pPr>
-      <w:r>
-        <w:rPr>
-          <w:rFonts w:ascii="Calibri" w:hAnsi="Calibri" w:cs="Calibri"/>
-          <w:color w:val="0D0D0D" w:themeColor="text1" w:themeTint="F2"/>
-        </w:rPr>
-        <w:t>Many competitors</w:t>
-      </w:r>
-      <w:r>
-        <w:rPr>
-          <w:rFonts w:ascii="Calibri" w:hAnsi="Calibri" w:cs="Calibri"/>
-          <w:color w:val="0D0D0D" w:themeColor="text1" w:themeTint="F2"/>
-        </w:rPr>
-        <w:t xml:space="preserve"> </w:t>
-      </w:r>
-      <w:r>
-        <w:rPr>
-          <w:rFonts w:ascii="Calibri" w:hAnsi="Calibri" w:cs="Calibri"/>
-          <w:color w:val="0D0D0D" w:themeColor="text1" w:themeTint="F2"/>
-        </w:rPr>
-        <w:t xml:space="preserve">in the local farming and food producing industry fail to </w:t>
-      </w:r>
-      <w:r>
-        <w:rPr>
-          <w:rFonts w:ascii="Calibri" w:hAnsi="Calibri" w:cs="Calibri"/>
-          <w:color w:val="0D0D0D" w:themeColor="text1" w:themeTint="F2"/>
-        </w:rPr>
-        <w:t xml:space="preserve">clearly </w:t>
-      </w:r>
-      <w:r>
-        <w:rPr>
-          <w:rFonts w:ascii="Calibri" w:hAnsi="Calibri" w:cs="Calibri"/>
-          <w:color w:val="0D0D0D" w:themeColor="text1" w:themeTint="F2"/>
-        </w:rPr>
-        <w:t xml:space="preserve">provide </w:t>
-      </w:r>
-      <w:r>
-        <w:rPr>
-          <w:rFonts w:ascii="Calibri" w:hAnsi="Calibri" w:cs="Calibri"/>
-          <w:color w:val="0D0D0D" w:themeColor="text1" w:themeTint="F2"/>
-        </w:rPr>
-        <w:t>detailed</w:t>
-      </w:r>
-      <w:r>
-        <w:rPr>
-          <w:rFonts w:ascii="Calibri" w:hAnsi="Calibri" w:cs="Calibri"/>
-          <w:color w:val="0D0D0D" w:themeColor="text1" w:themeTint="F2"/>
-        </w:rPr>
-        <w:t xml:space="preserve"> information in their </w:t>
-      </w:r>
-      <w:r>
-        <w:rPr>
-          <w:rFonts w:ascii="Calibri" w:hAnsi="Calibri" w:cs="Calibri"/>
-          <w:color w:val="0D0D0D" w:themeColor="text1" w:themeTint="F2"/>
-        </w:rPr>
-        <w:t>digital solution</w:t>
-      </w:r>
-      <w:r>
-        <w:rPr>
-          <w:rFonts w:ascii="Calibri" w:hAnsi="Calibri" w:cs="Calibri"/>
-          <w:color w:val="0D0D0D" w:themeColor="text1" w:themeTint="F2"/>
-        </w:rPr>
-        <w:t xml:space="preserve">. </w:t>
-      </w:r>
-      <w:r>
-        <w:rPr>
-          <w:rFonts w:ascii="Calibri" w:hAnsi="Calibri" w:cs="Calibri"/>
-          <w:color w:val="0D0D0D" w:themeColor="text1" w:themeTint="F2"/>
-        </w:rPr>
-        <w:t>They missed to</w:t>
-      </w:r>
-      <w:r>
-        <w:rPr>
-          <w:rFonts w:ascii="Calibri" w:hAnsi="Calibri" w:cs="Calibri"/>
-          <w:color w:val="0D0D0D" w:themeColor="text1" w:themeTint="F2"/>
-        </w:rPr>
-        <w:t xml:space="preserve"> mention who the</w:t>
-      </w:r>
-      <w:r>
-        <w:rPr>
-          <w:rFonts w:ascii="Calibri" w:hAnsi="Calibri" w:cs="Calibri"/>
-          <w:color w:val="0D0D0D" w:themeColor="text1" w:themeTint="F2"/>
-        </w:rPr>
-        <w:t xml:space="preserve">ir </w:t>
-      </w:r>
-      <w:r>
-        <w:rPr>
-          <w:rFonts w:ascii="Calibri" w:hAnsi="Calibri" w:cs="Calibri"/>
-          <w:color w:val="0D0D0D" w:themeColor="text1" w:themeTint="F2"/>
-        </w:rPr>
-        <w:t xml:space="preserve">producers are, as well as the methods they have </w:t>
-      </w:r>
-      <w:r>
-        <w:rPr>
-          <w:rFonts w:ascii="Calibri" w:hAnsi="Calibri" w:cs="Calibri"/>
-          <w:color w:val="0D0D0D" w:themeColor="text1" w:themeTint="F2"/>
-        </w:rPr>
-        <w:t>used,</w:t>
-      </w:r>
-      <w:r>
-        <w:rPr>
-          <w:rFonts w:ascii="Calibri" w:hAnsi="Calibri" w:cs="Calibri"/>
-          <w:color w:val="0D0D0D" w:themeColor="text1" w:themeTint="F2"/>
-        </w:rPr>
-        <w:t xml:space="preserve"> and </w:t>
-      </w:r>
-      <w:r>
-        <w:rPr>
-          <w:rFonts w:ascii="Calibri" w:hAnsi="Calibri" w:cs="Calibri"/>
-          <w:color w:val="0D0D0D" w:themeColor="text1" w:themeTint="F2"/>
-        </w:rPr>
-        <w:t xml:space="preserve">they also fail to bring up all the benefits of buying locally. </w:t>
-      </w:r>
-      <w:r>
-        <w:rPr>
-          <w:rFonts w:ascii="Calibri" w:hAnsi="Calibri" w:cs="Calibri"/>
-          <w:color w:val="0D0D0D" w:themeColor="text1" w:themeTint="F2"/>
-        </w:rPr>
-        <w:t xml:space="preserve">This results in customers being hesitant, the connection and trust with the customer reduces, abandoned shopping carts or even preferring to go shop from competitors. </w:t>
-      </w:r>
-      <w:r>
-        <w:rPr>
-          <w:rFonts w:ascii="Calibri" w:hAnsi="Calibri" w:cs="Calibri"/>
-          <w:color w:val="0D0D0D" w:themeColor="text1" w:themeTint="F2"/>
-        </w:rPr>
-        <w:t xml:space="preserve">Therefore, the client, Greenfield Local Hub has requested for the digital solution to include all the important information needed. This is </w:t>
-      </w:r>
-      <w:r>
-        <w:rPr>
-          <w:rFonts w:ascii="Calibri" w:hAnsi="Calibri" w:cs="Calibri"/>
-          <w:color w:val="0D0D0D" w:themeColor="text1" w:themeTint="F2"/>
-        </w:rPr>
-        <w:t>for</w:t>
-      </w:r>
-      <w:r>
-        <w:rPr>
-          <w:rFonts w:ascii="Calibri" w:hAnsi="Calibri" w:cs="Calibri"/>
-          <w:color w:val="0D0D0D" w:themeColor="text1" w:themeTint="F2"/>
-        </w:rPr>
-        <w:t xml:space="preserve"> customers to have a more in-depth idea of the local hub and what they strive for, but also to convey a message to </w:t>
-      </w:r>
-      <w:r>
-        <w:rPr>
-          <w:rFonts w:ascii="Calibri" w:hAnsi="Calibri" w:cs="Calibri"/>
-          <w:color w:val="0D0D0D" w:themeColor="text1" w:themeTint="F2"/>
-        </w:rPr>
-        <w:t xml:space="preserve">society on how we must support the locals to boost the </w:t>
-      </w:r>
-      <w:r>
-        <w:rPr>
-          <w:rFonts w:ascii="Calibri" w:hAnsi="Calibri" w:cs="Calibri"/>
-          <w:color w:val="0D0D0D" w:themeColor="text1" w:themeTint="F2"/>
-        </w:rPr>
-        <w:t>economy,</w:t>
-      </w:r>
-      <w:r>
-        <w:rPr>
-          <w:rFonts w:ascii="Calibri" w:hAnsi="Calibri" w:cs="Calibri"/>
-          <w:color w:val="0D0D0D" w:themeColor="text1" w:themeTint="F2"/>
-        </w:rPr>
-        <w:t xml:space="preserve"> so the money stays within the community. By buying locally, it supports small businesses and new jobs are created, it also helps the environment by reducing transport emissions</w:t>
-      </w:r>
-      <w:r>
-        <w:rPr>
-          <w:rFonts w:ascii="Calibri" w:hAnsi="Calibri" w:cs="Calibri"/>
-          <w:color w:val="0D0D0D" w:themeColor="text1" w:themeTint="F2"/>
-        </w:rPr>
-        <w:t xml:space="preserve">. </w:t>
-      </w:r>
-      <w:r>
-        <w:rPr>
-          <w:rFonts w:ascii="Calibri" w:hAnsi="Calibri" w:cs="Calibri"/>
-          <w:color w:val="0D0D0D" w:themeColor="text1" w:themeTint="F2"/>
-        </w:rPr>
-        <w:t>Including this information in the solution, will encourage customers to buy locally and help small businesses, it will also enhance the user experience and lead to higher revenue.</w:t>
-      </w:r>
-      <w:r>
-        <w:rPr>
-          <w:rFonts w:ascii="Calibri" w:hAnsi="Calibri" w:cs="Calibri"/>
-          <w:color w:val="0D0D0D" w:themeColor="text1" w:themeTint="F2"/>
-        </w:rPr>
-        <w:t xml:space="preserve"> Greenfield Local Hub will then become credible in the community, securing a strong position in the industry. </w:t>
-      </w:r>
     </w:p>
     <w:p>
       <w:pPr>
@@ -1351,18 +1272,6 @@
           <w:szCs w:val="24"/>
         </w:rPr>
       </w:pPr>
-    </w:p>
-    <w:p>
-      <w:pPr>
-        <w:pStyle w:val="Subtitle"/>
-        <w:rPr>
-          <w:b/>
-          <w:bCs/>
-          <w:color w:val="0D0D0D" w:themeColor="text1" w:themeTint="F2"/>
-          <w:sz w:val="24"/>
-          <w:szCs w:val="24"/>
-        </w:rPr>
-      </w:pPr>
       <w:r>
         <w:rPr>
           <w:b/>
@@ -1375,19 +1284,35 @@
       </w:r>
     </w:p>
     <w:p>
-      <w:pPr>
-        <w:pStyle w:val="Subtitle"/>
-        <w:rPr>
-          <w:rFonts w:ascii="Calibri" w:hAnsi="Calibri" w:cs="Calibri"/>
-          <w:color w:val="0D0D0D" w:themeColor="text1" w:themeTint="F2"/>
-        </w:rPr>
-      </w:pPr>
-      <w:r>
-        <w:rPr>
-          <w:rFonts w:ascii="Calibri" w:hAnsi="Calibri" w:cs="Calibri"/>
-          <w:color w:val="0D0D0D" w:themeColor="text1" w:themeTint="F2"/>
-        </w:rPr>
-        <w:t>The client</w:t>
+      <w:r>
+        <w:t>Greenfield Local Hub</w:t>
+      </w:r>
+      <w:r>
+        <w:t xml:space="preserve"> has requested that the solution </w:t>
+      </w:r>
+      <w:r>
+        <w:t>provides</w:t>
+      </w:r>
+      <w:r>
+        <w:t xml:space="preserve"> cl</w:t>
+      </w:r>
+      <w:r>
+        <w:t xml:space="preserve">ear product listings with transparent pricing and availability. </w:t>
+      </w:r>
+      <w:r>
+        <w:t>For</w:t>
+      </w:r>
+      <w:r>
+        <w:t xml:space="preserve"> an industry standard solution it must comply with all the consumer legislations, the solution must be clear to all consumers. Customers rely heavily on this information when purchasing online, and without detailed listings that are accurate, they might become uncertain of </w:t>
+      </w:r>
+      <w:r>
+        <w:t>purchasing or</w:t>
+      </w:r>
+      <w:r>
+        <w:t xml:space="preserve"> even feel deceived after having other expectations. By providing </w:t>
+      </w:r>
+      <w:r>
+        <w:t xml:space="preserve">organised product listings with accurate pricing and availability, the solution will improve the user experience leading to satisfied customers, increased sales. This makes the business financially grow which then helps them expand their connections in the community that could lead to other positive possibilities. </w:t>
       </w:r>
     </w:p>
     <w:p>
@@ -1423,7 +1348,23 @@
         <w:t>(Collection or Delivery)</w:t>
       </w:r>
     </w:p>
-    <w:p/>
+    <w:p>
+      <w:r>
+        <w:t xml:space="preserve">The client has requested that the solution allows customers to place order for collection or delivery. </w:t>
+      </w:r>
+      <w:r>
+        <w:t>This is a feature</w:t>
+      </w:r>
+      <w:r>
+        <w:t xml:space="preserve"> most competitors</w:t>
+      </w:r>
+      <w:r>
+        <w:t xml:space="preserve"> in this field fails to include, which could be disappointing for customers. Customers value flexibility and convenience when ordering online and including both the collection and delivery option will be something unique to the business that separates Greenfield Local Hub from most competitors. Without this feature, the business would lose on potential sales and the position on the market that could make them stick out. By including the feature in the digital solution</w:t>
+      </w:r>
+      <w:r>
+        <w:t xml:space="preserve">, it will simplify the purchasing process and provide a seamless user experience. Lastly, this supports consistent business growth since the accessibility of the service improves. </w:t>
+      </w:r>
+    </w:p>
     <w:p/>
     <w:p>
       <w:pPr>
@@ -1449,15 +1390,67 @@
     </w:p>
     <w:p>
       <w:pPr>
-        <w:pStyle w:val="Subtitle"/>
         <w:rPr>
           <w:b/>
           <w:bCs/>
-          <w:color w:val="0D0D0D" w:themeColor="text1" w:themeTint="F2"/>
           <w:sz w:val="24"/>
           <w:szCs w:val="24"/>
         </w:rPr>
       </w:pPr>
+      <w:r>
+        <w:t>Greenfield</w:t>
+      </w:r>
+      <w:r>
+        <w:t xml:space="preserve"> Local Hub has requested that the solution allows customers to create an account, which allows them to also manage their details and view their order history. Customers </w:t>
+      </w:r>
+      <w:r>
+        <w:t xml:space="preserve">expect to be able </w:t>
+      </w:r>
+      <w:r>
+        <w:lastRenderedPageBreak/>
+        <w:t xml:space="preserve">to manage and update their account details, </w:t>
+      </w:r>
+      <w:proofErr w:type="gramStart"/>
+      <w:r>
+        <w:t>in order to</w:t>
+      </w:r>
+      <w:proofErr w:type="gramEnd"/>
+      <w:r>
+        <w:t xml:space="preserve"> make their information successfully up to date. They also appreciate the ability to find their past purchases and reorder items that they liked, and without these functionalities they may feel frustrated or disappointed. This could lead to </w:t>
+      </w:r>
+      <w:r>
+        <w:t xml:space="preserve">a loss of customer trust and loyalty, which can result in negative reviews, less sales and even giving competitors with these features an advantage. By allowing customers to manage their accounts and track their orders easily, the digital solution will offer a more personalised and efficient user experience. </w:t>
+      </w:r>
+      <w:r>
+        <w:t>This will result in repeated orders, but also making the jobs of staff easier</w:t>
+      </w:r>
+      <w:r>
+        <w:t>, spending</w:t>
+      </w:r>
+      <w:r>
+        <w:t xml:space="preserve"> </w:t>
+      </w:r>
+      <w:r>
+        <w:t>less</w:t>
+      </w:r>
+      <w:r>
+        <w:t xml:space="preserve"> time on </w:t>
+      </w:r>
+      <w:r>
+        <w:t>updating users accounts</w:t>
+      </w:r>
+      <w:r>
+        <w:t xml:space="preserve"> and</w:t>
+      </w:r>
+      <w:r>
+        <w:t xml:space="preserve"> finding their past orders</w:t>
+      </w:r>
+      <w:r>
+        <w:t>.</w:t>
+      </w:r>
+      <w:r>
+        <w:t xml:space="preserve"> </w:t>
+      </w:r>
     </w:p>
     <w:p>
       <w:pPr>
@@ -1484,6 +1477,38 @@
     </w:p>
     <w:p>
       <w:pPr>
+        <w:rPr>
+          <w:b/>
+          <w:bCs/>
+          <w:color w:val="0D0D0D" w:themeColor="text1" w:themeTint="F2"/>
+          <w:sz w:val="24"/>
+          <w:szCs w:val="24"/>
+        </w:rPr>
+      </w:pPr>
+      <w:r>
+        <w:t>The client</w:t>
+      </w:r>
+      <w:r>
+        <w:t xml:space="preserve"> wants the solution to include a producer dashboard that makes producers able to manage their stock levels, update product detail and view orders. A professional, industry standard solution should allow producers to efficiently update their available products and quantities. Without this valuable functionality, stock information may have a higher chance of becoming inaccurate or outdated, this could eventually lead to customers ordering products that </w:t>
+      </w:r>
+      <w:r>
+        <w:t xml:space="preserve">are </w:t>
+      </w:r>
+      <w:proofErr w:type="gramStart"/>
+      <w:r>
+        <w:t>in reality not</w:t>
+      </w:r>
+      <w:proofErr w:type="gramEnd"/>
+      <w:r>
+        <w:t xml:space="preserve"> available. This will cause frustration and trouble keeping things running smoothly. By providing a producer management dashboard personalised for each producer, updating the stock, prices, and product details would be easy and more efficient for producers. This will </w:t>
+      </w:r>
+      <w:r>
+        <w:t xml:space="preserve">contribute to accurate listings, and a maintained reliable shopping experience for customers. </w:t>
+      </w:r>
+    </w:p>
+    <w:p/>
+    <w:p>
+      <w:pPr>
         <w:pStyle w:val="Subtitle"/>
         <w:rPr>
           <w:b/>
@@ -1493,6 +1518,36 @@
           <w:szCs w:val="24"/>
         </w:rPr>
       </w:pPr>
+      <w:r>
+        <w:rPr>
+          <w:b/>
+          <w:bCs/>
+          <w:color w:val="0D0D0D" w:themeColor="text1" w:themeTint="F2"/>
+          <w:sz w:val="24"/>
+          <w:szCs w:val="24"/>
+        </w:rPr>
+        <w:t>Order Management, Scheduling &amp; Tracking</w:t>
+      </w:r>
+    </w:p>
+    <w:p>
+      <w:r>
+        <w:t xml:space="preserve">Greenfield Local Hub has conducted market research with existing customers and now are requesting that the solution allows </w:t>
+      </w:r>
+      <w:r>
+        <w:t>customers</w:t>
+      </w:r>
+      <w:r>
+        <w:t xml:space="preserve"> to manage orders,</w:t>
+      </w:r>
+      <w:r>
+        <w:t xml:space="preserve"> schedule collections or deliveries, and track their orders. For customers, being well informed about their orders makes them relieved, and without this functionality they may feel </w:t>
+      </w:r>
+      <w:r>
+        <w:t>worried and uncertain about the progress of their orders. This could lead to more work for the staff because of unnecessary enquiries from customers, or less trust and confidence in the service. By making it possible for users to manage their orders, track scheduled collections or deliveries, the solution w</w:t>
+      </w:r>
+      <w:r>
+        <w:t>ill make ordering more straightforward and convenient for customers. This will result in improved customer satisfaction, and a more consistent and organised shopping experience.</w:t>
+      </w:r>
     </w:p>
     <w:p/>
     <w:p>
@@ -1514,7 +1569,15 @@
           <w:sz w:val="24"/>
           <w:szCs w:val="24"/>
         </w:rPr>
-        <w:t>Order Management, Scheduling &amp; Tracking</w:t>
+        <w:t>Loyalty Scheme &amp; Special Offers</w:t>
+      </w:r>
+    </w:p>
+    <w:p>
+      <w:r>
+        <w:t xml:space="preserve">The market research the client conducted suggested that the solution should include a loyalty scheme that provides discounts and special offers. With the goal of motivating regular customers to keep purchasing and using the service, this feature will be beneficial for the business. </w:t>
+      </w:r>
+      <w:r>
+        <w:t>The loyalty scheme and promotional offers will encourage customers to make frequent purchases and discover different products. By introducing this feature it will help increasing customer retention, support consistent revenue for the business and strengthen customer loyalty.</w:t>
       </w:r>
     </w:p>
     <w:p>
@@ -1528,11 +1591,7 @@
           <w:szCs w:val="24"/>
         </w:rPr>
       </w:pPr>
-    </w:p>
-    <w:p/>
-    <w:p>
-      <w:pPr>
-        <w:pStyle w:val="Subtitle"/>
+      <w:r>
         <w:rPr>
           <w:b/>
           <w:bCs/>
@@ -1540,75 +1599,69 @@
           <w:sz w:val="24"/>
           <w:szCs w:val="24"/>
         </w:rPr>
-      </w:pPr>
-      <w:r>
-        <w:rPr>
-          <w:b/>
-          <w:bCs/>
-          <w:color w:val="0D0D0D" w:themeColor="text1" w:themeTint="F2"/>
-          <w:sz w:val="24"/>
-          <w:szCs w:val="24"/>
-        </w:rPr>
-        <w:t>Loyalty Scheme &amp; Special Offers</w:t>
+        <w:br/>
+        <w:t>Accessibility Features</w:t>
       </w:r>
     </w:p>
     <w:p>
-      <w:pPr>
-        <w:pStyle w:val="Subtitle"/>
-        <w:rPr>
-          <w:b/>
-          <w:bCs/>
-          <w:color w:val="0D0D0D" w:themeColor="text1" w:themeTint="F2"/>
-          <w:sz w:val="24"/>
-          <w:szCs w:val="24"/>
-        </w:rPr>
-      </w:pPr>
-    </w:p>
-    <w:p>
-      <w:pPr>
-        <w:pStyle w:val="Subtitle"/>
-        <w:rPr>
-          <w:b/>
-          <w:bCs/>
-          <w:color w:val="0D0D0D" w:themeColor="text1" w:themeTint="F2"/>
-          <w:sz w:val="24"/>
-          <w:szCs w:val="24"/>
-        </w:rPr>
-      </w:pPr>
-      <w:r>
-        <w:rPr>
-          <w:b/>
-          <w:bCs/>
-          <w:color w:val="0D0D0D" w:themeColor="text1" w:themeTint="F2"/>
-          <w:sz w:val="24"/>
-          <w:szCs w:val="24"/>
-        </w:rPr>
+      <w:r>
+        <w:t xml:space="preserve">Greenfield Local Hub suggested </w:t>
+      </w:r>
+      <w:r>
+        <w:tab/>
+        <w:t xml:space="preserve">that the solution should include accessibility features that support a wide range of users. Majority of the competitors fail to provide accessibility features such as high </w:t>
+      </w:r>
+      <w:r>
         <w:lastRenderedPageBreak/>
-        <w:br/>
-        <w:t>Accessibility Features</w:t>
-      </w:r>
-    </w:p>
-    <w:p>
-      <w:pPr>
-        <w:pStyle w:val="Subtitle"/>
-        <w:rPr>
-          <w:rFonts w:cstheme="minorHAnsi"/>
-          <w:color w:val="262626" w:themeColor="text1" w:themeTint="D9"/>
-        </w:rPr>
-      </w:pPr>
-      <w:r>
-        <w:rPr>
-          <w:rFonts w:cstheme="minorHAnsi"/>
-          <w:color w:val="262626" w:themeColor="text1" w:themeTint="D9"/>
-        </w:rPr>
-        <w:t>The client</w:t>
-      </w:r>
-      <w:r>
-        <w:rPr>
-          <w:rFonts w:cstheme="minorHAnsi"/>
-          <w:color w:val="262626" w:themeColor="text1" w:themeTint="D9"/>
-        </w:rPr>
+        <w:t xml:space="preserve">contrast mode, larger text, dark mode, text-to-speech, etc. This could lead to users </w:t>
+      </w:r>
+      <w:r>
+        <w:t>struggling</w:t>
+      </w:r>
+      <w:r>
+        <w:t xml:space="preserve"> to navigate t</w:t>
+      </w:r>
+      <w:r>
+        <w:t xml:space="preserve">hrough the solution due to disabilities or other difficulties. Therefore, by </w:t>
+      </w:r>
+      <w:r>
+        <w:t>including</w:t>
+      </w:r>
+      <w:r>
+        <w:t xml:space="preserve"> accessibility features</w:t>
+      </w:r>
+      <w:r>
         <w:t xml:space="preserve"> </w:t>
+      </w:r>
+      <w:r>
+        <w:t>the solution will make sure to comply with the WCAG and Equality Act so that more users can easily access the platform</w:t>
+      </w:r>
+      <w:r>
+        <w:t xml:space="preserve"> and result in more satisfied users</w:t>
+      </w:r>
+      <w:r>
+        <w:t xml:space="preserve">. This will </w:t>
+      </w:r>
+      <w:r>
+        <w:t>enhance</w:t>
+      </w:r>
+      <w:r>
+        <w:t xml:space="preserve"> the overall user experience, </w:t>
+      </w:r>
+      <w:r>
+        <w:t>show</w:t>
+      </w:r>
+      <w:r>
+        <w:t xml:space="preserve"> inclusivity and help the business reach all types of users.</w:t>
+      </w:r>
+      <w:r>
+        <w:t xml:space="preserve"> It will then</w:t>
+      </w:r>
+      <w:r>
+        <w:t xml:space="preserve"> </w:t>
+      </w:r>
+      <w:r>
+        <w:t>increase the possibility of the business growing in the community, they will have a better reputation and become one of the top competitors in the market.</w:t>
       </w:r>
     </w:p>
     <w:p>
@@ -1636,33 +1689,12 @@
     <w:p/>
     <w:p/>
     <w:p/>
-    <w:p/>
-    <w:p/>
-    <w:p/>
-    <w:p/>
-    <w:p/>
-    <w:p/>
-    <w:p/>
-    <w:p/>
-    <w:p/>
-    <w:p/>
-    <w:p/>
-    <w:p/>
-    <w:p/>
-    <w:p/>
-    <w:p/>
-    <w:p/>
-    <w:p/>
-    <w:p/>
-    <w:p/>
-    <w:p/>
     <w:p>
       <w:pPr>
         <w:pStyle w:val="Heading1"/>
       </w:pPr>
-      <w:bookmarkStart w:id="2" w:name="_Toc223991156"/>
-      <w:r>
-        <w:lastRenderedPageBreak/>
+      <w:bookmarkStart w:id="2" w:name="_Toc224242720"/>
+      <w:r>
         <w:t>Project Aim</w:t>
       </w:r>
       <w:bookmarkEnd w:id="2"/>
@@ -1680,7 +1712,49 @@
           <w:sz w:val="24"/>
           <w:szCs w:val="24"/>
         </w:rPr>
-        <w:t>These are the essential requirements that the client would like to develop and include in the digital solution:</w:t>
+        <w:t>These are the essential requirements that the client would like to</w:t>
+      </w:r>
+      <w:r>
+        <w:rPr>
+          <w:sz w:val="24"/>
+          <w:szCs w:val="24"/>
+        </w:rPr>
+        <w:t xml:space="preserve"> be</w:t>
+      </w:r>
+      <w:r>
+        <w:rPr>
+          <w:sz w:val="24"/>
+          <w:szCs w:val="24"/>
+        </w:rPr>
+        <w:t xml:space="preserve"> develop</w:t>
+      </w:r>
+      <w:r>
+        <w:rPr>
+          <w:sz w:val="24"/>
+          <w:szCs w:val="24"/>
+        </w:rPr>
+        <w:t>ed</w:t>
+      </w:r>
+      <w:r>
+        <w:rPr>
+          <w:sz w:val="24"/>
+          <w:szCs w:val="24"/>
+        </w:rPr>
+        <w:t xml:space="preserve"> and include</w:t>
+      </w:r>
+      <w:r>
+        <w:rPr>
+          <w:sz w:val="24"/>
+          <w:szCs w:val="24"/>
+        </w:rPr>
+        <w:t>d</w:t>
+      </w:r>
+      <w:r>
+        <w:rPr>
+          <w:sz w:val="24"/>
+          <w:szCs w:val="24"/>
+        </w:rPr>
+        <w:t xml:space="preserve"> in the digital solution:</w:t>
       </w:r>
     </w:p>
     <w:p>
@@ -1855,23 +1929,11 @@
     <w:p/>
     <w:p/>
     <w:p/>
-    <w:p/>
-    <w:p/>
-    <w:p/>
-    <w:p/>
-    <w:p/>
-    <w:p/>
-    <w:p/>
-    <w:p/>
-    <w:p/>
-    <w:p/>
-    <w:p/>
-    <w:p/>
     <w:p>
       <w:pPr>
         <w:pStyle w:val="Heading1"/>
       </w:pPr>
-      <w:bookmarkStart w:id="3" w:name="_Toc223991157"/>
+      <w:bookmarkStart w:id="3" w:name="_Toc224242721"/>
       <w:r>
         <w:lastRenderedPageBreak/>
         <w:t>Functional Requirements</w:t>
@@ -1943,7 +2005,15 @@
         <w:t>U</w:t>
       </w:r>
       <w:r>
-        <w:t>nfortunately, she has weak vision so she needs clear</w:t>
+        <w:t xml:space="preserve">nfortunately, she has weak </w:t>
+      </w:r>
+      <w:proofErr w:type="gramStart"/>
+      <w:r>
+        <w:t>vision</w:t>
+      </w:r>
+      <w:proofErr w:type="gramEnd"/>
+      <w:r>
+        <w:t xml:space="preserve"> so she needs clear</w:t>
       </w:r>
       <w:r>
         <w:t>,</w:t>
@@ -2353,7 +2423,13 @@
               <w:t>customer’s</w:t>
             </w:r>
             <w:r>
-              <w:t xml:space="preserve"> features. Registering is important so that all the data he adds is saved to a personalised account that he can access again whenever he wants. </w:t>
+              <w:t xml:space="preserve"> features. Registering is important so that all the data he adds</w:t>
+            </w:r>
+            <w:r>
+              <w:t xml:space="preserve"> or removes</w:t>
+            </w:r>
+            <w:r>
+              <w:t xml:space="preserve"> is saved to a personalised account that he can access again whenever he wants. </w:t>
             </w:r>
           </w:p>
         </w:tc>
@@ -2509,7 +2585,23 @@
           <w:tcPr>
             <w:tcW w:w="2784" w:type="dxa"/>
           </w:tcPr>
-          <w:p/>
+          <w:p>
+            <w:r>
+              <w:lastRenderedPageBreak/>
+              <w:t xml:space="preserve">Having an account for Merinda is </w:t>
+            </w:r>
+            <w:proofErr w:type="gramStart"/>
+            <w:r>
+              <w:t xml:space="preserve">necessary,  </w:t>
+            </w:r>
+            <w:r>
+              <w:t xml:space="preserve"> </w:t>
+            </w:r>
+            <w:proofErr w:type="gramEnd"/>
+            <w:r>
+              <w:t xml:space="preserve">           </w:t>
+            </w:r>
+          </w:p>
         </w:tc>
       </w:tr>
       <w:tr>
@@ -4011,7 +4103,7 @@
       <w:pPr>
         <w:pStyle w:val="Heading1"/>
       </w:pPr>
-      <w:bookmarkStart w:id="4" w:name="_Toc223991158"/>
+      <w:bookmarkStart w:id="4" w:name="_Toc224242722"/>
       <w:r>
         <w:t>Non-Functional Requirements</w:t>
       </w:r>
@@ -4142,7 +4234,15 @@
           </w:tcPr>
           <w:p>
             <w:r>
-              <w:t xml:space="preserve">The solution must have consistent low latency speed, in order for the users to have a seamless experience without any frustration. </w:t>
+              <w:t xml:space="preserve">The solution must have consistent low latency speed, </w:t>
+            </w:r>
+            <w:proofErr w:type="gramStart"/>
+            <w:r>
+              <w:t>in order for</w:t>
+            </w:r>
+            <w:proofErr w:type="gramEnd"/>
+            <w:r>
+              <w:t xml:space="preserve"> the users to have a seamless experience without any frustration. </w:t>
             </w:r>
             <w:r>
               <w:t>The digital solution should maintain fast service especially for simple activities.</w:t>
@@ -4153,7 +4253,54 @@
           <w:tcPr>
             <w:tcW w:w="3006" w:type="dxa"/>
           </w:tcPr>
-          <w:p/>
+          <w:p>
+            <w:pPr>
+              <w:pStyle w:val="ListParagraph"/>
+              <w:numPr>
+                <w:ilvl w:val="0"/>
+                <w:numId w:val="12"/>
+              </w:numPr>
+            </w:pPr>
+            <w:r>
+              <w:t>The average page response time should be under 2 seconds.</w:t>
+            </w:r>
+          </w:p>
+          <w:p>
+            <w:pPr>
+              <w:pStyle w:val="ListParagraph"/>
+              <w:numPr>
+                <w:ilvl w:val="0"/>
+                <w:numId w:val="12"/>
+              </w:numPr>
+            </w:pPr>
+            <w:r>
+              <w:t xml:space="preserve">At least 95% of requests should respond within 3 seconds.  </w:t>
+            </w:r>
+          </w:p>
+          <w:p>
+            <w:pPr>
+              <w:pStyle w:val="ListParagraph"/>
+              <w:numPr>
+                <w:ilvl w:val="0"/>
+                <w:numId w:val="12"/>
+              </w:numPr>
+            </w:pPr>
+            <w:r>
+              <w:t>The server must fully process under 1 second.</w:t>
+            </w:r>
+          </w:p>
+          <w:p>
+            <w:pPr>
+              <w:pStyle w:val="ListParagraph"/>
+              <w:numPr>
+                <w:ilvl w:val="0"/>
+                <w:numId w:val="12"/>
+              </w:numPr>
+            </w:pPr>
+            <w:r>
+              <w:t>The solutions latency must remain stable during peak time.</w:t>
+            </w:r>
+          </w:p>
         </w:tc>
       </w:tr>
       <w:tr>
@@ -4177,7 +4324,30 @@
           <w:tcPr>
             <w:tcW w:w="3006" w:type="dxa"/>
           </w:tcPr>
-          <w:p/>
+          <w:p>
+            <w:pPr>
+              <w:pStyle w:val="ListParagraph"/>
+              <w:numPr>
+                <w:ilvl w:val="0"/>
+                <w:numId w:val="13"/>
+              </w:numPr>
+            </w:pPr>
+            <w:r>
+              <w:t>Homepage should load in under 2 seconds.</w:t>
+            </w:r>
+          </w:p>
+          <w:p>
+            <w:pPr>
+              <w:pStyle w:val="ListParagraph"/>
+              <w:numPr>
+                <w:ilvl w:val="0"/>
+                <w:numId w:val="13"/>
+              </w:numPr>
+            </w:pPr>
+            <w:r>
+              <w:t>The shop and product pages should load in under 3 seconds.</w:t>
+            </w:r>
+          </w:p>
         </w:tc>
       </w:tr>
       <w:tr>
@@ -4201,10 +4371,63 @@
           <w:tcPr>
             <w:tcW w:w="3006" w:type="dxa"/>
           </w:tcPr>
-          <w:p/>
+          <w:p>
+            <w:pPr>
+              <w:pStyle w:val="ListParagraph"/>
+              <w:numPr>
+                <w:ilvl w:val="0"/>
+                <w:numId w:val="14"/>
+              </w:numPr>
+            </w:pPr>
+            <w:r>
+              <w:t>Order confirmation message should be generated within 2 seconds.</w:t>
+            </w:r>
+          </w:p>
+          <w:p>
+            <w:pPr>
+              <w:pStyle w:val="ListParagraph"/>
+              <w:numPr>
+                <w:ilvl w:val="0"/>
+                <w:numId w:val="14"/>
+              </w:numPr>
+            </w:pPr>
+            <w:r>
+              <w:t>Payment processing should be completed within 3 seconds.</w:t>
+            </w:r>
+          </w:p>
+          <w:p>
+            <w:pPr>
+              <w:pStyle w:val="ListParagraph"/>
+              <w:numPr>
+                <w:ilvl w:val="0"/>
+                <w:numId w:val="14"/>
+              </w:numPr>
+            </w:pPr>
+            <w:r>
+              <w:t>99% of orders should be processed successfully without errors</w:t>
+            </w:r>
+            <w:r>
+              <w:t>.</w:t>
+            </w:r>
+          </w:p>
+          <w:p>
+            <w:pPr>
+              <w:pStyle w:val="ListParagraph"/>
+              <w:numPr>
+                <w:ilvl w:val="0"/>
+                <w:numId w:val="14"/>
+              </w:numPr>
+            </w:pPr>
+            <w:r>
+              <w:t>The system must be able to handle multiple orders at the same time without delay.</w:t>
+            </w:r>
+          </w:p>
         </w:tc>
       </w:tr>
       <w:tr>
+        <w:trPr>
+          <w:trHeight w:val="64"/>
+        </w:trPr>
         <w:tc>
           <w:tcPr>
             <w:tcW w:w="3005" w:type="dxa"/>
@@ -4225,7 +4448,43 @@
           <w:tcPr>
             <w:tcW w:w="3006" w:type="dxa"/>
           </w:tcPr>
-          <w:p/>
+          <w:p>
+            <w:pPr>
+              <w:pStyle w:val="ListParagraph"/>
+              <w:numPr>
+                <w:ilvl w:val="0"/>
+                <w:numId w:val="15"/>
+              </w:numPr>
+            </w:pPr>
+            <w:r>
+              <w:t>Product filters should respond in under 1 second.</w:t>
+            </w:r>
+          </w:p>
+          <w:p>
+            <w:pPr>
+              <w:pStyle w:val="ListParagraph"/>
+              <w:numPr>
+                <w:ilvl w:val="0"/>
+                <w:numId w:val="15"/>
+              </w:numPr>
+            </w:pPr>
+            <w:r>
+              <w:lastRenderedPageBreak/>
+              <w:t>95% of filter requests should be processed within 1.5 seconds.</w:t>
+            </w:r>
+          </w:p>
+          <w:p>
+            <w:pPr>
+              <w:pStyle w:val="ListParagraph"/>
+              <w:numPr>
+                <w:ilvl w:val="0"/>
+                <w:numId w:val="15"/>
+              </w:numPr>
+            </w:pPr>
+            <w:r>
+              <w:t>Search/filter accuracy should be above 98%.</w:t>
+            </w:r>
+          </w:p>
         </w:tc>
       </w:tr>
     </w:tbl>
@@ -4337,7 +4596,54 @@
           <w:tcPr>
             <w:tcW w:w="3006" w:type="dxa"/>
           </w:tcPr>
-          <w:p/>
+          <w:p>
+            <w:pPr>
+              <w:pStyle w:val="ListParagraph"/>
+              <w:numPr>
+                <w:ilvl w:val="0"/>
+                <w:numId w:val="16"/>
+              </w:numPr>
+            </w:pPr>
+            <w:r>
+              <w:t>100% of users must be logged in before being able to access restricted pages.</w:t>
+            </w:r>
+          </w:p>
+          <w:p>
+            <w:pPr>
+              <w:pStyle w:val="ListParagraph"/>
+              <w:numPr>
+                <w:ilvl w:val="0"/>
+                <w:numId w:val="16"/>
+              </w:numPr>
+            </w:pPr>
+            <w:r>
+              <w:t>Role-based access should be applied to all admin/producer features.</w:t>
+            </w:r>
+          </w:p>
+          <w:p>
+            <w:pPr>
+              <w:pStyle w:val="ListParagraph"/>
+              <w:numPr>
+                <w:ilvl w:val="0"/>
+                <w:numId w:val="16"/>
+              </w:numPr>
+            </w:pPr>
+            <w:r>
+              <w:t>Authorisation checks should be completed in under 1 second.</w:t>
+            </w:r>
+          </w:p>
+          <w:p>
+            <w:pPr>
+              <w:pStyle w:val="ListParagraph"/>
+              <w:numPr>
+                <w:ilvl w:val="0"/>
+                <w:numId w:val="16"/>
+              </w:numPr>
+            </w:pPr>
+            <w:r>
+              <w:t>0 unauthorised role changes allowed in the system.</w:t>
+            </w:r>
+          </w:p>
         </w:tc>
       </w:tr>
       <w:tr>
@@ -4361,7 +4667,30 @@
           <w:tcPr>
             <w:tcW w:w="3006" w:type="dxa"/>
           </w:tcPr>
-          <w:p/>
+          <w:p>
+            <w:pPr>
+              <w:pStyle w:val="ListParagraph"/>
+              <w:numPr>
+                <w:ilvl w:val="0"/>
+                <w:numId w:val="17"/>
+              </w:numPr>
+            </w:pPr>
+            <w:r>
+              <w:t>100% of login attempts must be validated by the system.</w:t>
+            </w:r>
+          </w:p>
+          <w:p>
+            <w:pPr>
+              <w:pStyle w:val="ListParagraph"/>
+              <w:numPr>
+                <w:ilvl w:val="0"/>
+                <w:numId w:val="17"/>
+              </w:numPr>
+            </w:pPr>
+            <w:r>
+              <w:t>All restricted pages should be blocked for users that are not logged in.</w:t>
+            </w:r>
+          </w:p>
         </w:tc>
       </w:tr>
       <w:tr>
@@ -4391,7 +4720,45 @@
           <w:tcPr>
             <w:tcW w:w="3006" w:type="dxa"/>
           </w:tcPr>
-          <w:p/>
+          <w:p>
+            <w:pPr>
+              <w:pStyle w:val="ListParagraph"/>
+              <w:numPr>
+                <w:ilvl w:val="0"/>
+                <w:numId w:val="18"/>
+              </w:numPr>
+            </w:pPr>
+            <w:r>
+              <w:t>All user passwords should be stored using hashing.</w:t>
+            </w:r>
+          </w:p>
+          <w:p>
+            <w:pPr>
+              <w:pStyle w:val="ListParagraph"/>
+              <w:numPr>
+                <w:ilvl w:val="0"/>
+                <w:numId w:val="18"/>
+              </w:numPr>
+            </w:pPr>
+            <w:r>
+              <w:t>There should be no unencrypted personal data stored in the database</w:t>
+            </w:r>
+            <w:r>
+              <w:t>.</w:t>
+            </w:r>
+          </w:p>
+          <w:p>
+            <w:pPr>
+              <w:pStyle w:val="ListParagraph"/>
+              <w:numPr>
+                <w:ilvl w:val="0"/>
+                <w:numId w:val="18"/>
+              </w:numPr>
+            </w:pPr>
+            <w:r>
+              <w:t>The access to personal data should be restricted to authorised users only.</w:t>
+            </w:r>
+          </w:p>
         </w:tc>
       </w:tr>
       <w:tr>
@@ -4424,7 +4791,39 @@
           <w:tcPr>
             <w:tcW w:w="3006" w:type="dxa"/>
           </w:tcPr>
-          <w:p/>
+          <w:p>
+            <w:pPr>
+              <w:pStyle w:val="ListParagraph"/>
+              <w:numPr>
+                <w:ilvl w:val="0"/>
+                <w:numId w:val="19"/>
+              </w:numPr>
+            </w:pPr>
+            <w:r>
+              <w:t>95% of</w:t>
+            </w:r>
+            <w:r>
+              <w:t xml:space="preserve"> 2FA verifications should be completed within 2 seconds.</w:t>
+            </w:r>
+          </w:p>
+          <w:p>
+            <w:pPr>
+              <w:pStyle w:val="ListParagraph"/>
+              <w:numPr>
+                <w:ilvl w:val="0"/>
+                <w:numId w:val="19"/>
+              </w:numPr>
+            </w:pPr>
+            <w:r>
+              <w:t>100% of two</w:t>
+            </w:r>
+            <w:r>
+              <w:t>-factor authentication</w:t>
+            </w:r>
+            <w:r>
+              <w:t xml:space="preserve"> codes should be sent securely via authenticator app.</w:t>
+            </w:r>
+          </w:p>
         </w:tc>
       </w:tr>
     </w:tbl>
@@ -4539,7 +4938,43 @@
           <w:tcPr>
             <w:tcW w:w="3006" w:type="dxa"/>
           </w:tcPr>
-          <w:p/>
+          <w:p>
+            <w:pPr>
+              <w:pStyle w:val="ListParagraph"/>
+              <w:numPr>
+                <w:ilvl w:val="0"/>
+                <w:numId w:val="20"/>
+              </w:numPr>
+            </w:pPr>
+            <w:r>
+              <w:t>The system should be able to process over 100 orders per minute.</w:t>
+            </w:r>
+          </w:p>
+          <w:p>
+            <w:pPr>
+              <w:pStyle w:val="ListParagraph"/>
+              <w:numPr>
+                <w:ilvl w:val="0"/>
+                <w:numId w:val="20"/>
+              </w:numPr>
+            </w:pPr>
+            <w:r>
+              <w:lastRenderedPageBreak/>
+              <w:t>95% of orders should be processed within 5 seconds.</w:t>
+            </w:r>
+          </w:p>
+          <w:p>
+            <w:pPr>
+              <w:pStyle w:val="ListParagraph"/>
+              <w:numPr>
+                <w:ilvl w:val="0"/>
+                <w:numId w:val="20"/>
+              </w:numPr>
+            </w:pPr>
+            <w:r>
+              <w:t xml:space="preserve">The success rate for order processing should be 99%. </w:t>
+            </w:r>
+          </w:p>
         </w:tc>
       </w:tr>
       <w:tr>
@@ -4549,6 +4984,7 @@
           </w:tcPr>
           <w:p>
             <w:r>
+              <w:lastRenderedPageBreak/>
               <w:t>Load tolerance</w:t>
             </w:r>
           </w:p>
@@ -4563,7 +4999,33 @@
           <w:tcPr>
             <w:tcW w:w="3006" w:type="dxa"/>
           </w:tcPr>
-          <w:p/>
+          <w:p>
+            <w:pPr>
+              <w:pStyle w:val="ListParagraph"/>
+              <w:numPr>
+                <w:ilvl w:val="0"/>
+                <w:numId w:val="21"/>
+              </w:numPr>
+            </w:pPr>
+            <w:r>
+              <w:t>There should be no system crashes during high traffic periods.</w:t>
+            </w:r>
+          </w:p>
+          <w:p>
+            <w:pPr>
+              <w:pStyle w:val="ListParagraph"/>
+              <w:numPr>
+                <w:ilvl w:val="0"/>
+                <w:numId w:val="21"/>
+              </w:numPr>
+            </w:pPr>
+            <w:r>
+              <w:t xml:space="preserve">Within 30 seconds </w:t>
+            </w:r>
+            <w:r>
+              <w:t>the system should recover from overload.</w:t>
+            </w:r>
+          </w:p>
         </w:tc>
       </w:tr>
       <w:tr>
@@ -4599,10 +5061,51 @@
           <w:tcPr>
             <w:tcW w:w="3006" w:type="dxa"/>
           </w:tcPr>
-          <w:p/>
+          <w:p>
+            <w:pPr>
+              <w:pStyle w:val="ListParagraph"/>
+              <w:numPr>
+                <w:ilvl w:val="0"/>
+                <w:numId w:val="22"/>
+              </w:numPr>
+            </w:pPr>
+            <w:r>
+              <w:t xml:space="preserve">Automatic database indexing </w:t>
+            </w:r>
+            <w:r>
+              <w:t xml:space="preserve">should </w:t>
+            </w:r>
+            <w:r>
+              <w:t>support</w:t>
+            </w:r>
+            <w:r>
+              <w:t xml:space="preserve"> </w:t>
+            </w:r>
+            <w:r>
+              <w:t>fast data retrieval.</w:t>
+            </w:r>
+          </w:p>
+          <w:p>
+            <w:pPr>
+              <w:pStyle w:val="ListParagraph"/>
+              <w:numPr>
+                <w:ilvl w:val="0"/>
+                <w:numId w:val="22"/>
+              </w:numPr>
+            </w:pPr>
+            <w:r>
+              <w:t>Performance should be maintained when database size grows by 50%</w:t>
+            </w:r>
+            <w:r>
+              <w:t>.</w:t>
+            </w:r>
+          </w:p>
         </w:tc>
       </w:tr>
       <w:tr>
+        <w:trPr>
+          <w:trHeight w:val="301"/>
+        </w:trPr>
         <w:tc>
           <w:tcPr>
             <w:tcW w:w="3005" w:type="dxa"/>
@@ -4626,7 +5129,57 @@
           <w:tcPr>
             <w:tcW w:w="3006" w:type="dxa"/>
           </w:tcPr>
-          <w:p/>
+          <w:p>
+            <w:pPr>
+              <w:pStyle w:val="ListParagraph"/>
+              <w:numPr>
+                <w:ilvl w:val="0"/>
+                <w:numId w:val="23"/>
+              </w:numPr>
+            </w:pPr>
+            <w:r>
+              <w:t xml:space="preserve">System should support over 50 producers/admins updating products </w:t>
+            </w:r>
+            <w:r>
+              <w:t>at the same time.</w:t>
+            </w:r>
+          </w:p>
+          <w:p>
+            <w:pPr>
+              <w:pStyle w:val="ListParagraph"/>
+              <w:numPr>
+                <w:ilvl w:val="0"/>
+                <w:numId w:val="23"/>
+              </w:numPr>
+            </w:pPr>
+            <w:r>
+              <w:t>95% of product updates should complete within 2 seconds.</w:t>
+            </w:r>
+          </w:p>
+          <w:p>
+            <w:pPr>
+              <w:pStyle w:val="ListParagraph"/>
+              <w:numPr>
+                <w:ilvl w:val="0"/>
+                <w:numId w:val="23"/>
+              </w:numPr>
+            </w:pPr>
+            <w:r>
+              <w:t>There should be no data conflicts during edits at the same time.</w:t>
+            </w:r>
+          </w:p>
+          <w:p>
+            <w:pPr>
+              <w:pStyle w:val="ListParagraph"/>
+              <w:numPr>
+                <w:ilvl w:val="0"/>
+                <w:numId w:val="23"/>
+              </w:numPr>
+            </w:pPr>
+            <w:r>
+              <w:t>100% of updates should be correctly saved in the database.</w:t>
+            </w:r>
+          </w:p>
         </w:tc>
       </w:tr>
     </w:tbl>
@@ -4684,7 +5237,6 @@
                 <w:b/>
                 <w:bCs/>
               </w:rPr>
-              <w:lastRenderedPageBreak/>
               <w:t>Non-Functional Requirement</w:t>
             </w:r>
           </w:p>
@@ -5281,7 +5833,7 @@
         <w:pStyle w:val="Heading1"/>
         <w:spacing w:after="240"/>
       </w:pPr>
-      <w:bookmarkStart w:id="5" w:name="_Toc223991159"/>
+      <w:bookmarkStart w:id="5" w:name="_Toc224242723"/>
       <w:r>
         <w:t>Hierarchy Diagram</w:t>
       </w:r>
@@ -5311,7 +5863,7 @@
                     </pic:cNvPicPr>
                   </pic:nvPicPr>
                   <pic:blipFill>
-                    <a:blip r:embed="rId8">
+                    <a:blip r:embed="rId10">
                       <a:extLst>
                         <a:ext uri="{28A0092B-C50C-407E-A947-70E740481C1C}">
                           <a14:useLocalDpi xmlns:a14="http://schemas.microsoft.com/office/drawing/2010/main" val="0"/>
@@ -5347,9 +5899,8 @@
       <w:pPr>
         <w:pStyle w:val="Heading1"/>
       </w:pPr>
-      <w:bookmarkStart w:id="6" w:name="_Toc223991160"/>
-      <w:r>
-        <w:lastRenderedPageBreak/>
+      <w:bookmarkStart w:id="6" w:name="_Toc224242724"/>
+      <w:r>
         <w:t>UI Considerations</w:t>
       </w:r>
       <w:bookmarkEnd w:id="6"/>
@@ -5393,11 +5944,19 @@
           <w:rFonts w:ascii="Calibri" w:hAnsi="Calibri" w:cs="Calibri"/>
         </w:rPr>
       </w:pPr>
+      <w:proofErr w:type="gramStart"/>
       <w:r>
         <w:rPr>
           <w:rFonts w:ascii="Calibri" w:hAnsi="Calibri" w:cs="Calibri"/>
         </w:rPr>
-        <w:t>First of all, the colour scheme I am planning to use is clean, industry standard and is connected to nature. The main colours I am using are white/cream,</w:t>
+        <w:t>First of all</w:t>
+      </w:r>
+      <w:proofErr w:type="gramEnd"/>
+      <w:r>
+        <w:rPr>
+          <w:rFonts w:ascii="Calibri" w:hAnsi="Calibri" w:cs="Calibri"/>
+        </w:rPr>
+        <w:t>, the colour scheme I am planning to use is clean, industry standard and is connected to nature. The main colours I am using are white/cream,</w:t>
       </w:r>
       <w:r>
         <w:rPr>
@@ -5439,7 +5998,14 @@
         <w:rPr>
           <w:rFonts w:ascii="Calibri" w:hAnsi="Calibri" w:cs="Calibri"/>
         </w:rPr>
-        <w:t xml:space="preserve"> it will guide the users through the ordering process. The dark greens hex code I am planning to use is this</w:t>
+        <w:t xml:space="preserve"> it will guide the users through the ordering process. The dark greens hex </w:t>
+      </w:r>
+      <w:r>
+        <w:rPr>
+          <w:rFonts w:ascii="Calibri" w:hAnsi="Calibri" w:cs="Calibri"/>
+        </w:rPr>
+        <w:lastRenderedPageBreak/>
+        <w:t>code I am planning to use is this</w:t>
       </w:r>
       <w:r>
         <w:rPr>
@@ -5555,7 +6121,7 @@
       <w:pPr>
         <w:pStyle w:val="Heading1"/>
       </w:pPr>
-      <w:bookmarkStart w:id="7" w:name="_Toc223991161"/>
+      <w:bookmarkStart w:id="7" w:name="_Toc224242725"/>
       <w:r>
         <w:t>Security Considerations &amp; Risk Mitigation</w:t>
       </w:r>
@@ -5567,7 +6133,7 @@
       <w:pPr>
         <w:pStyle w:val="Heading2"/>
       </w:pPr>
-      <w:bookmarkStart w:id="8" w:name="_Toc223991162"/>
+      <w:bookmarkStart w:id="8" w:name="_Toc224242726"/>
       <w:r>
         <w:t>Risk Matrix</w:t>
       </w:r>
@@ -5581,16 +6147,50 @@
         <w:tblLook w:val="04A0" w:firstRow="1" w:lastRow="0" w:firstColumn="1" w:lastColumn="0" w:noHBand="0" w:noVBand="1"/>
       </w:tblPr>
       <w:tblGrid>
-        <w:gridCol w:w="1803"/>
-        <w:gridCol w:w="1803"/>
-        <w:gridCol w:w="1803"/>
-        <w:gridCol w:w="1803"/>
-        <w:gridCol w:w="1804"/>
+        <w:gridCol w:w="704"/>
+        <w:gridCol w:w="1253"/>
+        <w:gridCol w:w="1436"/>
+        <w:gridCol w:w="1595"/>
+        <w:gridCol w:w="1605"/>
+        <w:gridCol w:w="1449"/>
+        <w:gridCol w:w="12"/>
       </w:tblGrid>
       <w:tr>
-        <w:tc>
-          <w:tcPr>
-            <w:tcW w:w="1803" w:type="dxa"/>
+        <w:trPr>
+          <w:gridAfter w:val="1"/>
+          <w:wAfter w:w="12" w:type="dxa"/>
+        </w:trPr>
+        <w:tc>
+          <w:tcPr>
+            <w:tcW w:w="704" w:type="dxa"/>
+            <w:vMerge w:val="restart"/>
+            <w:shd w:val="clear" w:color="auto" w:fill="323E4F"/>
+            <w:textDirection w:val="btLr"/>
+          </w:tcPr>
+          <w:p>
+            <w:pPr>
+              <w:ind w:left="113" w:right="113"/>
+              <w:jc w:val="center"/>
+              <w:rPr>
+                <w:b/>
+                <w:bCs/>
+              </w:rPr>
+            </w:pPr>
+            <w:r>
+              <w:rPr>
+                <w:b/>
+                <w:bCs/>
+                <w:color w:val="FFFFFF" w:themeColor="background1"/>
+                <w:sz w:val="32"/>
+                <w:szCs w:val="32"/>
+              </w:rPr>
+              <w:t>Impact</w:t>
+            </w:r>
+          </w:p>
+        </w:tc>
+        <w:tc>
+          <w:tcPr>
+            <w:tcW w:w="1253" w:type="dxa"/>
           </w:tcPr>
           <w:p>
             <w:r>
@@ -5600,7 +6200,7 @@
         </w:tc>
         <w:tc>
           <w:tcPr>
-            <w:tcW w:w="1803" w:type="dxa"/>
+            <w:tcW w:w="1436" w:type="dxa"/>
             <w:shd w:val="clear" w:color="auto" w:fill="C00000"/>
           </w:tcPr>
           <w:p>
@@ -5611,7 +6211,7 @@
         </w:tc>
         <w:tc>
           <w:tcPr>
-            <w:tcW w:w="1803" w:type="dxa"/>
+            <w:tcW w:w="1595" w:type="dxa"/>
             <w:shd w:val="clear" w:color="auto" w:fill="C00000"/>
           </w:tcPr>
           <w:p>
@@ -5622,7 +6222,7 @@
         </w:tc>
         <w:tc>
           <w:tcPr>
-            <w:tcW w:w="1803" w:type="dxa"/>
+            <w:tcW w:w="1605" w:type="dxa"/>
             <w:shd w:val="clear" w:color="auto" w:fill="C00000"/>
           </w:tcPr>
           <w:p>
@@ -5633,7 +6233,7 @@
         </w:tc>
         <w:tc>
           <w:tcPr>
-            <w:tcW w:w="1804" w:type="dxa"/>
+            <w:tcW w:w="1449" w:type="dxa"/>
             <w:shd w:val="clear" w:color="auto" w:fill="C00000"/>
           </w:tcPr>
           <w:p>
@@ -5644,9 +6244,21 @@
         </w:tc>
       </w:tr>
       <w:tr>
-        <w:tc>
-          <w:tcPr>
-            <w:tcW w:w="1803" w:type="dxa"/>
+        <w:trPr>
+          <w:gridAfter w:val="1"/>
+          <w:wAfter w:w="12" w:type="dxa"/>
+        </w:trPr>
+        <w:tc>
+          <w:tcPr>
+            <w:tcW w:w="704" w:type="dxa"/>
+            <w:vMerge/>
+            <w:shd w:val="clear" w:color="auto" w:fill="323E4F"/>
+          </w:tcPr>
+          <w:p/>
+        </w:tc>
+        <w:tc>
+          <w:tcPr>
+            <w:tcW w:w="1253" w:type="dxa"/>
           </w:tcPr>
           <w:p>
             <w:r>
@@ -5656,19 +6268,19 @@
         </w:tc>
         <w:tc>
           <w:tcPr>
-            <w:tcW w:w="1803" w:type="dxa"/>
+            <w:tcW w:w="1436" w:type="dxa"/>
           </w:tcPr>
           <w:p/>
         </w:tc>
         <w:tc>
           <w:tcPr>
-            <w:tcW w:w="1803" w:type="dxa"/>
+            <w:tcW w:w="1595" w:type="dxa"/>
           </w:tcPr>
           <w:p/>
         </w:tc>
         <w:tc>
           <w:tcPr>
-            <w:tcW w:w="1803" w:type="dxa"/>
+            <w:tcW w:w="1605" w:type="dxa"/>
             <w:shd w:val="clear" w:color="auto" w:fill="C00000"/>
           </w:tcPr>
           <w:p>
@@ -5679,7 +6291,7 @@
         </w:tc>
         <w:tc>
           <w:tcPr>
-            <w:tcW w:w="1804" w:type="dxa"/>
+            <w:tcW w:w="1449" w:type="dxa"/>
             <w:shd w:val="clear" w:color="auto" w:fill="C00000"/>
           </w:tcPr>
           <w:p>
@@ -5690,9 +6302,21 @@
         </w:tc>
       </w:tr>
       <w:tr>
-        <w:tc>
-          <w:tcPr>
-            <w:tcW w:w="1803" w:type="dxa"/>
+        <w:trPr>
+          <w:gridAfter w:val="1"/>
+          <w:wAfter w:w="12" w:type="dxa"/>
+        </w:trPr>
+        <w:tc>
+          <w:tcPr>
+            <w:tcW w:w="704" w:type="dxa"/>
+            <w:vMerge/>
+            <w:shd w:val="clear" w:color="auto" w:fill="323E4F"/>
+          </w:tcPr>
+          <w:p/>
+        </w:tc>
+        <w:tc>
+          <w:tcPr>
+            <w:tcW w:w="1253" w:type="dxa"/>
           </w:tcPr>
           <w:p>
             <w:r>
@@ -5702,33 +6326,45 @@
         </w:tc>
         <w:tc>
           <w:tcPr>
-            <w:tcW w:w="1803" w:type="dxa"/>
+            <w:tcW w:w="1436" w:type="dxa"/>
           </w:tcPr>
           <w:p/>
         </w:tc>
         <w:tc>
           <w:tcPr>
-            <w:tcW w:w="1803" w:type="dxa"/>
+            <w:tcW w:w="1595" w:type="dxa"/>
           </w:tcPr>
           <w:p/>
         </w:tc>
         <w:tc>
           <w:tcPr>
-            <w:tcW w:w="1803" w:type="dxa"/>
+            <w:tcW w:w="1605" w:type="dxa"/>
           </w:tcPr>
           <w:p/>
         </w:tc>
         <w:tc>
           <w:tcPr>
-            <w:tcW w:w="1804" w:type="dxa"/>
+            <w:tcW w:w="1449" w:type="dxa"/>
           </w:tcPr>
           <w:p/>
         </w:tc>
       </w:tr>
       <w:tr>
-        <w:tc>
-          <w:tcPr>
-            <w:tcW w:w="1803" w:type="dxa"/>
+        <w:trPr>
+          <w:gridAfter w:val="1"/>
+          <w:wAfter w:w="12" w:type="dxa"/>
+        </w:trPr>
+        <w:tc>
+          <w:tcPr>
+            <w:tcW w:w="704" w:type="dxa"/>
+            <w:vMerge/>
+            <w:shd w:val="clear" w:color="auto" w:fill="323E4F"/>
+          </w:tcPr>
+          <w:p/>
+        </w:tc>
+        <w:tc>
+          <w:tcPr>
+            <w:tcW w:w="1253" w:type="dxa"/>
           </w:tcPr>
           <w:p>
             <w:r>
@@ -5738,39 +6374,51 @@
         </w:tc>
         <w:tc>
           <w:tcPr>
-            <w:tcW w:w="1803" w:type="dxa"/>
+            <w:tcW w:w="1436" w:type="dxa"/>
           </w:tcPr>
           <w:p/>
         </w:tc>
         <w:tc>
           <w:tcPr>
-            <w:tcW w:w="1803" w:type="dxa"/>
+            <w:tcW w:w="1595" w:type="dxa"/>
           </w:tcPr>
           <w:p/>
         </w:tc>
         <w:tc>
           <w:tcPr>
-            <w:tcW w:w="1803" w:type="dxa"/>
+            <w:tcW w:w="1605" w:type="dxa"/>
           </w:tcPr>
           <w:p/>
         </w:tc>
         <w:tc>
           <w:tcPr>
-            <w:tcW w:w="1804" w:type="dxa"/>
+            <w:tcW w:w="1449" w:type="dxa"/>
           </w:tcPr>
           <w:p/>
         </w:tc>
       </w:tr>
       <w:tr>
-        <w:tc>
-          <w:tcPr>
-            <w:tcW w:w="1803" w:type="dxa"/>
+        <w:trPr>
+          <w:gridAfter w:val="1"/>
+          <w:wAfter w:w="12" w:type="dxa"/>
+        </w:trPr>
+        <w:tc>
+          <w:tcPr>
+            <w:tcW w:w="704" w:type="dxa"/>
+            <w:vMerge/>
+            <w:shd w:val="clear" w:color="auto" w:fill="323E4F"/>
           </w:tcPr>
           <w:p/>
         </w:tc>
         <w:tc>
           <w:tcPr>
-            <w:tcW w:w="1803" w:type="dxa"/>
+            <w:tcW w:w="1253" w:type="dxa"/>
+          </w:tcPr>
+          <w:p/>
+        </w:tc>
+        <w:tc>
+          <w:tcPr>
+            <w:tcW w:w="1436" w:type="dxa"/>
           </w:tcPr>
           <w:p>
             <w:r>
@@ -5780,7 +6428,7 @@
         </w:tc>
         <w:tc>
           <w:tcPr>
-            <w:tcW w:w="1803" w:type="dxa"/>
+            <w:tcW w:w="1595" w:type="dxa"/>
           </w:tcPr>
           <w:p>
             <w:r>
@@ -5790,7 +6438,7 @@
         </w:tc>
         <w:tc>
           <w:tcPr>
-            <w:tcW w:w="1803" w:type="dxa"/>
+            <w:tcW w:w="1605" w:type="dxa"/>
           </w:tcPr>
           <w:p>
             <w:r>
@@ -5800,17 +6448,64 @@
         </w:tc>
         <w:tc>
           <w:tcPr>
-            <w:tcW w:w="1804" w:type="dxa"/>
+            <w:tcW w:w="1449" w:type="dxa"/>
           </w:tcPr>
           <w:p>
             <w:r>
               <w:t>High</w:t>
+            </w:r>
+          </w:p>
+        </w:tc>
+      </w:tr>
+      <w:tr>
+        <w:tc>
+          <w:tcPr>
+            <w:tcW w:w="704" w:type="dxa"/>
+            <w:vMerge/>
+            <w:shd w:val="clear" w:color="auto" w:fill="323E4F"/>
+          </w:tcPr>
+          <w:p/>
+        </w:tc>
+        <w:tc>
+          <w:tcPr>
+            <w:tcW w:w="7350" w:type="dxa"/>
+            <w:gridSpan w:val="6"/>
+            <w:shd w:val="clear" w:color="auto" w:fill="323E4F"/>
+          </w:tcPr>
+          <w:p>
+            <w:pPr>
+              <w:jc w:val="center"/>
+              <w:rPr>
+                <w:b/>
+                <w:bCs/>
+                <w:color w:val="FFFFFF" w:themeColor="background1"/>
+                <w:sz w:val="36"/>
+                <w:szCs w:val="36"/>
+              </w:rPr>
+            </w:pPr>
+            <w:r>
+              <w:rPr>
+                <w:b/>
+                <w:bCs/>
+                <w:color w:val="FFFFFF" w:themeColor="background1"/>
+                <w:sz w:val="32"/>
+                <w:szCs w:val="32"/>
+              </w:rPr>
+              <w:t>Probability</w:t>
             </w:r>
           </w:p>
         </w:tc>
       </w:tr>
     </w:tbl>
     <w:p/>
+    <w:p>
+      <w:pPr>
+        <w:pStyle w:val="Heading3"/>
+      </w:pPr>
+      <w:r>
+        <w:t>Risk Descriptions</w:t>
+      </w:r>
+    </w:p>
     <w:p/>
     <w:p/>
     <w:tbl>
@@ -5820,27 +6515,100 @@
         <w:tblLook w:val="04A0" w:firstRow="1" w:lastRow="0" w:firstColumn="1" w:lastColumn="0" w:noHBand="0" w:noVBand="1"/>
       </w:tblPr>
       <w:tblGrid>
-        <w:gridCol w:w="4508"/>
-        <w:gridCol w:w="4508"/>
+        <w:gridCol w:w="621"/>
+        <w:gridCol w:w="2672"/>
+        <w:gridCol w:w="5723"/>
       </w:tblGrid>
       <w:tr>
         <w:tc>
           <w:tcPr>
-            <w:tcW w:w="4508" w:type="dxa"/>
-          </w:tcPr>
-          <w:p/>
-        </w:tc>
-        <w:tc>
-          <w:tcPr>
-            <w:tcW w:w="4508" w:type="dxa"/>
-          </w:tcPr>
-          <w:p/>
+            <w:tcW w:w="572" w:type="dxa"/>
+            <w:shd w:val="clear" w:color="auto" w:fill="323E4F"/>
+          </w:tcPr>
+          <w:p>
+            <w:pPr>
+              <w:jc w:val="center"/>
+              <w:rPr>
+                <w:b/>
+                <w:bCs/>
+                <w:color w:val="FFFFFF" w:themeColor="background1"/>
+                <w:sz w:val="24"/>
+                <w:szCs w:val="24"/>
+              </w:rPr>
+            </w:pPr>
+            <w:r>
+              <w:rPr>
+                <w:b/>
+                <w:bCs/>
+                <w:color w:val="FFFFFF" w:themeColor="background1"/>
+                <w:sz w:val="24"/>
+                <w:szCs w:val="24"/>
+              </w:rPr>
+              <w:t>Risk</w:t>
+            </w:r>
+          </w:p>
+        </w:tc>
+        <w:tc>
+          <w:tcPr>
+            <w:tcW w:w="2684" w:type="dxa"/>
+            <w:shd w:val="clear" w:color="auto" w:fill="323E4F"/>
+          </w:tcPr>
+          <w:p>
+            <w:pPr>
+              <w:jc w:val="center"/>
+              <w:rPr>
+                <w:b/>
+                <w:bCs/>
+                <w:color w:val="FFFFFF" w:themeColor="background1"/>
+                <w:sz w:val="24"/>
+                <w:szCs w:val="24"/>
+              </w:rPr>
+            </w:pPr>
+            <w:r>
+              <w:rPr>
+                <w:b/>
+                <w:bCs/>
+                <w:color w:val="FFFFFF" w:themeColor="background1"/>
+                <w:sz w:val="24"/>
+                <w:szCs w:val="24"/>
+              </w:rPr>
+              <w:t>Mitigation Strategy</w:t>
+            </w:r>
+          </w:p>
+        </w:tc>
+        <w:tc>
+          <w:tcPr>
+            <w:tcW w:w="5760" w:type="dxa"/>
+            <w:shd w:val="clear" w:color="auto" w:fill="323E4F"/>
+          </w:tcPr>
+          <w:p>
+            <w:pPr>
+              <w:jc w:val="center"/>
+              <w:rPr>
+                <w:b/>
+                <w:bCs/>
+                <w:color w:val="FFFFFF" w:themeColor="background1"/>
+                <w:sz w:val="24"/>
+                <w:szCs w:val="24"/>
+              </w:rPr>
+            </w:pPr>
+            <w:r>
+              <w:rPr>
+                <w:b/>
+                <w:bCs/>
+                <w:color w:val="FFFFFF" w:themeColor="background1"/>
+                <w:sz w:val="24"/>
+                <w:szCs w:val="24"/>
+              </w:rPr>
+              <w:t>Justification</w:t>
+            </w:r>
+          </w:p>
         </w:tc>
       </w:tr>
       <w:tr>
         <w:tc>
           <w:tcPr>
-            <w:tcW w:w="4508" w:type="dxa"/>
+            <w:tcW w:w="572" w:type="dxa"/>
           </w:tcPr>
           <w:p>
             <w:r>
@@ -5850,7 +6618,13 @@
         </w:tc>
         <w:tc>
           <w:tcPr>
-            <w:tcW w:w="4508" w:type="dxa"/>
+            <w:tcW w:w="2684" w:type="dxa"/>
+          </w:tcPr>
+          <w:p/>
+        </w:tc>
+        <w:tc>
+          <w:tcPr>
+            <w:tcW w:w="5760" w:type="dxa"/>
           </w:tcPr>
           <w:p/>
         </w:tc>
@@ -5858,7 +6632,7 @@
       <w:tr>
         <w:tc>
           <w:tcPr>
-            <w:tcW w:w="4508" w:type="dxa"/>
+            <w:tcW w:w="572" w:type="dxa"/>
           </w:tcPr>
           <w:p>
             <w:r>
@@ -5868,7 +6642,13 @@
         </w:tc>
         <w:tc>
           <w:tcPr>
-            <w:tcW w:w="4508" w:type="dxa"/>
+            <w:tcW w:w="2684" w:type="dxa"/>
+          </w:tcPr>
+          <w:p/>
+        </w:tc>
+        <w:tc>
+          <w:tcPr>
+            <w:tcW w:w="5760" w:type="dxa"/>
           </w:tcPr>
           <w:p/>
         </w:tc>
@@ -5876,7 +6656,7 @@
       <w:tr>
         <w:tc>
           <w:tcPr>
-            <w:tcW w:w="4508" w:type="dxa"/>
+            <w:tcW w:w="572" w:type="dxa"/>
           </w:tcPr>
           <w:p>
             <w:r>
@@ -5886,7 +6666,13 @@
         </w:tc>
         <w:tc>
           <w:tcPr>
-            <w:tcW w:w="4508" w:type="dxa"/>
+            <w:tcW w:w="2684" w:type="dxa"/>
+          </w:tcPr>
+          <w:p/>
+        </w:tc>
+        <w:tc>
+          <w:tcPr>
+            <w:tcW w:w="5760" w:type="dxa"/>
           </w:tcPr>
           <w:p/>
         </w:tc>
@@ -5894,7 +6680,7 @@
       <w:tr>
         <w:tc>
           <w:tcPr>
-            <w:tcW w:w="4508" w:type="dxa"/>
+            <w:tcW w:w="572" w:type="dxa"/>
           </w:tcPr>
           <w:p>
             <w:r>
@@ -5904,7 +6690,13 @@
         </w:tc>
         <w:tc>
           <w:tcPr>
-            <w:tcW w:w="4508" w:type="dxa"/>
+            <w:tcW w:w="2684" w:type="dxa"/>
+          </w:tcPr>
+          <w:p/>
+        </w:tc>
+        <w:tc>
+          <w:tcPr>
+            <w:tcW w:w="5760" w:type="dxa"/>
           </w:tcPr>
           <w:p/>
         </w:tc>
@@ -5912,7 +6704,7 @@
       <w:tr>
         <w:tc>
           <w:tcPr>
-            <w:tcW w:w="4508" w:type="dxa"/>
+            <w:tcW w:w="572" w:type="dxa"/>
           </w:tcPr>
           <w:p>
             <w:r>
@@ -5922,7 +6714,13 @@
         </w:tc>
         <w:tc>
           <w:tcPr>
-            <w:tcW w:w="4508" w:type="dxa"/>
+            <w:tcW w:w="2684" w:type="dxa"/>
+          </w:tcPr>
+          <w:p/>
+        </w:tc>
+        <w:tc>
+          <w:tcPr>
+            <w:tcW w:w="5760" w:type="dxa"/>
           </w:tcPr>
           <w:p/>
         </w:tc>
@@ -5930,7 +6728,7 @@
       <w:tr>
         <w:tc>
           <w:tcPr>
-            <w:tcW w:w="4508" w:type="dxa"/>
+            <w:tcW w:w="572" w:type="dxa"/>
           </w:tcPr>
           <w:p>
             <w:r>
@@ -5940,7 +6738,13 @@
         </w:tc>
         <w:tc>
           <w:tcPr>
-            <w:tcW w:w="4508" w:type="dxa"/>
+            <w:tcW w:w="2684" w:type="dxa"/>
+          </w:tcPr>
+          <w:p/>
+        </w:tc>
+        <w:tc>
+          <w:tcPr>
+            <w:tcW w:w="5760" w:type="dxa"/>
           </w:tcPr>
           <w:p/>
         </w:tc>
@@ -5968,11 +6772,14 @@
     <w:p/>
     <w:p/>
     <w:p/>
+    <w:p/>
+    <w:p/>
+    <w:p/>
     <w:p>
       <w:pPr>
         <w:pStyle w:val="Heading1"/>
       </w:pPr>
-      <w:bookmarkStart w:id="9" w:name="_Toc223991163"/>
+      <w:bookmarkStart w:id="9" w:name="_Toc224242727"/>
       <w:r>
         <w:t>Legal and Regulatory Guidelines</w:t>
       </w:r>
@@ -5986,13 +6793,37 @@
         <w:tblLook w:val="04A0" w:firstRow="1" w:lastRow="0" w:firstColumn="1" w:lastColumn="0" w:noHBand="0" w:noVBand="1"/>
       </w:tblPr>
       <w:tblGrid>
-        <w:gridCol w:w="3397"/>
-        <w:gridCol w:w="5619"/>
+        <w:gridCol w:w="3964"/>
+        <w:gridCol w:w="5052"/>
       </w:tblGrid>
       <w:tr>
         <w:tc>
           <w:tcPr>
-            <w:tcW w:w="3397" w:type="dxa"/>
+            <w:tcW w:w="3964" w:type="dxa"/>
+            <w:shd w:val="clear" w:color="auto" w:fill="323E4F" w:themeFill="text2" w:themeFillShade="BF"/>
+          </w:tcPr>
+          <w:p>
+            <w:pPr>
+              <w:jc w:val="center"/>
+              <w:rPr>
+                <w:color w:val="FFFFFF" w:themeColor="background1"/>
+                <w:sz w:val="28"/>
+                <w:szCs w:val="28"/>
+              </w:rPr>
+            </w:pPr>
+            <w:r>
+              <w:rPr>
+                <w:color w:val="FFFFFF" w:themeColor="background1"/>
+                <w:sz w:val="28"/>
+                <w:szCs w:val="28"/>
+              </w:rPr>
+              <w:t>Legislation</w:t>
+            </w:r>
+          </w:p>
+        </w:tc>
+        <w:tc>
+          <w:tcPr>
+            <w:tcW w:w="5052" w:type="dxa"/>
             <w:shd w:val="clear" w:color="auto" w:fill="323E4F" w:themeFill="text2" w:themeFillShade="BF"/>
           </w:tcPr>
           <w:p>
@@ -6014,14 +6845,18 @@
                 <w:sz w:val="28"/>
                 <w:szCs w:val="28"/>
               </w:rPr>
-              <w:t>Legislation</w:t>
-            </w:r>
-          </w:p>
-        </w:tc>
-        <w:tc>
-          <w:tcPr>
-            <w:tcW w:w="5619" w:type="dxa"/>
-            <w:shd w:val="clear" w:color="auto" w:fill="323E4F" w:themeFill="text2" w:themeFillShade="BF"/>
+              <w:t>Application</w:t>
+            </w:r>
+          </w:p>
+        </w:tc>
+      </w:tr>
+      <w:tr>
+        <w:trPr>
+          <w:trHeight w:val="1312"/>
+        </w:trPr>
+        <w:tc>
+          <w:tcPr>
+            <w:tcW w:w="3964" w:type="dxa"/>
           </w:tcPr>
           <w:p>
             <w:pPr>
@@ -6029,20 +6864,93 @@
               <w:rPr>
                 <w:b/>
                 <w:bCs/>
-                <w:color w:val="FFFFFF" w:themeColor="background1"/>
-                <w:sz w:val="28"/>
-                <w:szCs w:val="28"/>
               </w:rPr>
             </w:pPr>
             <w:r>
               <w:rPr>
                 <w:b/>
                 <w:bCs/>
-                <w:color w:val="FFFFFF" w:themeColor="background1"/>
-                <w:sz w:val="28"/>
-                <w:szCs w:val="28"/>
-              </w:rPr>
-              <w:t>Application</w:t>
+              </w:rPr>
+              <w:t>G</w:t>
+            </w:r>
+            <w:r>
+              <w:rPr>
+                <w:b/>
+                <w:bCs/>
+              </w:rPr>
+              <w:t xml:space="preserve">eneral Data Protection Regulation </w:t>
+            </w:r>
+            <w:r>
+              <w:rPr>
+                <w:b/>
+                <w:bCs/>
+              </w:rPr>
+              <w:t>/ Data Protection Act 2018</w:t>
+            </w:r>
+          </w:p>
+        </w:tc>
+        <w:tc>
+          <w:tcPr>
+            <w:tcW w:w="5052" w:type="dxa"/>
+          </w:tcPr>
+          <w:p>
+            <w:r>
+              <w:t>The solution will make sure to comply with the G</w:t>
+            </w:r>
+            <w:r>
+              <w:t xml:space="preserve">eneral </w:t>
+            </w:r>
+            <w:r>
+              <w:t>D</w:t>
+            </w:r>
+            <w:r>
+              <w:t xml:space="preserve">ata </w:t>
+            </w:r>
+            <w:r>
+              <w:t>P</w:t>
+            </w:r>
+            <w:r>
+              <w:t xml:space="preserve">rotection </w:t>
+            </w:r>
+            <w:r>
+              <w:t>R</w:t>
+            </w:r>
+            <w:r>
+              <w:t>egulation</w:t>
+            </w:r>
+            <w:r>
+              <w:t xml:space="preserve"> and Data Protection Act by making sure that customer information that is saved such as names, email addresses, delivery details, and account data are stored securely. The data </w:t>
+            </w:r>
+            <w:r>
+              <w:t>will</w:t>
+            </w:r>
+            <w:r>
+              <w:t xml:space="preserve"> </w:t>
+            </w:r>
+            <w:r>
+              <w:t>be</w:t>
+            </w:r>
+            <w:r>
+              <w:t xml:space="preserve"> collected </w:t>
+            </w:r>
+            <w:r>
+              <w:t>lawfully and</w:t>
+            </w:r>
+            <w:r>
+              <w:t xml:space="preserve"> only used for its intended purpose only. Greenfield Local Hub must </w:t>
+            </w:r>
+            <w:r>
+              <w:t>tell</w:t>
+            </w:r>
+            <w:r>
+              <w:t xml:space="preserve"> their customers how their data is </w:t>
+            </w:r>
+            <w:r>
+              <w:t xml:space="preserve">used with a clear privacy policy. Failing to comply with these regulations could lead to data </w:t>
+            </w:r>
+            <w:r>
+              <w:lastRenderedPageBreak/>
+              <w:t xml:space="preserve">breaches, loss of customer trust, reputational loss and legal consequences. </w:t>
             </w:r>
           </w:p>
         </w:tc>
@@ -6050,128 +6958,350 @@
       <w:tr>
         <w:tc>
           <w:tcPr>
-            <w:tcW w:w="3397" w:type="dxa"/>
-          </w:tcPr>
-          <w:p>
-            <w:r>
-              <w:t>GDPR / Data Protection Act 2018</w:t>
-            </w:r>
-          </w:p>
-        </w:tc>
-        <w:tc>
-          <w:tcPr>
-            <w:tcW w:w="5619" w:type="dxa"/>
-          </w:tcPr>
-          <w:p/>
+            <w:tcW w:w="3964" w:type="dxa"/>
+          </w:tcPr>
+          <w:p>
+            <w:pPr>
+              <w:jc w:val="center"/>
+              <w:rPr>
+                <w:b/>
+                <w:bCs/>
+              </w:rPr>
+            </w:pPr>
+            <w:r>
+              <w:rPr>
+                <w:b/>
+                <w:bCs/>
+              </w:rPr>
+              <w:lastRenderedPageBreak/>
+              <w:t>Consumer Rights Act 2015</w:t>
+            </w:r>
+          </w:p>
+        </w:tc>
+        <w:tc>
+          <w:tcPr>
+            <w:tcW w:w="5052" w:type="dxa"/>
+          </w:tcPr>
+          <w:p>
+            <w:r>
+              <w:t>The Consumer Rights Act makes sure that customers get the products they purchase</w:t>
+            </w:r>
+            <w:r>
+              <w:t>d as the seller</w:t>
+            </w:r>
+            <w:r>
+              <w:t xml:space="preserve"> described and of reasonable quality.</w:t>
+            </w:r>
+            <w:r>
+              <w:t xml:space="preserve"> The solution will follow this legislation by accurately describing the items in the product listings, and that also includes the price, quantity and condition. The customers have the right to request a refund or replacement if they received incorrect or bad quality products. For the business to be deemed trustworthy and have a great reputation, this legislation is important to comply with.</w:t>
+            </w:r>
+          </w:p>
         </w:tc>
       </w:tr>
       <w:tr>
         <w:tc>
           <w:tcPr>
-            <w:tcW w:w="3397" w:type="dxa"/>
-          </w:tcPr>
-          <w:p>
-            <w:r>
-              <w:t>Consumer Rights Act 2015</w:t>
-            </w:r>
-          </w:p>
-        </w:tc>
-        <w:tc>
-          <w:tcPr>
-            <w:tcW w:w="5619" w:type="dxa"/>
-          </w:tcPr>
-          <w:p/>
+            <w:tcW w:w="3964" w:type="dxa"/>
+          </w:tcPr>
+          <w:p>
+            <w:pPr>
+              <w:jc w:val="center"/>
+              <w:rPr>
+                <w:b/>
+                <w:bCs/>
+              </w:rPr>
+            </w:pPr>
+            <w:r>
+              <w:rPr>
+                <w:b/>
+                <w:bCs/>
+              </w:rPr>
+              <w:t>Consumer Protection from Unfair Trading Regulations 2008</w:t>
+            </w:r>
+          </w:p>
+        </w:tc>
+        <w:tc>
+          <w:tcPr>
+            <w:tcW w:w="5052" w:type="dxa"/>
+          </w:tcPr>
+          <w:p>
+            <w:r>
+              <w:t>Th</w:t>
+            </w:r>
+            <w:r>
+              <w:t>e Protection from Unfair Trading</w:t>
+            </w:r>
+            <w:r>
+              <w:t xml:space="preserve"> </w:t>
+            </w:r>
+            <w:r>
+              <w:t>R</w:t>
+            </w:r>
+            <w:r>
+              <w:t>egulation</w:t>
+            </w:r>
+            <w:r>
+              <w:t>s</w:t>
+            </w:r>
+            <w:r>
+              <w:t xml:space="preserve"> </w:t>
+            </w:r>
+            <w:proofErr w:type="gramStart"/>
+            <w:r>
+              <w:t>are</w:t>
+            </w:r>
+            <w:proofErr w:type="gramEnd"/>
+            <w:r>
+              <w:t xml:space="preserve"> responsible for when businesses </w:t>
+            </w:r>
+            <w:proofErr w:type="gramStart"/>
+            <w:r>
+              <w:t>want</w:t>
+            </w:r>
+            <w:r>
+              <w:t>s</w:t>
+            </w:r>
+            <w:proofErr w:type="gramEnd"/>
+            <w:r>
+              <w:t xml:space="preserve"> to promote or sell their products, it makes sure that they will not use deceptive or misleading methods to get their products sold. Therefore, the solution must ensure that all product descriptions, prices, availability information, and special offers, must be accurate and true. </w:t>
+            </w:r>
+            <w:proofErr w:type="gramStart"/>
+            <w:r>
+              <w:t>In order to</w:t>
+            </w:r>
+            <w:proofErr w:type="gramEnd"/>
+            <w:r>
+              <w:t xml:space="preserve"> protect customers and maintain Greenfield Local Hubs credibility, the marketing and product information must be honest and transparent.</w:t>
+            </w:r>
+          </w:p>
         </w:tc>
       </w:tr>
       <w:tr>
         <w:tc>
           <w:tcPr>
-            <w:tcW w:w="3397" w:type="dxa"/>
-          </w:tcPr>
-          <w:p>
-            <w:r>
-              <w:lastRenderedPageBreak/>
-              <w:t>Consumer Protection from Unfair Trading Regulations 2008</w:t>
-            </w:r>
-          </w:p>
-        </w:tc>
-        <w:tc>
-          <w:tcPr>
-            <w:tcW w:w="5619" w:type="dxa"/>
-          </w:tcPr>
-          <w:p/>
+            <w:tcW w:w="3964" w:type="dxa"/>
+          </w:tcPr>
+          <w:p>
+            <w:pPr>
+              <w:jc w:val="center"/>
+              <w:rPr>
+                <w:b/>
+                <w:bCs/>
+              </w:rPr>
+            </w:pPr>
+            <w:r>
+              <w:rPr>
+                <w:b/>
+                <w:bCs/>
+              </w:rPr>
+              <w:t>Electronic Commerce (EC Directive) Regulations 2002</w:t>
+            </w:r>
+          </w:p>
+        </w:tc>
+        <w:tc>
+          <w:tcPr>
+            <w:tcW w:w="5052" w:type="dxa"/>
+          </w:tcPr>
+          <w:p>
+            <w:r>
+              <w:t>Since this platform will be a digital solution that sell products or services online</w:t>
+            </w:r>
+            <w:r>
+              <w:t xml:space="preserve">, it must comply with the Electronic Commerce (EC Directive) Regulations. Important business information must be displayed such as company contact details, terms and conditions, pricing, ordering processes. A confirmation message must be sent to the customer when an order has been placed. To ensure transparency in online transactions </w:t>
+            </w:r>
+            <w:r>
+              <w:t xml:space="preserve">Greenfield Local Hub must comply with these regulations successfully. </w:t>
+            </w:r>
+          </w:p>
         </w:tc>
       </w:tr>
       <w:tr>
         <w:tc>
           <w:tcPr>
-            <w:tcW w:w="3397" w:type="dxa"/>
-          </w:tcPr>
-          <w:p>
-            <w:r>
-              <w:t>Electronic Commerce (EC Directive) Regulations 2002</w:t>
-            </w:r>
-          </w:p>
-        </w:tc>
-        <w:tc>
-          <w:tcPr>
-            <w:tcW w:w="5619" w:type="dxa"/>
-          </w:tcPr>
-          <w:p/>
+            <w:tcW w:w="3964" w:type="dxa"/>
+          </w:tcPr>
+          <w:p>
+            <w:pPr>
+              <w:jc w:val="center"/>
+              <w:rPr>
+                <w:b/>
+                <w:bCs/>
+              </w:rPr>
+            </w:pPr>
+            <w:r>
+              <w:rPr>
+                <w:b/>
+                <w:bCs/>
+              </w:rPr>
+              <w:t>Equality Act 2010 &amp; Accessibility Standards WCAG</w:t>
+            </w:r>
+          </w:p>
+        </w:tc>
+        <w:tc>
+          <w:tcPr>
+            <w:tcW w:w="5052" w:type="dxa"/>
+          </w:tcPr>
+          <w:p>
+            <w:r>
+              <w:t>The Equality Act requires business</w:t>
+            </w:r>
+            <w:r>
+              <w:t>es</w:t>
+            </w:r>
+            <w:r>
+              <w:t xml:space="preserve"> to make sure that people with disabilities can access services successfully. </w:t>
+            </w:r>
+            <w:proofErr w:type="gramStart"/>
+            <w:r>
+              <w:t>In order for</w:t>
+            </w:r>
+            <w:proofErr w:type="gramEnd"/>
+            <w:r>
+              <w:t xml:space="preserve"> business to meet this they must follow the accessibility guidelines such as Web Content Accessibility Guidelines (WCAG). </w:t>
+            </w:r>
+            <w:r>
+              <w:t>Features that help make sure that all users can access and use the solution effectively are readable text, clear navigation and compatibility with screen readers. Including accessibility features will support inclusivity and makes sure that the business does not unintentionally exclude certain users.</w:t>
+            </w:r>
+            <w:r>
+              <w:t xml:space="preserve"> The solution will include high contrast mode, dark mode, text size increase/decrease to ensure readability. The solution will also be compatible with screen readers and included as an accessibility feature. </w:t>
+            </w:r>
+          </w:p>
         </w:tc>
       </w:tr>
       <w:tr>
         <w:tc>
           <w:tcPr>
-            <w:tcW w:w="3397" w:type="dxa"/>
-          </w:tcPr>
-          <w:p>
-            <w:r>
-              <w:t>Equality Act 2010 &amp; Accessibility Standards WCAG</w:t>
-            </w:r>
-          </w:p>
-        </w:tc>
-        <w:tc>
-          <w:tcPr>
-            <w:tcW w:w="5619" w:type="dxa"/>
-          </w:tcPr>
-          <w:p/>
+            <w:tcW w:w="3964" w:type="dxa"/>
+          </w:tcPr>
+          <w:p>
+            <w:pPr>
+              <w:jc w:val="center"/>
+              <w:rPr>
+                <w:b/>
+                <w:bCs/>
+              </w:rPr>
+            </w:pPr>
+            <w:r>
+              <w:rPr>
+                <w:b/>
+                <w:bCs/>
+              </w:rPr>
+              <w:lastRenderedPageBreak/>
+              <w:t>General Food Law</w:t>
+            </w:r>
+            <w:r>
+              <w:rPr>
+                <w:b/>
+                <w:bCs/>
+              </w:rPr>
+              <w:t xml:space="preserve"> Regulation (EC) No 178/2002</w:t>
+            </w:r>
+          </w:p>
+        </w:tc>
+        <w:tc>
+          <w:tcPr>
+            <w:tcW w:w="5052" w:type="dxa"/>
+          </w:tcPr>
+          <w:p>
+            <w:r>
+              <w:t>The General Food law is responsible for making sure that food is safe to consume and that it can be tracked to where it came from. Since the solution allows people to buy food directly from local producers, it is important that all the food sold meets safety rules. This way customers will receive safe and trustworthy food while proving accountability within the food chain.</w:t>
+            </w:r>
+          </w:p>
         </w:tc>
       </w:tr>
       <w:tr>
         <w:tc>
           <w:tcPr>
-            <w:tcW w:w="3397" w:type="dxa"/>
-          </w:tcPr>
-          <w:p>
-            <w:r>
-              <w:t>General Food Law</w:t>
-            </w:r>
-          </w:p>
-        </w:tc>
-        <w:tc>
-          <w:tcPr>
-            <w:tcW w:w="5619" w:type="dxa"/>
-          </w:tcPr>
-          <w:p/>
-        </w:tc>
-      </w:tr>
-      <w:tr>
-        <w:tc>
-          <w:tcPr>
-            <w:tcW w:w="3397" w:type="dxa"/>
-          </w:tcPr>
-          <w:p>
-            <w:r>
+            <w:tcW w:w="3964" w:type="dxa"/>
+          </w:tcPr>
+          <w:p>
+            <w:pPr>
+              <w:jc w:val="center"/>
+              <w:rPr>
+                <w:b/>
+                <w:bCs/>
+              </w:rPr>
+            </w:pPr>
+            <w:r>
+              <w:rPr>
+                <w:b/>
+                <w:bCs/>
+              </w:rPr>
               <w:t>Food Information Regulations 2014</w:t>
             </w:r>
           </w:p>
         </w:tc>
         <w:tc>
           <w:tcPr>
-            <w:tcW w:w="5619" w:type="dxa"/>
-          </w:tcPr>
-          <w:p/>
+            <w:tcW w:w="5052" w:type="dxa"/>
+          </w:tcPr>
+          <w:p>
+            <w:r>
+              <w:t xml:space="preserve">Greenfield Local Hub will comply with the Food Information </w:t>
+            </w:r>
+            <w:proofErr w:type="gramStart"/>
+            <w:r>
+              <w:t>Regulations</w:t>
+            </w:r>
+            <w:r>
+              <w:t>,</w:t>
+            </w:r>
+            <w:proofErr w:type="gramEnd"/>
+            <w:r>
+              <w:t xml:space="preserve"> t</w:t>
+            </w:r>
+            <w:r>
+              <w:t>his means the solution will</w:t>
+            </w:r>
+            <w:r>
+              <w:t xml:space="preserve"> </w:t>
+            </w:r>
+            <w:r>
+              <w:t>provide</w:t>
+            </w:r>
+            <w:r>
+              <w:t xml:space="preserve"> clear and </w:t>
+            </w:r>
+            <w:r>
+              <w:t>correct</w:t>
+            </w:r>
+            <w:r>
+              <w:t xml:space="preserve"> information about</w:t>
+            </w:r>
+            <w:r>
+              <w:t xml:space="preserve"> all</w:t>
+            </w:r>
+            <w:r>
+              <w:t xml:space="preserve"> food products</w:t>
+            </w:r>
+            <w:r>
+              <w:t>. This will include listing all the</w:t>
+            </w:r>
+            <w:r>
+              <w:t xml:space="preserve"> ingredients, any</w:t>
+            </w:r>
+            <w:r>
+              <w:t xml:space="preserve">thing that could cause allergies and other important details. The product listings in the solution will show all this information clearly, so customers can make safe and informed </w:t>
+            </w:r>
+            <w:r>
+              <w:t>choices</w:t>
+            </w:r>
+            <w:r>
+              <w:t xml:space="preserve">. This is especially important for customers with allergies or </w:t>
+            </w:r>
+            <w:r>
+              <w:t>special diets</w:t>
+            </w:r>
+            <w:r>
+              <w:t xml:space="preserve">. Greenfield Local Hub will </w:t>
+            </w:r>
+            <w:r>
+              <w:t>be open and honest</w:t>
+            </w:r>
+            <w:r>
+              <w:t xml:space="preserve"> and protect customer health by complying with these regulations.</w:t>
+            </w:r>
+          </w:p>
         </w:tc>
       </w:tr>
     </w:tbl>
@@ -6188,6 +7318,56 @@
 </w:document>
 </file>
 
+<file path=word/endnotes.xml><?xml version="1.0" encoding="utf-8"?>
+<w:endnotes xmlns:wpc="http://schemas.microsoft.com/office/word/2010/wordprocessingCanvas" xmlns:cx="http://schemas.microsoft.com/office/drawing/2014/chartex" xmlns:cx1="http://schemas.microsoft.com/office/drawing/2015/9/8/chartex" xmlns:cx2="http://schemas.microsoft.com/office/drawing/2015/10/21/chartex" xmlns:cx3="http://schemas.microsoft.com/office/drawing/2016/5/9/chartex" xmlns:cx4="http://schemas.microsoft.com/office/drawing/2016/5/10/chartex" xmlns:cx5="http://schemas.microsoft.com/office/drawing/2016/5/11/chartex" xmlns:cx6="http://schemas.microsoft.com/office/drawing/2016/5/12/chartex" xmlns:cx7="http://schemas.microsoft.com/office/drawing/2016/5/13/chartex" xmlns:cx8="http://schemas.microsoft.com/office/drawing/2016/5/14/chartex" xmlns:mc="http://schemas.openxmlformats.org/markup-compatibility/2006" xmlns:aink="http://schemas.microsoft.com/office/drawing/2016/ink" xmlns:am3d="http://schemas.microsoft.com/office/drawing/2017/model3d" xmlns:o="urn:schemas-microsoft-com:office:office" xmlns:oel="http://schemas.microsoft.com/office/2019/extlst" xmlns:r="http://schemas.openxmlformats.org/officeDocument/2006/relationships" xmlns:m="http://schemas.openxmlformats.org/officeDocument/2006/math" xmlns:v="urn:schemas-microsoft-com:vml" xmlns:wp14="http://schemas.microsoft.com/office/word/2010/wordprocessingDrawing" xmlns:wp="http://schemas.openxmlformats.org/drawingml/2006/wordprocessingDrawing" xmlns:w10="urn:schemas-microsoft-com:office:word" xmlns:w="http://schemas.openxmlformats.org/wordprocessingml/2006/main" xmlns:w14="http://schemas.microsoft.com/office/word/2010/wordml" xmlns:w15="http://schemas.microsoft.com/office/word/2012/wordml" xmlns:w16cex="http://schemas.microsoft.com/office/word/2018/wordml/cex" xmlns:w16cid="http://schemas.microsoft.com/office/word/2016/wordml/cid" xmlns:w16="http://schemas.microsoft.com/office/word/2018/wordml" xmlns:w16du="http://schemas.microsoft.com/office/word/2023/wordml/word16du" xmlns:w16sdtdh="http://schemas.microsoft.com/office/word/2020/wordml/sdtdatahash" xmlns:w16sdtfl="http://schemas.microsoft.com/office/word/2024/wordml/sdtformatlock" xmlns:w16se="http://schemas.microsoft.com/office/word/2015/wordml/symex" xmlns:wpg="http://schemas.microsoft.com/office/word/2010/wordprocessingGroup" xmlns:wpi="http://schemas.microsoft.com/office/word/2010/wordprocessingInk" xmlns:wne="http://schemas.microsoft.com/office/word/2006/wordml" xmlns:wps="http://schemas.microsoft.com/office/word/2010/wordprocessingShape" mc:Ignorable="w14 w15 w16se w16cid w16 w16cex w16sdtdh w16sdtfl w16du wp14">
+  <w:endnote w:type="separator" w:id="-1">
+    <w:p>
+      <w:pPr>
+        <w:spacing w:after="0" w:line="240" w:lineRule="auto"/>
+      </w:pPr>
+      <w:r>
+        <w:separator/>
+      </w:r>
+    </w:p>
+  </w:endnote>
+  <w:endnote w:type="continuationSeparator" w:id="0">
+    <w:p>
+      <w:pPr>
+        <w:spacing w:after="0" w:line="240" w:lineRule="auto"/>
+      </w:pPr>
+      <w:r>
+        <w:continuationSeparator/>
+      </w:r>
+    </w:p>
+  </w:endnote>
+</w:endnotes>
+</file>
+
+<file path=word/footnotes.xml><?xml version="1.0" encoding="utf-8"?>
+<w:footnotes xmlns:wpc="http://schemas.microsoft.com/office/word/2010/wordprocessingCanvas" xmlns:cx="http://schemas.microsoft.com/office/drawing/2014/chartex" xmlns:cx1="http://schemas.microsoft.com/office/drawing/2015/9/8/chartex" xmlns:cx2="http://schemas.microsoft.com/office/drawing/2015/10/21/chartex" xmlns:cx3="http://schemas.microsoft.com/office/drawing/2016/5/9/chartex" xmlns:cx4="http://schemas.microsoft.com/office/drawing/2016/5/10/chartex" xmlns:cx5="http://schemas.microsoft.com/office/drawing/2016/5/11/chartex" xmlns:cx6="http://schemas.microsoft.com/office/drawing/2016/5/12/chartex" xmlns:cx7="http://schemas.microsoft.com/office/drawing/2016/5/13/chartex" xmlns:cx8="http://schemas.microsoft.com/office/drawing/2016/5/14/chartex" xmlns:mc="http://schemas.openxmlformats.org/markup-compatibility/2006" xmlns:aink="http://schemas.microsoft.com/office/drawing/2016/ink" xmlns:am3d="http://schemas.microsoft.com/office/drawing/2017/model3d" xmlns:o="urn:schemas-microsoft-com:office:office" xmlns:oel="http://schemas.microsoft.com/office/2019/extlst" xmlns:r="http://schemas.openxmlformats.org/officeDocument/2006/relationships" xmlns:m="http://schemas.openxmlformats.org/officeDocument/2006/math" xmlns:v="urn:schemas-microsoft-com:vml" xmlns:wp14="http://schemas.microsoft.com/office/word/2010/wordprocessingDrawing" xmlns:wp="http://schemas.openxmlformats.org/drawingml/2006/wordprocessingDrawing" xmlns:w10="urn:schemas-microsoft-com:office:word" xmlns:w="http://schemas.openxmlformats.org/wordprocessingml/2006/main" xmlns:w14="http://schemas.microsoft.com/office/word/2010/wordml" xmlns:w15="http://schemas.microsoft.com/office/word/2012/wordml" xmlns:w16cex="http://schemas.microsoft.com/office/word/2018/wordml/cex" xmlns:w16cid="http://schemas.microsoft.com/office/word/2016/wordml/cid" xmlns:w16="http://schemas.microsoft.com/office/word/2018/wordml" xmlns:w16du="http://schemas.microsoft.com/office/word/2023/wordml/word16du" xmlns:w16sdtdh="http://schemas.microsoft.com/office/word/2020/wordml/sdtdatahash" xmlns:w16sdtfl="http://schemas.microsoft.com/office/word/2024/wordml/sdtformatlock" xmlns:w16se="http://schemas.microsoft.com/office/word/2015/wordml/symex" xmlns:wpg="http://schemas.microsoft.com/office/word/2010/wordprocessingGroup" xmlns:wpi="http://schemas.microsoft.com/office/word/2010/wordprocessingInk" xmlns:wne="http://schemas.microsoft.com/office/word/2006/wordml" xmlns:wps="http://schemas.microsoft.com/office/word/2010/wordprocessingShape" mc:Ignorable="w14 w15 w16se w16cid w16 w16cex w16sdtdh w16sdtfl w16du wp14">
+  <w:footnote w:type="separator" w:id="-1">
+    <w:p>
+      <w:pPr>
+        <w:spacing w:after="0" w:line="240" w:lineRule="auto"/>
+      </w:pPr>
+      <w:r>
+        <w:separator/>
+      </w:r>
+    </w:p>
+  </w:footnote>
+  <w:footnote w:type="continuationSeparator" w:id="0">
+    <w:p>
+      <w:pPr>
+        <w:spacing w:after="0" w:line="240" w:lineRule="auto"/>
+      </w:pPr>
+      <w:r>
+        <w:continuationSeparator/>
+      </w:r>
+    </w:p>
+  </w:footnote>
+</w:footnotes>
+</file>
+
 <file path=word/numbering.xml><?xml version="1.0" encoding="utf-8"?>
 <w:numbering xmlns:wpc="http://schemas.microsoft.com/office/word/2010/wordprocessingCanvas" xmlns:cx="http://schemas.microsoft.com/office/drawing/2014/chartex" xmlns:cx1="http://schemas.microsoft.com/office/drawing/2015/9/8/chartex" xmlns:cx2="http://schemas.microsoft.com/office/drawing/2015/10/21/chartex" xmlns:cx3="http://schemas.microsoft.com/office/drawing/2016/5/9/chartex" xmlns:cx4="http://schemas.microsoft.com/office/drawing/2016/5/10/chartex" xmlns:cx5="http://schemas.microsoft.com/office/drawing/2016/5/11/chartex" xmlns:cx6="http://schemas.microsoft.com/office/drawing/2016/5/12/chartex" xmlns:cx7="http://schemas.microsoft.com/office/drawing/2016/5/13/chartex" xmlns:cx8="http://schemas.microsoft.com/office/drawing/2016/5/14/chartex" xmlns:mc="http://schemas.openxmlformats.org/markup-compatibility/2006" xmlns:aink="http://schemas.microsoft.com/office/drawing/2016/ink" xmlns:am3d="http://schemas.microsoft.com/office/drawing/2017/model3d" xmlns:o="urn:schemas-microsoft-com:office:office" xmlns:oel="http://schemas.microsoft.com/office/2019/extlst" xmlns:r="http://schemas.openxmlformats.org/officeDocument/2006/relationships" xmlns:m="http://schemas.openxmlformats.org/officeDocument/2006/math" xmlns:v="urn:schemas-microsoft-com:vml" xmlns:wp14="http://schemas.microsoft.com/office/word/2010/wordprocessingDrawing" xmlns:wp="http://schemas.openxmlformats.org/drawingml/2006/wordprocessingDrawing" xmlns:w10="urn:schemas-microsoft-com:office:word" xmlns:w="http://schemas.openxmlformats.org/wordprocessingml/2006/main" xmlns:w14="http://schemas.microsoft.com/office/word/2010/wordml" xmlns:w15="http://schemas.microsoft.com/office/word/2012/wordml" xmlns:w16cex="http://schemas.microsoft.com/office/word/2018/wordml/cex" xmlns:w16cid="http://schemas.microsoft.com/office/word/2016/wordml/cid" xmlns:w16="http://schemas.microsoft.com/office/word/2018/wordml" xmlns:w16du="http://schemas.microsoft.com/office/word/2023/wordml/word16du" xmlns:w16sdtdh="http://schemas.microsoft.com/office/word/2020/wordml/sdtdatahash" xmlns:w16sdtfl="http://schemas.microsoft.com/office/word/2024/wordml/sdtformatlock" xmlns:w16se="http://schemas.microsoft.com/office/word/2015/wordml/symex" xmlns:wpg="http://schemas.microsoft.com/office/word/2010/wordprocessingGroup" xmlns:wpi="http://schemas.microsoft.com/office/word/2010/wordprocessingInk" xmlns:wne="http://schemas.microsoft.com/office/word/2006/wordml" xmlns:wps="http://schemas.microsoft.com/office/word/2010/wordprocessingShape" mc:Ignorable="w14 w15 w16se w16cid w16 w16cex w16sdtdh w16sdtfl w16du wp14">
   <w:abstractNum w:abstractNumId="0" w15:restartNumberingAfterBreak="0">
@@ -6255,6 +7435,232 @@
     </w:lvl>
   </w:abstractNum>
   <w:abstractNum w:abstractNumId="1" w15:restartNumberingAfterBreak="0">
+    <w:nsid w:val="00392FAC"/>
+    <w:multiLevelType w:val="hybridMultilevel"/>
+    <w:tmpl w:val="4F7236CE"/>
+    <w:lvl w:ilvl="0" w:tplc="08090001">
+      <w:start w:val="1"/>
+      <w:numFmt w:val="bullet"/>
+      <w:lvlText w:val=""/>
+      <w:lvlJc w:val="left"/>
+      <w:pPr>
+        <w:ind w:left="360" w:hanging="360"/>
+      </w:pPr>
+      <w:rPr>
+        <w:rFonts w:ascii="Symbol" w:hAnsi="Symbol" w:hint="default"/>
+      </w:rPr>
+    </w:lvl>
+    <w:lvl w:ilvl="1" w:tplc="08090003" w:tentative="1">
+      <w:start w:val="1"/>
+      <w:numFmt w:val="bullet"/>
+      <w:lvlText w:val="o"/>
+      <w:lvlJc w:val="left"/>
+      <w:pPr>
+        <w:ind w:left="1080" w:hanging="360"/>
+      </w:pPr>
+      <w:rPr>
+        <w:rFonts w:ascii="Courier New" w:hAnsi="Courier New" w:cs="Courier New" w:hint="default"/>
+      </w:rPr>
+    </w:lvl>
+    <w:lvl w:ilvl="2" w:tplc="08090005" w:tentative="1">
+      <w:start w:val="1"/>
+      <w:numFmt w:val="bullet"/>
+      <w:lvlText w:val=""/>
+      <w:lvlJc w:val="left"/>
+      <w:pPr>
+        <w:ind w:left="1800" w:hanging="360"/>
+      </w:pPr>
+      <w:rPr>
+        <w:rFonts w:ascii="Wingdings" w:hAnsi="Wingdings" w:hint="default"/>
+      </w:rPr>
+    </w:lvl>
+    <w:lvl w:ilvl="3" w:tplc="08090001" w:tentative="1">
+      <w:start w:val="1"/>
+      <w:numFmt w:val="bullet"/>
+      <w:lvlText w:val=""/>
+      <w:lvlJc w:val="left"/>
+      <w:pPr>
+        <w:ind w:left="2520" w:hanging="360"/>
+      </w:pPr>
+      <w:rPr>
+        <w:rFonts w:ascii="Symbol" w:hAnsi="Symbol" w:hint="default"/>
+      </w:rPr>
+    </w:lvl>
+    <w:lvl w:ilvl="4" w:tplc="08090003" w:tentative="1">
+      <w:start w:val="1"/>
+      <w:numFmt w:val="bullet"/>
+      <w:lvlText w:val="o"/>
+      <w:lvlJc w:val="left"/>
+      <w:pPr>
+        <w:ind w:left="3240" w:hanging="360"/>
+      </w:pPr>
+      <w:rPr>
+        <w:rFonts w:ascii="Courier New" w:hAnsi="Courier New" w:cs="Courier New" w:hint="default"/>
+      </w:rPr>
+    </w:lvl>
+    <w:lvl w:ilvl="5" w:tplc="08090005" w:tentative="1">
+      <w:start w:val="1"/>
+      <w:numFmt w:val="bullet"/>
+      <w:lvlText w:val=""/>
+      <w:lvlJc w:val="left"/>
+      <w:pPr>
+        <w:ind w:left="3960" w:hanging="360"/>
+      </w:pPr>
+      <w:rPr>
+        <w:rFonts w:ascii="Wingdings" w:hAnsi="Wingdings" w:hint="default"/>
+      </w:rPr>
+    </w:lvl>
+    <w:lvl w:ilvl="6" w:tplc="08090001" w:tentative="1">
+      <w:start w:val="1"/>
+      <w:numFmt w:val="bullet"/>
+      <w:lvlText w:val=""/>
+      <w:lvlJc w:val="left"/>
+      <w:pPr>
+        <w:ind w:left="4680" w:hanging="360"/>
+      </w:pPr>
+      <w:rPr>
+        <w:rFonts w:ascii="Symbol" w:hAnsi="Symbol" w:hint="default"/>
+      </w:rPr>
+    </w:lvl>
+    <w:lvl w:ilvl="7" w:tplc="08090003" w:tentative="1">
+      <w:start w:val="1"/>
+      <w:numFmt w:val="bullet"/>
+      <w:lvlText w:val="o"/>
+      <w:lvlJc w:val="left"/>
+      <w:pPr>
+        <w:ind w:left="5400" w:hanging="360"/>
+      </w:pPr>
+      <w:rPr>
+        <w:rFonts w:ascii="Courier New" w:hAnsi="Courier New" w:cs="Courier New" w:hint="default"/>
+      </w:rPr>
+    </w:lvl>
+    <w:lvl w:ilvl="8" w:tplc="08090005" w:tentative="1">
+      <w:start w:val="1"/>
+      <w:numFmt w:val="bullet"/>
+      <w:lvlText w:val=""/>
+      <w:lvlJc w:val="left"/>
+      <w:pPr>
+        <w:ind w:left="6120" w:hanging="360"/>
+      </w:pPr>
+      <w:rPr>
+        <w:rFonts w:ascii="Wingdings" w:hAnsi="Wingdings" w:hint="default"/>
+      </w:rPr>
+    </w:lvl>
+  </w:abstractNum>
+  <w:abstractNum w:abstractNumId="2" w15:restartNumberingAfterBreak="0">
+    <w:nsid w:val="082B798F"/>
+    <w:multiLevelType w:val="hybridMultilevel"/>
+    <w:tmpl w:val="66F2DD4E"/>
+    <w:lvl w:ilvl="0" w:tplc="08090001">
+      <w:start w:val="1"/>
+      <w:numFmt w:val="bullet"/>
+      <w:lvlText w:val=""/>
+      <w:lvlJc w:val="left"/>
+      <w:pPr>
+        <w:ind w:left="360" w:hanging="360"/>
+      </w:pPr>
+      <w:rPr>
+        <w:rFonts w:ascii="Symbol" w:hAnsi="Symbol" w:hint="default"/>
+      </w:rPr>
+    </w:lvl>
+    <w:lvl w:ilvl="1" w:tplc="08090003" w:tentative="1">
+      <w:start w:val="1"/>
+      <w:numFmt w:val="bullet"/>
+      <w:lvlText w:val="o"/>
+      <w:lvlJc w:val="left"/>
+      <w:pPr>
+        <w:ind w:left="1080" w:hanging="360"/>
+      </w:pPr>
+      <w:rPr>
+        <w:rFonts w:ascii="Courier New" w:hAnsi="Courier New" w:cs="Courier New" w:hint="default"/>
+      </w:rPr>
+    </w:lvl>
+    <w:lvl w:ilvl="2" w:tplc="08090005" w:tentative="1">
+      <w:start w:val="1"/>
+      <w:numFmt w:val="bullet"/>
+      <w:lvlText w:val=""/>
+      <w:lvlJc w:val="left"/>
+      <w:pPr>
+        <w:ind w:left="1800" w:hanging="360"/>
+      </w:pPr>
+      <w:rPr>
+        <w:rFonts w:ascii="Wingdings" w:hAnsi="Wingdings" w:hint="default"/>
+      </w:rPr>
+    </w:lvl>
+    <w:lvl w:ilvl="3" w:tplc="08090001" w:tentative="1">
+      <w:start w:val="1"/>
+      <w:numFmt w:val="bullet"/>
+      <w:lvlText w:val=""/>
+      <w:lvlJc w:val="left"/>
+      <w:pPr>
+        <w:ind w:left="2520" w:hanging="360"/>
+      </w:pPr>
+      <w:rPr>
+        <w:rFonts w:ascii="Symbol" w:hAnsi="Symbol" w:hint="default"/>
+      </w:rPr>
+    </w:lvl>
+    <w:lvl w:ilvl="4" w:tplc="08090003" w:tentative="1">
+      <w:start w:val="1"/>
+      <w:numFmt w:val="bullet"/>
+      <w:lvlText w:val="o"/>
+      <w:lvlJc w:val="left"/>
+      <w:pPr>
+        <w:ind w:left="3240" w:hanging="360"/>
+      </w:pPr>
+      <w:rPr>
+        <w:rFonts w:ascii="Courier New" w:hAnsi="Courier New" w:cs="Courier New" w:hint="default"/>
+      </w:rPr>
+    </w:lvl>
+    <w:lvl w:ilvl="5" w:tplc="08090005" w:tentative="1">
+      <w:start w:val="1"/>
+      <w:numFmt w:val="bullet"/>
+      <w:lvlText w:val=""/>
+      <w:lvlJc w:val="left"/>
+      <w:pPr>
+        <w:ind w:left="3960" w:hanging="360"/>
+      </w:pPr>
+      <w:rPr>
+        <w:rFonts w:ascii="Wingdings" w:hAnsi="Wingdings" w:hint="default"/>
+      </w:rPr>
+    </w:lvl>
+    <w:lvl w:ilvl="6" w:tplc="08090001" w:tentative="1">
+      <w:start w:val="1"/>
+      <w:numFmt w:val="bullet"/>
+      <w:lvlText w:val=""/>
+      <w:lvlJc w:val="left"/>
+      <w:pPr>
+        <w:ind w:left="4680" w:hanging="360"/>
+      </w:pPr>
+      <w:rPr>
+        <w:rFonts w:ascii="Symbol" w:hAnsi="Symbol" w:hint="default"/>
+      </w:rPr>
+    </w:lvl>
+    <w:lvl w:ilvl="7" w:tplc="08090003" w:tentative="1">
+      <w:start w:val="1"/>
+      <w:numFmt w:val="bullet"/>
+      <w:lvlText w:val="o"/>
+      <w:lvlJc w:val="left"/>
+      <w:pPr>
+        <w:ind w:left="5400" w:hanging="360"/>
+      </w:pPr>
+      <w:rPr>
+        <w:rFonts w:ascii="Courier New" w:hAnsi="Courier New" w:cs="Courier New" w:hint="default"/>
+      </w:rPr>
+    </w:lvl>
+    <w:lvl w:ilvl="8" w:tplc="08090005" w:tentative="1">
+      <w:start w:val="1"/>
+      <w:numFmt w:val="bullet"/>
+      <w:lvlText w:val=""/>
+      <w:lvlJc w:val="left"/>
+      <w:pPr>
+        <w:ind w:left="6120" w:hanging="360"/>
+      </w:pPr>
+      <w:rPr>
+        <w:rFonts w:ascii="Wingdings" w:hAnsi="Wingdings" w:hint="default"/>
+      </w:rPr>
+    </w:lvl>
+  </w:abstractNum>
+  <w:abstractNum w:abstractNumId="3" w15:restartNumberingAfterBreak="0">
     <w:nsid w:val="15841240"/>
     <w:multiLevelType w:val="hybridMultilevel"/>
     <w:tmpl w:val="A99AE342"/>
@@ -6367,7 +7773,7 @@
       </w:rPr>
     </w:lvl>
   </w:abstractNum>
-  <w:abstractNum w:abstractNumId="2" w15:restartNumberingAfterBreak="0">
+  <w:abstractNum w:abstractNumId="4" w15:restartNumberingAfterBreak="0">
     <w:nsid w:val="163F320F"/>
     <w:multiLevelType w:val="hybridMultilevel"/>
     <w:tmpl w:val="57629F84"/>
@@ -6453,7 +7859,120 @@
       </w:pPr>
     </w:lvl>
   </w:abstractNum>
-  <w:abstractNum w:abstractNumId="3" w15:restartNumberingAfterBreak="0">
+  <w:abstractNum w:abstractNumId="5" w15:restartNumberingAfterBreak="0">
+    <w:nsid w:val="1AB70FBF"/>
+    <w:multiLevelType w:val="hybridMultilevel"/>
+    <w:tmpl w:val="A990AAB8"/>
+    <w:lvl w:ilvl="0" w:tplc="08090001">
+      <w:start w:val="1"/>
+      <w:numFmt w:val="bullet"/>
+      <w:lvlText w:val=""/>
+      <w:lvlJc w:val="left"/>
+      <w:pPr>
+        <w:ind w:left="360" w:hanging="360"/>
+      </w:pPr>
+      <w:rPr>
+        <w:rFonts w:ascii="Symbol" w:hAnsi="Symbol" w:hint="default"/>
+      </w:rPr>
+    </w:lvl>
+    <w:lvl w:ilvl="1" w:tplc="08090003" w:tentative="1">
+      <w:start w:val="1"/>
+      <w:numFmt w:val="bullet"/>
+      <w:lvlText w:val="o"/>
+      <w:lvlJc w:val="left"/>
+      <w:pPr>
+        <w:ind w:left="1080" w:hanging="360"/>
+      </w:pPr>
+      <w:rPr>
+        <w:rFonts w:ascii="Courier New" w:hAnsi="Courier New" w:cs="Courier New" w:hint="default"/>
+      </w:rPr>
+    </w:lvl>
+    <w:lvl w:ilvl="2" w:tplc="08090005" w:tentative="1">
+      <w:start w:val="1"/>
+      <w:numFmt w:val="bullet"/>
+      <w:lvlText w:val=""/>
+      <w:lvlJc w:val="left"/>
+      <w:pPr>
+        <w:ind w:left="1800" w:hanging="360"/>
+      </w:pPr>
+      <w:rPr>
+        <w:rFonts w:ascii="Wingdings" w:hAnsi="Wingdings" w:hint="default"/>
+      </w:rPr>
+    </w:lvl>
+    <w:lvl w:ilvl="3" w:tplc="08090001" w:tentative="1">
+      <w:start w:val="1"/>
+      <w:numFmt w:val="bullet"/>
+      <w:lvlText w:val=""/>
+      <w:lvlJc w:val="left"/>
+      <w:pPr>
+        <w:ind w:left="2520" w:hanging="360"/>
+      </w:pPr>
+      <w:rPr>
+        <w:rFonts w:ascii="Symbol" w:hAnsi="Symbol" w:hint="default"/>
+      </w:rPr>
+    </w:lvl>
+    <w:lvl w:ilvl="4" w:tplc="08090003" w:tentative="1">
+      <w:start w:val="1"/>
+      <w:numFmt w:val="bullet"/>
+      <w:lvlText w:val="o"/>
+      <w:lvlJc w:val="left"/>
+      <w:pPr>
+        <w:ind w:left="3240" w:hanging="360"/>
+      </w:pPr>
+      <w:rPr>
+        <w:rFonts w:ascii="Courier New" w:hAnsi="Courier New" w:cs="Courier New" w:hint="default"/>
+      </w:rPr>
+    </w:lvl>
+    <w:lvl w:ilvl="5" w:tplc="08090005" w:tentative="1">
+      <w:start w:val="1"/>
+      <w:numFmt w:val="bullet"/>
+      <w:lvlText w:val=""/>
+      <w:lvlJc w:val="left"/>
+      <w:pPr>
+        <w:ind w:left="3960" w:hanging="360"/>
+      </w:pPr>
+      <w:rPr>
+        <w:rFonts w:ascii="Wingdings" w:hAnsi="Wingdings" w:hint="default"/>
+      </w:rPr>
+    </w:lvl>
+    <w:lvl w:ilvl="6" w:tplc="08090001" w:tentative="1">
+      <w:start w:val="1"/>
+      <w:numFmt w:val="bullet"/>
+      <w:lvlText w:val=""/>
+      <w:lvlJc w:val="left"/>
+      <w:pPr>
+        <w:ind w:left="4680" w:hanging="360"/>
+      </w:pPr>
+      <w:rPr>
+        <w:rFonts w:ascii="Symbol" w:hAnsi="Symbol" w:hint="default"/>
+      </w:rPr>
+    </w:lvl>
+    <w:lvl w:ilvl="7" w:tplc="08090003" w:tentative="1">
+      <w:start w:val="1"/>
+      <w:numFmt w:val="bullet"/>
+      <w:lvlText w:val="o"/>
+      <w:lvlJc w:val="left"/>
+      <w:pPr>
+        <w:ind w:left="5400" w:hanging="360"/>
+      </w:pPr>
+      <w:rPr>
+        <w:rFonts w:ascii="Courier New" w:hAnsi="Courier New" w:cs="Courier New" w:hint="default"/>
+      </w:rPr>
+    </w:lvl>
+    <w:lvl w:ilvl="8" w:tplc="08090005" w:tentative="1">
+      <w:start w:val="1"/>
+      <w:numFmt w:val="bullet"/>
+      <w:lvlText w:val=""/>
+      <w:lvlJc w:val="left"/>
+      <w:pPr>
+        <w:ind w:left="6120" w:hanging="360"/>
+      </w:pPr>
+      <w:rPr>
+        <w:rFonts w:ascii="Wingdings" w:hAnsi="Wingdings" w:hint="default"/>
+      </w:rPr>
+    </w:lvl>
+  </w:abstractNum>
+  <w:abstractNum w:abstractNumId="6" w15:restartNumberingAfterBreak="0">
     <w:nsid w:val="1C274BF3"/>
     <w:multiLevelType w:val="hybridMultilevel"/>
     <w:tmpl w:val="C8EC8BFC"/>
@@ -6566,7 +8085,233 @@
       </w:rPr>
     </w:lvl>
   </w:abstractNum>
-  <w:abstractNum w:abstractNumId="4" w15:restartNumberingAfterBreak="0">
+  <w:abstractNum w:abstractNumId="7" w15:restartNumberingAfterBreak="0">
+    <w:nsid w:val="1C4C51EC"/>
+    <w:multiLevelType w:val="hybridMultilevel"/>
+    <w:tmpl w:val="215E58E4"/>
+    <w:lvl w:ilvl="0" w:tplc="08090001">
+      <w:start w:val="1"/>
+      <w:numFmt w:val="bullet"/>
+      <w:lvlText w:val=""/>
+      <w:lvlJc w:val="left"/>
+      <w:pPr>
+        <w:ind w:left="360" w:hanging="360"/>
+      </w:pPr>
+      <w:rPr>
+        <w:rFonts w:ascii="Symbol" w:hAnsi="Symbol" w:hint="default"/>
+      </w:rPr>
+    </w:lvl>
+    <w:lvl w:ilvl="1" w:tplc="08090003" w:tentative="1">
+      <w:start w:val="1"/>
+      <w:numFmt w:val="bullet"/>
+      <w:lvlText w:val="o"/>
+      <w:lvlJc w:val="left"/>
+      <w:pPr>
+        <w:ind w:left="1080" w:hanging="360"/>
+      </w:pPr>
+      <w:rPr>
+        <w:rFonts w:ascii="Courier New" w:hAnsi="Courier New" w:cs="Courier New" w:hint="default"/>
+      </w:rPr>
+    </w:lvl>
+    <w:lvl w:ilvl="2" w:tplc="08090005" w:tentative="1">
+      <w:start w:val="1"/>
+      <w:numFmt w:val="bullet"/>
+      <w:lvlText w:val=""/>
+      <w:lvlJc w:val="left"/>
+      <w:pPr>
+        <w:ind w:left="1800" w:hanging="360"/>
+      </w:pPr>
+      <w:rPr>
+        <w:rFonts w:ascii="Wingdings" w:hAnsi="Wingdings" w:hint="default"/>
+      </w:rPr>
+    </w:lvl>
+    <w:lvl w:ilvl="3" w:tplc="08090001" w:tentative="1">
+      <w:start w:val="1"/>
+      <w:numFmt w:val="bullet"/>
+      <w:lvlText w:val=""/>
+      <w:lvlJc w:val="left"/>
+      <w:pPr>
+        <w:ind w:left="2520" w:hanging="360"/>
+      </w:pPr>
+      <w:rPr>
+        <w:rFonts w:ascii="Symbol" w:hAnsi="Symbol" w:hint="default"/>
+      </w:rPr>
+    </w:lvl>
+    <w:lvl w:ilvl="4" w:tplc="08090003" w:tentative="1">
+      <w:start w:val="1"/>
+      <w:numFmt w:val="bullet"/>
+      <w:lvlText w:val="o"/>
+      <w:lvlJc w:val="left"/>
+      <w:pPr>
+        <w:ind w:left="3240" w:hanging="360"/>
+      </w:pPr>
+      <w:rPr>
+        <w:rFonts w:ascii="Courier New" w:hAnsi="Courier New" w:cs="Courier New" w:hint="default"/>
+      </w:rPr>
+    </w:lvl>
+    <w:lvl w:ilvl="5" w:tplc="08090005" w:tentative="1">
+      <w:start w:val="1"/>
+      <w:numFmt w:val="bullet"/>
+      <w:lvlText w:val=""/>
+      <w:lvlJc w:val="left"/>
+      <w:pPr>
+        <w:ind w:left="3960" w:hanging="360"/>
+      </w:pPr>
+      <w:rPr>
+        <w:rFonts w:ascii="Wingdings" w:hAnsi="Wingdings" w:hint="default"/>
+      </w:rPr>
+    </w:lvl>
+    <w:lvl w:ilvl="6" w:tplc="08090001" w:tentative="1">
+      <w:start w:val="1"/>
+      <w:numFmt w:val="bullet"/>
+      <w:lvlText w:val=""/>
+      <w:lvlJc w:val="left"/>
+      <w:pPr>
+        <w:ind w:left="4680" w:hanging="360"/>
+      </w:pPr>
+      <w:rPr>
+        <w:rFonts w:ascii="Symbol" w:hAnsi="Symbol" w:hint="default"/>
+      </w:rPr>
+    </w:lvl>
+    <w:lvl w:ilvl="7" w:tplc="08090003" w:tentative="1">
+      <w:start w:val="1"/>
+      <w:numFmt w:val="bullet"/>
+      <w:lvlText w:val="o"/>
+      <w:lvlJc w:val="left"/>
+      <w:pPr>
+        <w:ind w:left="5400" w:hanging="360"/>
+      </w:pPr>
+      <w:rPr>
+        <w:rFonts w:ascii="Courier New" w:hAnsi="Courier New" w:cs="Courier New" w:hint="default"/>
+      </w:rPr>
+    </w:lvl>
+    <w:lvl w:ilvl="8" w:tplc="08090005" w:tentative="1">
+      <w:start w:val="1"/>
+      <w:numFmt w:val="bullet"/>
+      <w:lvlText w:val=""/>
+      <w:lvlJc w:val="left"/>
+      <w:pPr>
+        <w:ind w:left="6120" w:hanging="360"/>
+      </w:pPr>
+      <w:rPr>
+        <w:rFonts w:ascii="Wingdings" w:hAnsi="Wingdings" w:hint="default"/>
+      </w:rPr>
+    </w:lvl>
+  </w:abstractNum>
+  <w:abstractNum w:abstractNumId="8" w15:restartNumberingAfterBreak="0">
+    <w:nsid w:val="23401465"/>
+    <w:multiLevelType w:val="hybridMultilevel"/>
+    <w:tmpl w:val="40D81BB2"/>
+    <w:lvl w:ilvl="0" w:tplc="08090001">
+      <w:start w:val="1"/>
+      <w:numFmt w:val="bullet"/>
+      <w:lvlText w:val=""/>
+      <w:lvlJc w:val="left"/>
+      <w:pPr>
+        <w:ind w:left="360" w:hanging="360"/>
+      </w:pPr>
+      <w:rPr>
+        <w:rFonts w:ascii="Symbol" w:hAnsi="Symbol" w:hint="default"/>
+      </w:rPr>
+    </w:lvl>
+    <w:lvl w:ilvl="1" w:tplc="08090003" w:tentative="1">
+      <w:start w:val="1"/>
+      <w:numFmt w:val="bullet"/>
+      <w:lvlText w:val="o"/>
+      <w:lvlJc w:val="left"/>
+      <w:pPr>
+        <w:ind w:left="1080" w:hanging="360"/>
+      </w:pPr>
+      <w:rPr>
+        <w:rFonts w:ascii="Courier New" w:hAnsi="Courier New" w:cs="Courier New" w:hint="default"/>
+      </w:rPr>
+    </w:lvl>
+    <w:lvl w:ilvl="2" w:tplc="08090005" w:tentative="1">
+      <w:start w:val="1"/>
+      <w:numFmt w:val="bullet"/>
+      <w:lvlText w:val=""/>
+      <w:lvlJc w:val="left"/>
+      <w:pPr>
+        <w:ind w:left="1800" w:hanging="360"/>
+      </w:pPr>
+      <w:rPr>
+        <w:rFonts w:ascii="Wingdings" w:hAnsi="Wingdings" w:hint="default"/>
+      </w:rPr>
+    </w:lvl>
+    <w:lvl w:ilvl="3" w:tplc="08090001" w:tentative="1">
+      <w:start w:val="1"/>
+      <w:numFmt w:val="bullet"/>
+      <w:lvlText w:val=""/>
+      <w:lvlJc w:val="left"/>
+      <w:pPr>
+        <w:ind w:left="2520" w:hanging="360"/>
+      </w:pPr>
+      <w:rPr>
+        <w:rFonts w:ascii="Symbol" w:hAnsi="Symbol" w:hint="default"/>
+      </w:rPr>
+    </w:lvl>
+    <w:lvl w:ilvl="4" w:tplc="08090003" w:tentative="1">
+      <w:start w:val="1"/>
+      <w:numFmt w:val="bullet"/>
+      <w:lvlText w:val="o"/>
+      <w:lvlJc w:val="left"/>
+      <w:pPr>
+        <w:ind w:left="3240" w:hanging="360"/>
+      </w:pPr>
+      <w:rPr>
+        <w:rFonts w:ascii="Courier New" w:hAnsi="Courier New" w:cs="Courier New" w:hint="default"/>
+      </w:rPr>
+    </w:lvl>
+    <w:lvl w:ilvl="5" w:tplc="08090005" w:tentative="1">
+      <w:start w:val="1"/>
+      <w:numFmt w:val="bullet"/>
+      <w:lvlText w:val=""/>
+      <w:lvlJc w:val="left"/>
+      <w:pPr>
+        <w:ind w:left="3960" w:hanging="360"/>
+      </w:pPr>
+      <w:rPr>
+        <w:rFonts w:ascii="Wingdings" w:hAnsi="Wingdings" w:hint="default"/>
+      </w:rPr>
+    </w:lvl>
+    <w:lvl w:ilvl="6" w:tplc="08090001" w:tentative="1">
+      <w:start w:val="1"/>
+      <w:numFmt w:val="bullet"/>
+      <w:lvlText w:val=""/>
+      <w:lvlJc w:val="left"/>
+      <w:pPr>
+        <w:ind w:left="4680" w:hanging="360"/>
+      </w:pPr>
+      <w:rPr>
+        <w:rFonts w:ascii="Symbol" w:hAnsi="Symbol" w:hint="default"/>
+      </w:rPr>
+    </w:lvl>
+    <w:lvl w:ilvl="7" w:tplc="08090003" w:tentative="1">
+      <w:start w:val="1"/>
+      <w:numFmt w:val="bullet"/>
+      <w:lvlText w:val="o"/>
+      <w:lvlJc w:val="left"/>
+      <w:pPr>
+        <w:ind w:left="5400" w:hanging="360"/>
+      </w:pPr>
+      <w:rPr>
+        <w:rFonts w:ascii="Courier New" w:hAnsi="Courier New" w:cs="Courier New" w:hint="default"/>
+      </w:rPr>
+    </w:lvl>
+    <w:lvl w:ilvl="8" w:tplc="08090005" w:tentative="1">
+      <w:start w:val="1"/>
+      <w:numFmt w:val="bullet"/>
+      <w:lvlText w:val=""/>
+      <w:lvlJc w:val="left"/>
+      <w:pPr>
+        <w:ind w:left="6120" w:hanging="360"/>
+      </w:pPr>
+      <w:rPr>
+        <w:rFonts w:ascii="Wingdings" w:hAnsi="Wingdings" w:hint="default"/>
+      </w:rPr>
+    </w:lvl>
+  </w:abstractNum>
+  <w:abstractNum w:abstractNumId="9" w15:restartNumberingAfterBreak="0">
     <w:nsid w:val="3037689D"/>
     <w:multiLevelType w:val="hybridMultilevel"/>
     <w:tmpl w:val="29642C6C"/>
@@ -6679,7 +8424,459 @@
       </w:rPr>
     </w:lvl>
   </w:abstractNum>
-  <w:abstractNum w:abstractNumId="5" w15:restartNumberingAfterBreak="0">
+  <w:abstractNum w:abstractNumId="10" w15:restartNumberingAfterBreak="0">
+    <w:nsid w:val="34137DC3"/>
+    <w:multiLevelType w:val="hybridMultilevel"/>
+    <w:tmpl w:val="F62EE4A6"/>
+    <w:lvl w:ilvl="0" w:tplc="08090001">
+      <w:start w:val="1"/>
+      <w:numFmt w:val="bullet"/>
+      <w:lvlText w:val=""/>
+      <w:lvlJc w:val="left"/>
+      <w:pPr>
+        <w:ind w:left="360" w:hanging="360"/>
+      </w:pPr>
+      <w:rPr>
+        <w:rFonts w:ascii="Symbol" w:hAnsi="Symbol" w:hint="default"/>
+      </w:rPr>
+    </w:lvl>
+    <w:lvl w:ilvl="1" w:tplc="08090003" w:tentative="1">
+      <w:start w:val="1"/>
+      <w:numFmt w:val="bullet"/>
+      <w:lvlText w:val="o"/>
+      <w:lvlJc w:val="left"/>
+      <w:pPr>
+        <w:ind w:left="1080" w:hanging="360"/>
+      </w:pPr>
+      <w:rPr>
+        <w:rFonts w:ascii="Courier New" w:hAnsi="Courier New" w:cs="Courier New" w:hint="default"/>
+      </w:rPr>
+    </w:lvl>
+    <w:lvl w:ilvl="2" w:tplc="08090005" w:tentative="1">
+      <w:start w:val="1"/>
+      <w:numFmt w:val="bullet"/>
+      <w:lvlText w:val=""/>
+      <w:lvlJc w:val="left"/>
+      <w:pPr>
+        <w:ind w:left="1800" w:hanging="360"/>
+      </w:pPr>
+      <w:rPr>
+        <w:rFonts w:ascii="Wingdings" w:hAnsi="Wingdings" w:hint="default"/>
+      </w:rPr>
+    </w:lvl>
+    <w:lvl w:ilvl="3" w:tplc="08090001" w:tentative="1">
+      <w:start w:val="1"/>
+      <w:numFmt w:val="bullet"/>
+      <w:lvlText w:val=""/>
+      <w:lvlJc w:val="left"/>
+      <w:pPr>
+        <w:ind w:left="2520" w:hanging="360"/>
+      </w:pPr>
+      <w:rPr>
+        <w:rFonts w:ascii="Symbol" w:hAnsi="Symbol" w:hint="default"/>
+      </w:rPr>
+    </w:lvl>
+    <w:lvl w:ilvl="4" w:tplc="08090003" w:tentative="1">
+      <w:start w:val="1"/>
+      <w:numFmt w:val="bullet"/>
+      <w:lvlText w:val="o"/>
+      <w:lvlJc w:val="left"/>
+      <w:pPr>
+        <w:ind w:left="3240" w:hanging="360"/>
+      </w:pPr>
+      <w:rPr>
+        <w:rFonts w:ascii="Courier New" w:hAnsi="Courier New" w:cs="Courier New" w:hint="default"/>
+      </w:rPr>
+    </w:lvl>
+    <w:lvl w:ilvl="5" w:tplc="08090005" w:tentative="1">
+      <w:start w:val="1"/>
+      <w:numFmt w:val="bullet"/>
+      <w:lvlText w:val=""/>
+      <w:lvlJc w:val="left"/>
+      <w:pPr>
+        <w:ind w:left="3960" w:hanging="360"/>
+      </w:pPr>
+      <w:rPr>
+        <w:rFonts w:ascii="Wingdings" w:hAnsi="Wingdings" w:hint="default"/>
+      </w:rPr>
+    </w:lvl>
+    <w:lvl w:ilvl="6" w:tplc="08090001" w:tentative="1">
+      <w:start w:val="1"/>
+      <w:numFmt w:val="bullet"/>
+      <w:lvlText w:val=""/>
+      <w:lvlJc w:val="left"/>
+      <w:pPr>
+        <w:ind w:left="4680" w:hanging="360"/>
+      </w:pPr>
+      <w:rPr>
+        <w:rFonts w:ascii="Symbol" w:hAnsi="Symbol" w:hint="default"/>
+      </w:rPr>
+    </w:lvl>
+    <w:lvl w:ilvl="7" w:tplc="08090003" w:tentative="1">
+      <w:start w:val="1"/>
+      <w:numFmt w:val="bullet"/>
+      <w:lvlText w:val="o"/>
+      <w:lvlJc w:val="left"/>
+      <w:pPr>
+        <w:ind w:left="5400" w:hanging="360"/>
+      </w:pPr>
+      <w:rPr>
+        <w:rFonts w:ascii="Courier New" w:hAnsi="Courier New" w:cs="Courier New" w:hint="default"/>
+      </w:rPr>
+    </w:lvl>
+    <w:lvl w:ilvl="8" w:tplc="08090005" w:tentative="1">
+      <w:start w:val="1"/>
+      <w:numFmt w:val="bullet"/>
+      <w:lvlText w:val=""/>
+      <w:lvlJc w:val="left"/>
+      <w:pPr>
+        <w:ind w:left="6120" w:hanging="360"/>
+      </w:pPr>
+      <w:rPr>
+        <w:rFonts w:ascii="Wingdings" w:hAnsi="Wingdings" w:hint="default"/>
+      </w:rPr>
+    </w:lvl>
+  </w:abstractNum>
+  <w:abstractNum w:abstractNumId="11" w15:restartNumberingAfterBreak="0">
+    <w:nsid w:val="343C2359"/>
+    <w:multiLevelType w:val="hybridMultilevel"/>
+    <w:tmpl w:val="A1AA6704"/>
+    <w:lvl w:ilvl="0" w:tplc="08090001">
+      <w:start w:val="1"/>
+      <w:numFmt w:val="bullet"/>
+      <w:lvlText w:val=""/>
+      <w:lvlJc w:val="left"/>
+      <w:pPr>
+        <w:ind w:left="360" w:hanging="360"/>
+      </w:pPr>
+      <w:rPr>
+        <w:rFonts w:ascii="Symbol" w:hAnsi="Symbol" w:hint="default"/>
+      </w:rPr>
+    </w:lvl>
+    <w:lvl w:ilvl="1" w:tplc="08090003" w:tentative="1">
+      <w:start w:val="1"/>
+      <w:numFmt w:val="bullet"/>
+      <w:lvlText w:val="o"/>
+      <w:lvlJc w:val="left"/>
+      <w:pPr>
+        <w:ind w:left="1080" w:hanging="360"/>
+      </w:pPr>
+      <w:rPr>
+        <w:rFonts w:ascii="Courier New" w:hAnsi="Courier New" w:cs="Courier New" w:hint="default"/>
+      </w:rPr>
+    </w:lvl>
+    <w:lvl w:ilvl="2" w:tplc="08090005" w:tentative="1">
+      <w:start w:val="1"/>
+      <w:numFmt w:val="bullet"/>
+      <w:lvlText w:val=""/>
+      <w:lvlJc w:val="left"/>
+      <w:pPr>
+        <w:ind w:left="1800" w:hanging="360"/>
+      </w:pPr>
+      <w:rPr>
+        <w:rFonts w:ascii="Wingdings" w:hAnsi="Wingdings" w:hint="default"/>
+      </w:rPr>
+    </w:lvl>
+    <w:lvl w:ilvl="3" w:tplc="08090001" w:tentative="1">
+      <w:start w:val="1"/>
+      <w:numFmt w:val="bullet"/>
+      <w:lvlText w:val=""/>
+      <w:lvlJc w:val="left"/>
+      <w:pPr>
+        <w:ind w:left="2520" w:hanging="360"/>
+      </w:pPr>
+      <w:rPr>
+        <w:rFonts w:ascii="Symbol" w:hAnsi="Symbol" w:hint="default"/>
+      </w:rPr>
+    </w:lvl>
+    <w:lvl w:ilvl="4" w:tplc="08090003" w:tentative="1">
+      <w:start w:val="1"/>
+      <w:numFmt w:val="bullet"/>
+      <w:lvlText w:val="o"/>
+      <w:lvlJc w:val="left"/>
+      <w:pPr>
+        <w:ind w:left="3240" w:hanging="360"/>
+      </w:pPr>
+      <w:rPr>
+        <w:rFonts w:ascii="Courier New" w:hAnsi="Courier New" w:cs="Courier New" w:hint="default"/>
+      </w:rPr>
+    </w:lvl>
+    <w:lvl w:ilvl="5" w:tplc="08090005" w:tentative="1">
+      <w:start w:val="1"/>
+      <w:numFmt w:val="bullet"/>
+      <w:lvlText w:val=""/>
+      <w:lvlJc w:val="left"/>
+      <w:pPr>
+        <w:ind w:left="3960" w:hanging="360"/>
+      </w:pPr>
+      <w:rPr>
+        <w:rFonts w:ascii="Wingdings" w:hAnsi="Wingdings" w:hint="default"/>
+      </w:rPr>
+    </w:lvl>
+    <w:lvl w:ilvl="6" w:tplc="08090001" w:tentative="1">
+      <w:start w:val="1"/>
+      <w:numFmt w:val="bullet"/>
+      <w:lvlText w:val=""/>
+      <w:lvlJc w:val="left"/>
+      <w:pPr>
+        <w:ind w:left="4680" w:hanging="360"/>
+      </w:pPr>
+      <w:rPr>
+        <w:rFonts w:ascii="Symbol" w:hAnsi="Symbol" w:hint="default"/>
+      </w:rPr>
+    </w:lvl>
+    <w:lvl w:ilvl="7" w:tplc="08090003" w:tentative="1">
+      <w:start w:val="1"/>
+      <w:numFmt w:val="bullet"/>
+      <w:lvlText w:val="o"/>
+      <w:lvlJc w:val="left"/>
+      <w:pPr>
+        <w:ind w:left="5400" w:hanging="360"/>
+      </w:pPr>
+      <w:rPr>
+        <w:rFonts w:ascii="Courier New" w:hAnsi="Courier New" w:cs="Courier New" w:hint="default"/>
+      </w:rPr>
+    </w:lvl>
+    <w:lvl w:ilvl="8" w:tplc="08090005" w:tentative="1">
+      <w:start w:val="1"/>
+      <w:numFmt w:val="bullet"/>
+      <w:lvlText w:val=""/>
+      <w:lvlJc w:val="left"/>
+      <w:pPr>
+        <w:ind w:left="6120" w:hanging="360"/>
+      </w:pPr>
+      <w:rPr>
+        <w:rFonts w:ascii="Wingdings" w:hAnsi="Wingdings" w:hint="default"/>
+      </w:rPr>
+    </w:lvl>
+  </w:abstractNum>
+  <w:abstractNum w:abstractNumId="12" w15:restartNumberingAfterBreak="0">
+    <w:nsid w:val="3C8C0238"/>
+    <w:multiLevelType w:val="hybridMultilevel"/>
+    <w:tmpl w:val="B412883C"/>
+    <w:lvl w:ilvl="0" w:tplc="08090001">
+      <w:start w:val="1"/>
+      <w:numFmt w:val="bullet"/>
+      <w:lvlText w:val=""/>
+      <w:lvlJc w:val="left"/>
+      <w:pPr>
+        <w:ind w:left="360" w:hanging="360"/>
+      </w:pPr>
+      <w:rPr>
+        <w:rFonts w:ascii="Symbol" w:hAnsi="Symbol" w:hint="default"/>
+      </w:rPr>
+    </w:lvl>
+    <w:lvl w:ilvl="1" w:tplc="08090003" w:tentative="1">
+      <w:start w:val="1"/>
+      <w:numFmt w:val="bullet"/>
+      <w:lvlText w:val="o"/>
+      <w:lvlJc w:val="left"/>
+      <w:pPr>
+        <w:ind w:left="1080" w:hanging="360"/>
+      </w:pPr>
+      <w:rPr>
+        <w:rFonts w:ascii="Courier New" w:hAnsi="Courier New" w:cs="Courier New" w:hint="default"/>
+      </w:rPr>
+    </w:lvl>
+    <w:lvl w:ilvl="2" w:tplc="08090005" w:tentative="1">
+      <w:start w:val="1"/>
+      <w:numFmt w:val="bullet"/>
+      <w:lvlText w:val=""/>
+      <w:lvlJc w:val="left"/>
+      <w:pPr>
+        <w:ind w:left="1800" w:hanging="360"/>
+      </w:pPr>
+      <w:rPr>
+        <w:rFonts w:ascii="Wingdings" w:hAnsi="Wingdings" w:hint="default"/>
+      </w:rPr>
+    </w:lvl>
+    <w:lvl w:ilvl="3" w:tplc="08090001" w:tentative="1">
+      <w:start w:val="1"/>
+      <w:numFmt w:val="bullet"/>
+      <w:lvlText w:val=""/>
+      <w:lvlJc w:val="left"/>
+      <w:pPr>
+        <w:ind w:left="2520" w:hanging="360"/>
+      </w:pPr>
+      <w:rPr>
+        <w:rFonts w:ascii="Symbol" w:hAnsi="Symbol" w:hint="default"/>
+      </w:rPr>
+    </w:lvl>
+    <w:lvl w:ilvl="4" w:tplc="08090003" w:tentative="1">
+      <w:start w:val="1"/>
+      <w:numFmt w:val="bullet"/>
+      <w:lvlText w:val="o"/>
+      <w:lvlJc w:val="left"/>
+      <w:pPr>
+        <w:ind w:left="3240" w:hanging="360"/>
+      </w:pPr>
+      <w:rPr>
+        <w:rFonts w:ascii="Courier New" w:hAnsi="Courier New" w:cs="Courier New" w:hint="default"/>
+      </w:rPr>
+    </w:lvl>
+    <w:lvl w:ilvl="5" w:tplc="08090005" w:tentative="1">
+      <w:start w:val="1"/>
+      <w:numFmt w:val="bullet"/>
+      <w:lvlText w:val=""/>
+      <w:lvlJc w:val="left"/>
+      <w:pPr>
+        <w:ind w:left="3960" w:hanging="360"/>
+      </w:pPr>
+      <w:rPr>
+        <w:rFonts w:ascii="Wingdings" w:hAnsi="Wingdings" w:hint="default"/>
+      </w:rPr>
+    </w:lvl>
+    <w:lvl w:ilvl="6" w:tplc="08090001" w:tentative="1">
+      <w:start w:val="1"/>
+      <w:numFmt w:val="bullet"/>
+      <w:lvlText w:val=""/>
+      <w:lvlJc w:val="left"/>
+      <w:pPr>
+        <w:ind w:left="4680" w:hanging="360"/>
+      </w:pPr>
+      <w:rPr>
+        <w:rFonts w:ascii="Symbol" w:hAnsi="Symbol" w:hint="default"/>
+      </w:rPr>
+    </w:lvl>
+    <w:lvl w:ilvl="7" w:tplc="08090003" w:tentative="1">
+      <w:start w:val="1"/>
+      <w:numFmt w:val="bullet"/>
+      <w:lvlText w:val="o"/>
+      <w:lvlJc w:val="left"/>
+      <w:pPr>
+        <w:ind w:left="5400" w:hanging="360"/>
+      </w:pPr>
+      <w:rPr>
+        <w:rFonts w:ascii="Courier New" w:hAnsi="Courier New" w:cs="Courier New" w:hint="default"/>
+      </w:rPr>
+    </w:lvl>
+    <w:lvl w:ilvl="8" w:tplc="08090005" w:tentative="1">
+      <w:start w:val="1"/>
+      <w:numFmt w:val="bullet"/>
+      <w:lvlText w:val=""/>
+      <w:lvlJc w:val="left"/>
+      <w:pPr>
+        <w:ind w:left="6120" w:hanging="360"/>
+      </w:pPr>
+      <w:rPr>
+        <w:rFonts w:ascii="Wingdings" w:hAnsi="Wingdings" w:hint="default"/>
+      </w:rPr>
+    </w:lvl>
+  </w:abstractNum>
+  <w:abstractNum w:abstractNumId="13" w15:restartNumberingAfterBreak="0">
+    <w:nsid w:val="40AE2793"/>
+    <w:multiLevelType w:val="hybridMultilevel"/>
+    <w:tmpl w:val="CC8E11F4"/>
+    <w:lvl w:ilvl="0" w:tplc="08090001">
+      <w:start w:val="1"/>
+      <w:numFmt w:val="bullet"/>
+      <w:lvlText w:val=""/>
+      <w:lvlJc w:val="left"/>
+      <w:pPr>
+        <w:ind w:left="360" w:hanging="360"/>
+      </w:pPr>
+      <w:rPr>
+        <w:rFonts w:ascii="Symbol" w:hAnsi="Symbol" w:hint="default"/>
+      </w:rPr>
+    </w:lvl>
+    <w:lvl w:ilvl="1" w:tplc="08090003" w:tentative="1">
+      <w:start w:val="1"/>
+      <w:numFmt w:val="bullet"/>
+      <w:lvlText w:val="o"/>
+      <w:lvlJc w:val="left"/>
+      <w:pPr>
+        <w:ind w:left="1080" w:hanging="360"/>
+      </w:pPr>
+      <w:rPr>
+        <w:rFonts w:ascii="Courier New" w:hAnsi="Courier New" w:cs="Courier New" w:hint="default"/>
+      </w:rPr>
+    </w:lvl>
+    <w:lvl w:ilvl="2" w:tplc="08090005" w:tentative="1">
+      <w:start w:val="1"/>
+      <w:numFmt w:val="bullet"/>
+      <w:lvlText w:val=""/>
+      <w:lvlJc w:val="left"/>
+      <w:pPr>
+        <w:ind w:left="1800" w:hanging="360"/>
+      </w:pPr>
+      <w:rPr>
+        <w:rFonts w:ascii="Wingdings" w:hAnsi="Wingdings" w:hint="default"/>
+      </w:rPr>
+    </w:lvl>
+    <w:lvl w:ilvl="3" w:tplc="08090001" w:tentative="1">
+      <w:start w:val="1"/>
+      <w:numFmt w:val="bullet"/>
+      <w:lvlText w:val=""/>
+      <w:lvlJc w:val="left"/>
+      <w:pPr>
+        <w:ind w:left="2520" w:hanging="360"/>
+      </w:pPr>
+      <w:rPr>
+        <w:rFonts w:ascii="Symbol" w:hAnsi="Symbol" w:hint="default"/>
+      </w:rPr>
+    </w:lvl>
+    <w:lvl w:ilvl="4" w:tplc="08090003" w:tentative="1">
+      <w:start w:val="1"/>
+      <w:numFmt w:val="bullet"/>
+      <w:lvlText w:val="o"/>
+      <w:lvlJc w:val="left"/>
+      <w:pPr>
+        <w:ind w:left="3240" w:hanging="360"/>
+      </w:pPr>
+      <w:rPr>
+        <w:rFonts w:ascii="Courier New" w:hAnsi="Courier New" w:cs="Courier New" w:hint="default"/>
+      </w:rPr>
+    </w:lvl>
+    <w:lvl w:ilvl="5" w:tplc="08090005" w:tentative="1">
+      <w:start w:val="1"/>
+      <w:numFmt w:val="bullet"/>
+      <w:lvlText w:val=""/>
+      <w:lvlJc w:val="left"/>
+      <w:pPr>
+        <w:ind w:left="3960" w:hanging="360"/>
+      </w:pPr>
+      <w:rPr>
+        <w:rFonts w:ascii="Wingdings" w:hAnsi="Wingdings" w:hint="default"/>
+      </w:rPr>
+    </w:lvl>
+    <w:lvl w:ilvl="6" w:tplc="08090001" w:tentative="1">
+      <w:start w:val="1"/>
+      <w:numFmt w:val="bullet"/>
+      <w:lvlText w:val=""/>
+      <w:lvlJc w:val="left"/>
+      <w:pPr>
+        <w:ind w:left="4680" w:hanging="360"/>
+      </w:pPr>
+      <w:rPr>
+        <w:rFonts w:ascii="Symbol" w:hAnsi="Symbol" w:hint="default"/>
+      </w:rPr>
+    </w:lvl>
+    <w:lvl w:ilvl="7" w:tplc="08090003" w:tentative="1">
+      <w:start w:val="1"/>
+      <w:numFmt w:val="bullet"/>
+      <w:lvlText w:val="o"/>
+      <w:lvlJc w:val="left"/>
+      <w:pPr>
+        <w:ind w:left="5400" w:hanging="360"/>
+      </w:pPr>
+      <w:rPr>
+        <w:rFonts w:ascii="Courier New" w:hAnsi="Courier New" w:cs="Courier New" w:hint="default"/>
+      </w:rPr>
+    </w:lvl>
+    <w:lvl w:ilvl="8" w:tplc="08090005" w:tentative="1">
+      <w:start w:val="1"/>
+      <w:numFmt w:val="bullet"/>
+      <w:lvlText w:val=""/>
+      <w:lvlJc w:val="left"/>
+      <w:pPr>
+        <w:ind w:left="6120" w:hanging="360"/>
+      </w:pPr>
+      <w:rPr>
+        <w:rFonts w:ascii="Wingdings" w:hAnsi="Wingdings" w:hint="default"/>
+      </w:rPr>
+    </w:lvl>
+  </w:abstractNum>
+  <w:abstractNum w:abstractNumId="14" w15:restartNumberingAfterBreak="0">
     <w:nsid w:val="40DD2DEA"/>
     <w:multiLevelType w:val="hybridMultilevel"/>
     <w:tmpl w:val="4D4E024E"/>
@@ -6768,7 +8965,233 @@
       </w:pPr>
     </w:lvl>
   </w:abstractNum>
-  <w:abstractNum w:abstractNumId="6" w15:restartNumberingAfterBreak="0">
+  <w:abstractNum w:abstractNumId="15" w15:restartNumberingAfterBreak="0">
+    <w:nsid w:val="42CD739C"/>
+    <w:multiLevelType w:val="hybridMultilevel"/>
+    <w:tmpl w:val="D034DBEC"/>
+    <w:lvl w:ilvl="0" w:tplc="08090001">
+      <w:start w:val="1"/>
+      <w:numFmt w:val="bullet"/>
+      <w:lvlText w:val=""/>
+      <w:lvlJc w:val="left"/>
+      <w:pPr>
+        <w:ind w:left="360" w:hanging="360"/>
+      </w:pPr>
+      <w:rPr>
+        <w:rFonts w:ascii="Symbol" w:hAnsi="Symbol" w:hint="default"/>
+      </w:rPr>
+    </w:lvl>
+    <w:lvl w:ilvl="1" w:tplc="08090003" w:tentative="1">
+      <w:start w:val="1"/>
+      <w:numFmt w:val="bullet"/>
+      <w:lvlText w:val="o"/>
+      <w:lvlJc w:val="left"/>
+      <w:pPr>
+        <w:ind w:left="1080" w:hanging="360"/>
+      </w:pPr>
+      <w:rPr>
+        <w:rFonts w:ascii="Courier New" w:hAnsi="Courier New" w:cs="Courier New" w:hint="default"/>
+      </w:rPr>
+    </w:lvl>
+    <w:lvl w:ilvl="2" w:tplc="08090005" w:tentative="1">
+      <w:start w:val="1"/>
+      <w:numFmt w:val="bullet"/>
+      <w:lvlText w:val=""/>
+      <w:lvlJc w:val="left"/>
+      <w:pPr>
+        <w:ind w:left="1800" w:hanging="360"/>
+      </w:pPr>
+      <w:rPr>
+        <w:rFonts w:ascii="Wingdings" w:hAnsi="Wingdings" w:hint="default"/>
+      </w:rPr>
+    </w:lvl>
+    <w:lvl w:ilvl="3" w:tplc="08090001" w:tentative="1">
+      <w:start w:val="1"/>
+      <w:numFmt w:val="bullet"/>
+      <w:lvlText w:val=""/>
+      <w:lvlJc w:val="left"/>
+      <w:pPr>
+        <w:ind w:left="2520" w:hanging="360"/>
+      </w:pPr>
+      <w:rPr>
+        <w:rFonts w:ascii="Symbol" w:hAnsi="Symbol" w:hint="default"/>
+      </w:rPr>
+    </w:lvl>
+    <w:lvl w:ilvl="4" w:tplc="08090003" w:tentative="1">
+      <w:start w:val="1"/>
+      <w:numFmt w:val="bullet"/>
+      <w:lvlText w:val="o"/>
+      <w:lvlJc w:val="left"/>
+      <w:pPr>
+        <w:ind w:left="3240" w:hanging="360"/>
+      </w:pPr>
+      <w:rPr>
+        <w:rFonts w:ascii="Courier New" w:hAnsi="Courier New" w:cs="Courier New" w:hint="default"/>
+      </w:rPr>
+    </w:lvl>
+    <w:lvl w:ilvl="5" w:tplc="08090005" w:tentative="1">
+      <w:start w:val="1"/>
+      <w:numFmt w:val="bullet"/>
+      <w:lvlText w:val=""/>
+      <w:lvlJc w:val="left"/>
+      <w:pPr>
+        <w:ind w:left="3960" w:hanging="360"/>
+      </w:pPr>
+      <w:rPr>
+        <w:rFonts w:ascii="Wingdings" w:hAnsi="Wingdings" w:hint="default"/>
+      </w:rPr>
+    </w:lvl>
+    <w:lvl w:ilvl="6" w:tplc="08090001" w:tentative="1">
+      <w:start w:val="1"/>
+      <w:numFmt w:val="bullet"/>
+      <w:lvlText w:val=""/>
+      <w:lvlJc w:val="left"/>
+      <w:pPr>
+        <w:ind w:left="4680" w:hanging="360"/>
+      </w:pPr>
+      <w:rPr>
+        <w:rFonts w:ascii="Symbol" w:hAnsi="Symbol" w:hint="default"/>
+      </w:rPr>
+    </w:lvl>
+    <w:lvl w:ilvl="7" w:tplc="08090003" w:tentative="1">
+      <w:start w:val="1"/>
+      <w:numFmt w:val="bullet"/>
+      <w:lvlText w:val="o"/>
+      <w:lvlJc w:val="left"/>
+      <w:pPr>
+        <w:ind w:left="5400" w:hanging="360"/>
+      </w:pPr>
+      <w:rPr>
+        <w:rFonts w:ascii="Courier New" w:hAnsi="Courier New" w:cs="Courier New" w:hint="default"/>
+      </w:rPr>
+    </w:lvl>
+    <w:lvl w:ilvl="8" w:tplc="08090005" w:tentative="1">
+      <w:start w:val="1"/>
+      <w:numFmt w:val="bullet"/>
+      <w:lvlText w:val=""/>
+      <w:lvlJc w:val="left"/>
+      <w:pPr>
+        <w:ind w:left="6120" w:hanging="360"/>
+      </w:pPr>
+      <w:rPr>
+        <w:rFonts w:ascii="Wingdings" w:hAnsi="Wingdings" w:hint="default"/>
+      </w:rPr>
+    </w:lvl>
+  </w:abstractNum>
+  <w:abstractNum w:abstractNumId="16" w15:restartNumberingAfterBreak="0">
+    <w:nsid w:val="43AB38DD"/>
+    <w:multiLevelType w:val="hybridMultilevel"/>
+    <w:tmpl w:val="690C8AE2"/>
+    <w:lvl w:ilvl="0" w:tplc="08090001">
+      <w:start w:val="1"/>
+      <w:numFmt w:val="bullet"/>
+      <w:lvlText w:val=""/>
+      <w:lvlJc w:val="left"/>
+      <w:pPr>
+        <w:ind w:left="360" w:hanging="360"/>
+      </w:pPr>
+      <w:rPr>
+        <w:rFonts w:ascii="Symbol" w:hAnsi="Symbol" w:hint="default"/>
+      </w:rPr>
+    </w:lvl>
+    <w:lvl w:ilvl="1" w:tplc="08090003" w:tentative="1">
+      <w:start w:val="1"/>
+      <w:numFmt w:val="bullet"/>
+      <w:lvlText w:val="o"/>
+      <w:lvlJc w:val="left"/>
+      <w:pPr>
+        <w:ind w:left="1080" w:hanging="360"/>
+      </w:pPr>
+      <w:rPr>
+        <w:rFonts w:ascii="Courier New" w:hAnsi="Courier New" w:cs="Courier New" w:hint="default"/>
+      </w:rPr>
+    </w:lvl>
+    <w:lvl w:ilvl="2" w:tplc="08090005" w:tentative="1">
+      <w:start w:val="1"/>
+      <w:numFmt w:val="bullet"/>
+      <w:lvlText w:val=""/>
+      <w:lvlJc w:val="left"/>
+      <w:pPr>
+        <w:ind w:left="1800" w:hanging="360"/>
+      </w:pPr>
+      <w:rPr>
+        <w:rFonts w:ascii="Wingdings" w:hAnsi="Wingdings" w:hint="default"/>
+      </w:rPr>
+    </w:lvl>
+    <w:lvl w:ilvl="3" w:tplc="08090001" w:tentative="1">
+      <w:start w:val="1"/>
+      <w:numFmt w:val="bullet"/>
+      <w:lvlText w:val=""/>
+      <w:lvlJc w:val="left"/>
+      <w:pPr>
+        <w:ind w:left="2520" w:hanging="360"/>
+      </w:pPr>
+      <w:rPr>
+        <w:rFonts w:ascii="Symbol" w:hAnsi="Symbol" w:hint="default"/>
+      </w:rPr>
+    </w:lvl>
+    <w:lvl w:ilvl="4" w:tplc="08090003" w:tentative="1">
+      <w:start w:val="1"/>
+      <w:numFmt w:val="bullet"/>
+      <w:lvlText w:val="o"/>
+      <w:lvlJc w:val="left"/>
+      <w:pPr>
+        <w:ind w:left="3240" w:hanging="360"/>
+      </w:pPr>
+      <w:rPr>
+        <w:rFonts w:ascii="Courier New" w:hAnsi="Courier New" w:cs="Courier New" w:hint="default"/>
+      </w:rPr>
+    </w:lvl>
+    <w:lvl w:ilvl="5" w:tplc="08090005" w:tentative="1">
+      <w:start w:val="1"/>
+      <w:numFmt w:val="bullet"/>
+      <w:lvlText w:val=""/>
+      <w:lvlJc w:val="left"/>
+      <w:pPr>
+        <w:ind w:left="3960" w:hanging="360"/>
+      </w:pPr>
+      <w:rPr>
+        <w:rFonts w:ascii="Wingdings" w:hAnsi="Wingdings" w:hint="default"/>
+      </w:rPr>
+    </w:lvl>
+    <w:lvl w:ilvl="6" w:tplc="08090001" w:tentative="1">
+      <w:start w:val="1"/>
+      <w:numFmt w:val="bullet"/>
+      <w:lvlText w:val=""/>
+      <w:lvlJc w:val="left"/>
+      <w:pPr>
+        <w:ind w:left="4680" w:hanging="360"/>
+      </w:pPr>
+      <w:rPr>
+        <w:rFonts w:ascii="Symbol" w:hAnsi="Symbol" w:hint="default"/>
+      </w:rPr>
+    </w:lvl>
+    <w:lvl w:ilvl="7" w:tplc="08090003" w:tentative="1">
+      <w:start w:val="1"/>
+      <w:numFmt w:val="bullet"/>
+      <w:lvlText w:val="o"/>
+      <w:lvlJc w:val="left"/>
+      <w:pPr>
+        <w:ind w:left="5400" w:hanging="360"/>
+      </w:pPr>
+      <w:rPr>
+        <w:rFonts w:ascii="Courier New" w:hAnsi="Courier New" w:cs="Courier New" w:hint="default"/>
+      </w:rPr>
+    </w:lvl>
+    <w:lvl w:ilvl="8" w:tplc="08090005" w:tentative="1">
+      <w:start w:val="1"/>
+      <w:numFmt w:val="bullet"/>
+      <w:lvlText w:val=""/>
+      <w:lvlJc w:val="left"/>
+      <w:pPr>
+        <w:ind w:left="6120" w:hanging="360"/>
+      </w:pPr>
+      <w:rPr>
+        <w:rFonts w:ascii="Wingdings" w:hAnsi="Wingdings" w:hint="default"/>
+      </w:rPr>
+    </w:lvl>
+  </w:abstractNum>
+  <w:abstractNum w:abstractNumId="17" w15:restartNumberingAfterBreak="0">
     <w:nsid w:val="45964BD0"/>
     <w:multiLevelType w:val="hybridMultilevel"/>
     <w:tmpl w:val="DE10AA60"/>
@@ -6881,7 +9304,7 @@
       </w:rPr>
     </w:lvl>
   </w:abstractNum>
-  <w:abstractNum w:abstractNumId="7" w15:restartNumberingAfterBreak="0">
+  <w:abstractNum w:abstractNumId="18" w15:restartNumberingAfterBreak="0">
     <w:nsid w:val="4B7051F5"/>
     <w:multiLevelType w:val="hybridMultilevel"/>
     <w:tmpl w:val="B4C6B37A"/>
@@ -6970,7 +9393,7 @@
       </w:pPr>
     </w:lvl>
   </w:abstractNum>
-  <w:abstractNum w:abstractNumId="8" w15:restartNumberingAfterBreak="0">
+  <w:abstractNum w:abstractNumId="19" w15:restartNumberingAfterBreak="0">
     <w:nsid w:val="4CCB478E"/>
     <w:multiLevelType w:val="hybridMultilevel"/>
     <w:tmpl w:val="F32A2A9E"/>
@@ -7083,7 +9506,120 @@
       </w:rPr>
     </w:lvl>
   </w:abstractNum>
-  <w:abstractNum w:abstractNumId="9" w15:restartNumberingAfterBreak="0">
+  <w:abstractNum w:abstractNumId="20" w15:restartNumberingAfterBreak="0">
+    <w:nsid w:val="516D7CF9"/>
+    <w:multiLevelType w:val="hybridMultilevel"/>
+    <w:tmpl w:val="53ECDE3A"/>
+    <w:lvl w:ilvl="0" w:tplc="08090001">
+      <w:start w:val="1"/>
+      <w:numFmt w:val="bullet"/>
+      <w:lvlText w:val=""/>
+      <w:lvlJc w:val="left"/>
+      <w:pPr>
+        <w:ind w:left="360" w:hanging="360"/>
+      </w:pPr>
+      <w:rPr>
+        <w:rFonts w:ascii="Symbol" w:hAnsi="Symbol" w:hint="default"/>
+      </w:rPr>
+    </w:lvl>
+    <w:lvl w:ilvl="1" w:tplc="08090003" w:tentative="1">
+      <w:start w:val="1"/>
+      <w:numFmt w:val="bullet"/>
+      <w:lvlText w:val="o"/>
+      <w:lvlJc w:val="left"/>
+      <w:pPr>
+        <w:ind w:left="1080" w:hanging="360"/>
+      </w:pPr>
+      <w:rPr>
+        <w:rFonts w:ascii="Courier New" w:hAnsi="Courier New" w:cs="Courier New" w:hint="default"/>
+      </w:rPr>
+    </w:lvl>
+    <w:lvl w:ilvl="2" w:tplc="08090005" w:tentative="1">
+      <w:start w:val="1"/>
+      <w:numFmt w:val="bullet"/>
+      <w:lvlText w:val=""/>
+      <w:lvlJc w:val="left"/>
+      <w:pPr>
+        <w:ind w:left="1800" w:hanging="360"/>
+      </w:pPr>
+      <w:rPr>
+        <w:rFonts w:ascii="Wingdings" w:hAnsi="Wingdings" w:hint="default"/>
+      </w:rPr>
+    </w:lvl>
+    <w:lvl w:ilvl="3" w:tplc="08090001" w:tentative="1">
+      <w:start w:val="1"/>
+      <w:numFmt w:val="bullet"/>
+      <w:lvlText w:val=""/>
+      <w:lvlJc w:val="left"/>
+      <w:pPr>
+        <w:ind w:left="2520" w:hanging="360"/>
+      </w:pPr>
+      <w:rPr>
+        <w:rFonts w:ascii="Symbol" w:hAnsi="Symbol" w:hint="default"/>
+      </w:rPr>
+    </w:lvl>
+    <w:lvl w:ilvl="4" w:tplc="08090003" w:tentative="1">
+      <w:start w:val="1"/>
+      <w:numFmt w:val="bullet"/>
+      <w:lvlText w:val="o"/>
+      <w:lvlJc w:val="left"/>
+      <w:pPr>
+        <w:ind w:left="3240" w:hanging="360"/>
+      </w:pPr>
+      <w:rPr>
+        <w:rFonts w:ascii="Courier New" w:hAnsi="Courier New" w:cs="Courier New" w:hint="default"/>
+      </w:rPr>
+    </w:lvl>
+    <w:lvl w:ilvl="5" w:tplc="08090005" w:tentative="1">
+      <w:start w:val="1"/>
+      <w:numFmt w:val="bullet"/>
+      <w:lvlText w:val=""/>
+      <w:lvlJc w:val="left"/>
+      <w:pPr>
+        <w:ind w:left="3960" w:hanging="360"/>
+      </w:pPr>
+      <w:rPr>
+        <w:rFonts w:ascii="Wingdings" w:hAnsi="Wingdings" w:hint="default"/>
+      </w:rPr>
+    </w:lvl>
+    <w:lvl w:ilvl="6" w:tplc="08090001" w:tentative="1">
+      <w:start w:val="1"/>
+      <w:numFmt w:val="bullet"/>
+      <w:lvlText w:val=""/>
+      <w:lvlJc w:val="left"/>
+      <w:pPr>
+        <w:ind w:left="4680" w:hanging="360"/>
+      </w:pPr>
+      <w:rPr>
+        <w:rFonts w:ascii="Symbol" w:hAnsi="Symbol" w:hint="default"/>
+      </w:rPr>
+    </w:lvl>
+    <w:lvl w:ilvl="7" w:tplc="08090003" w:tentative="1">
+      <w:start w:val="1"/>
+      <w:numFmt w:val="bullet"/>
+      <w:lvlText w:val="o"/>
+      <w:lvlJc w:val="left"/>
+      <w:pPr>
+        <w:ind w:left="5400" w:hanging="360"/>
+      </w:pPr>
+      <w:rPr>
+        <w:rFonts w:ascii="Courier New" w:hAnsi="Courier New" w:cs="Courier New" w:hint="default"/>
+      </w:rPr>
+    </w:lvl>
+    <w:lvl w:ilvl="8" w:tplc="08090005" w:tentative="1">
+      <w:start w:val="1"/>
+      <w:numFmt w:val="bullet"/>
+      <w:lvlText w:val=""/>
+      <w:lvlJc w:val="left"/>
+      <w:pPr>
+        <w:ind w:left="6120" w:hanging="360"/>
+      </w:pPr>
+      <w:rPr>
+        <w:rFonts w:ascii="Wingdings" w:hAnsi="Wingdings" w:hint="default"/>
+      </w:rPr>
+    </w:lvl>
+  </w:abstractNum>
+  <w:abstractNum w:abstractNumId="21" w15:restartNumberingAfterBreak="0">
     <w:nsid w:val="53871932"/>
     <w:multiLevelType w:val="hybridMultilevel"/>
     <w:tmpl w:val="A67A36CE"/>
@@ -7196,7 +9732,7 @@
       </w:rPr>
     </w:lvl>
   </w:abstractNum>
-  <w:abstractNum w:abstractNumId="10" w15:restartNumberingAfterBreak="0">
+  <w:abstractNum w:abstractNumId="22" w15:restartNumberingAfterBreak="0">
     <w:nsid w:val="5F186F0E"/>
     <w:multiLevelType w:val="hybridMultilevel"/>
     <w:tmpl w:val="3042A60A"/>
@@ -7309,37 +9845,73 @@
     </w:lvl>
   </w:abstractNum>
   <w:num w:numId="1" w16cid:durableId="15544250">
-    <w:abstractNumId w:val="8"/>
+    <w:abstractNumId w:val="19"/>
   </w:num>
   <w:num w:numId="2" w16cid:durableId="240913415">
     <w:abstractNumId w:val="0"/>
   </w:num>
   <w:num w:numId="3" w16cid:durableId="1554534537">
+    <w:abstractNumId w:val="22"/>
+  </w:num>
+  <w:num w:numId="4" w16cid:durableId="1461267549">
+    <w:abstractNumId w:val="4"/>
+  </w:num>
+  <w:num w:numId="5" w16cid:durableId="590628215">
+    <w:abstractNumId w:val="17"/>
+  </w:num>
+  <w:num w:numId="6" w16cid:durableId="458651924">
+    <w:abstractNumId w:val="14"/>
+  </w:num>
+  <w:num w:numId="7" w16cid:durableId="858740831">
+    <w:abstractNumId w:val="18"/>
+  </w:num>
+  <w:num w:numId="8" w16cid:durableId="1754546689">
+    <w:abstractNumId w:val="6"/>
+  </w:num>
+  <w:num w:numId="9" w16cid:durableId="1177428979">
+    <w:abstractNumId w:val="3"/>
+  </w:num>
+  <w:num w:numId="10" w16cid:durableId="1314335334">
+    <w:abstractNumId w:val="21"/>
+  </w:num>
+  <w:num w:numId="11" w16cid:durableId="2109276197">
+    <w:abstractNumId w:val="9"/>
+  </w:num>
+  <w:num w:numId="12" w16cid:durableId="807404261">
+    <w:abstractNumId w:val="12"/>
+  </w:num>
+  <w:num w:numId="13" w16cid:durableId="1100487879">
+    <w:abstractNumId w:val="8"/>
+  </w:num>
+  <w:num w:numId="14" w16cid:durableId="1797523282">
+    <w:abstractNumId w:val="2"/>
+  </w:num>
+  <w:num w:numId="15" w16cid:durableId="1567455624">
+    <w:abstractNumId w:val="5"/>
+  </w:num>
+  <w:num w:numId="16" w16cid:durableId="748384031">
+    <w:abstractNumId w:val="15"/>
+  </w:num>
+  <w:num w:numId="17" w16cid:durableId="1550535132">
+    <w:abstractNumId w:val="11"/>
+  </w:num>
+  <w:num w:numId="18" w16cid:durableId="1529879444">
+    <w:abstractNumId w:val="13"/>
+  </w:num>
+  <w:num w:numId="19" w16cid:durableId="176164602">
+    <w:abstractNumId w:val="20"/>
+  </w:num>
+  <w:num w:numId="20" w16cid:durableId="1987737104">
+    <w:abstractNumId w:val="7"/>
+  </w:num>
+  <w:num w:numId="21" w16cid:durableId="78020053">
     <w:abstractNumId w:val="10"/>
   </w:num>
-  <w:num w:numId="4" w16cid:durableId="1461267549">
-    <w:abstractNumId w:val="2"/>
+  <w:num w:numId="22" w16cid:durableId="755055647">
+    <w:abstractNumId w:val="16"/>
   </w:num>
-  <w:num w:numId="5" w16cid:durableId="590628215">
-    <w:abstractNumId w:val="6"/>
-  </w:num>
-  <w:num w:numId="6" w16cid:durableId="458651924">
-    <w:abstractNumId w:val="5"/>
-  </w:num>
-  <w:num w:numId="7" w16cid:durableId="858740831">
-    <w:abstractNumId w:val="7"/>
-  </w:num>
-  <w:num w:numId="8" w16cid:durableId="1754546689">
-    <w:abstractNumId w:val="3"/>
-  </w:num>
-  <w:num w:numId="9" w16cid:durableId="1177428979">
+  <w:num w:numId="23" w16cid:durableId="1610969929">
     <w:abstractNumId w:val="1"/>
-  </w:num>
-  <w:num w:numId="10" w16cid:durableId="1314335334">
-    <w:abstractNumId w:val="9"/>
-  </w:num>
-  <w:num w:numId="11" w16cid:durableId="2109276197">
-    <w:abstractNumId w:val="4"/>
   </w:num>
 </w:numbering>
 </file>
@@ -7786,10 +10358,31 @@
       <w:szCs w:val="26"/>
     </w:rPr>
   </w:style>
+  <w:style w:type="paragraph" w:styleId="Heading3">
+    <w:name w:val="heading 3"/>
+    <w:basedOn w:val="Normal"/>
+    <w:next w:val="Normal"/>
+    <w:link w:val="Heading3Char"/>
+    <w:uiPriority w:val="9"/>
+    <w:unhideWhenUsed/>
+    <w:qFormat/>
+    <w:rsid w:val="00515435"/>
+    <w:pPr>
+      <w:keepNext/>
+      <w:keepLines/>
+      <w:spacing w:before="40" w:after="0"/>
+      <w:outlineLvl w:val="2"/>
+    </w:pPr>
+    <w:rPr>
+      <w:rFonts w:asciiTheme="majorHAnsi" w:eastAsiaTheme="majorEastAsia" w:hAnsiTheme="majorHAnsi" w:cstheme="majorBidi"/>
+      <w:color w:val="1F3763" w:themeColor="accent1" w:themeShade="7F"/>
+      <w:sz w:val="24"/>
+      <w:szCs w:val="24"/>
+    </w:rPr>
+  </w:style>
   <w:style w:type="character" w:default="1" w:styleId="DefaultParagraphFont">
     <w:name w:val="Default Paragraph Font"/>
     <w:uiPriority w:val="1"/>
-    <w:semiHidden/>
     <w:unhideWhenUsed/>
   </w:style>
   <w:style w:type="table" w:default="1" w:styleId="TableNormal">
@@ -7988,6 +10581,63 @@
       <w:shd w:val="clear" w:color="auto" w:fill="E1DFDD"/>
     </w:rPr>
   </w:style>
+  <w:style w:type="paragraph" w:styleId="Header">
+    <w:name w:val="header"/>
+    <w:basedOn w:val="Normal"/>
+    <w:link w:val="HeaderChar"/>
+    <w:uiPriority w:val="99"/>
+    <w:unhideWhenUsed/>
+    <w:rsid w:val="0055226C"/>
+    <w:pPr>
+      <w:tabs>
+        <w:tab w:val="center" w:pos="4513"/>
+        <w:tab w:val="right" w:pos="9026"/>
+      </w:tabs>
+      <w:spacing w:after="0" w:line="240" w:lineRule="auto"/>
+    </w:pPr>
+  </w:style>
+  <w:style w:type="character" w:customStyle="1" w:styleId="HeaderChar">
+    <w:name w:val="Header Char"/>
+    <w:basedOn w:val="DefaultParagraphFont"/>
+    <w:link w:val="Header"/>
+    <w:uiPriority w:val="99"/>
+    <w:rsid w:val="0055226C"/>
+  </w:style>
+  <w:style w:type="paragraph" w:styleId="Footer">
+    <w:name w:val="footer"/>
+    <w:basedOn w:val="Normal"/>
+    <w:link w:val="FooterChar"/>
+    <w:uiPriority w:val="99"/>
+    <w:unhideWhenUsed/>
+    <w:rsid w:val="0055226C"/>
+    <w:pPr>
+      <w:tabs>
+        <w:tab w:val="center" w:pos="4513"/>
+        <w:tab w:val="right" w:pos="9026"/>
+      </w:tabs>
+      <w:spacing w:after="0" w:line="240" w:lineRule="auto"/>
+    </w:pPr>
+  </w:style>
+  <w:style w:type="character" w:customStyle="1" w:styleId="FooterChar">
+    <w:name w:val="Footer Char"/>
+    <w:basedOn w:val="DefaultParagraphFont"/>
+    <w:link w:val="Footer"/>
+    <w:uiPriority w:val="99"/>
+    <w:rsid w:val="0055226C"/>
+  </w:style>
+  <w:style w:type="character" w:customStyle="1" w:styleId="Heading3Char">
+    <w:name w:val="Heading 3 Char"/>
+    <w:basedOn w:val="DefaultParagraphFont"/>
+    <w:link w:val="Heading3"/>
+    <w:uiPriority w:val="9"/>
+    <w:rsid w:val="00515435"/>
+    <w:rPr>
+      <w:rFonts w:asciiTheme="majorHAnsi" w:eastAsiaTheme="majorEastAsia" w:hAnsiTheme="majorHAnsi" w:cstheme="majorBidi"/>
+      <w:color w:val="1F3763" w:themeColor="accent1" w:themeShade="7F"/>
+      <w:sz w:val="24"/>
+      <w:szCs w:val="24"/>
+    </w:rPr>
+  </w:style>
 </w:styles>
 </file>
 
@@ -8146,12 +10796,16 @@
     <w:rsidRoot w:val="00F9325C"/>
     <w:rsid w:val="000C521E"/>
     <w:rsid w:val="000D6F37"/>
+    <w:rsid w:val="0014504C"/>
     <w:rsid w:val="002E5903"/>
     <w:rsid w:val="002F56F6"/>
+    <w:rsid w:val="00917A83"/>
     <w:rsid w:val="009D2B66"/>
     <w:rsid w:val="00B03F3A"/>
+    <w:rsid w:val="00E72ADF"/>
     <w:rsid w:val="00EC41CE"/>
     <w:rsid w:val="00ED6983"/>
+    <w:rsid w:val="00F86BEE"/>
     <w:rsid w:val="00F9325C"/>
   </w:rsids>
   <m:mathPr>

</xml_diff>

<commit_message>
Day 3 Exam finished
Finished Friday 13 march
</commit_message>
<xml_diff>
--- a/Task 1/Task 1a/Task1_Proposal_LL-000020914__Naser_A.docx
+++ b/Task 1/Task 1a/Task1_Proposal_LL-000020914__Naser_A.docx
@@ -1,6 +1,6 @@
 
 <file path=word/document.xml><?xml version="1.0" encoding="utf-8"?>
-<w:document xmlns:wpc="http://schemas.microsoft.com/office/word/2010/wordprocessingCanvas" xmlns:cx="http://schemas.microsoft.com/office/drawing/2014/chartex" xmlns:cx1="http://schemas.microsoft.com/office/drawing/2015/9/8/chartex" xmlns:cx2="http://schemas.microsoft.com/office/drawing/2015/10/21/chartex" xmlns:cx3="http://schemas.microsoft.com/office/drawing/2016/5/9/chartex" xmlns:cx4="http://schemas.microsoft.com/office/drawing/2016/5/10/chartex" xmlns:cx5="http://schemas.microsoft.com/office/drawing/2016/5/11/chartex" xmlns:cx6="http://schemas.microsoft.com/office/drawing/2016/5/12/chartex" xmlns:cx7="http://schemas.microsoft.com/office/drawing/2016/5/13/chartex" xmlns:cx8="http://schemas.microsoft.com/office/drawing/2016/5/14/chartex" xmlns:mc="http://schemas.openxmlformats.org/markup-compatibility/2006" xmlns:aink="http://schemas.microsoft.com/office/drawing/2016/ink" xmlns:am3d="http://schemas.microsoft.com/office/drawing/2017/model3d" xmlns:o="urn:schemas-microsoft-com:office:office" xmlns:oel="http://schemas.microsoft.com/office/2019/extlst" xmlns:r="http://schemas.openxmlformats.org/officeDocument/2006/relationships" xmlns:m="http://schemas.openxmlformats.org/officeDocument/2006/math" xmlns:v="urn:schemas-microsoft-com:vml" xmlns:wp14="http://schemas.microsoft.com/office/word/2010/wordprocessingDrawing" xmlns:wp="http://schemas.openxmlformats.org/drawingml/2006/wordprocessingDrawing" xmlns:w10="urn:schemas-microsoft-com:office:word" xmlns:w="http://schemas.openxmlformats.org/wordprocessingml/2006/main" xmlns:w14="http://schemas.microsoft.com/office/word/2010/wordml" xmlns:w15="http://schemas.microsoft.com/office/word/2012/wordml" xmlns:w16cex="http://schemas.microsoft.com/office/word/2018/wordml/cex" xmlns:w16cid="http://schemas.microsoft.com/office/word/2016/wordml/cid" xmlns:w16="http://schemas.microsoft.com/office/word/2018/wordml" xmlns:w16du="http://schemas.microsoft.com/office/word/2023/wordml/word16du" xmlns:w16sdtdh="http://schemas.microsoft.com/office/word/2020/wordml/sdtdatahash" xmlns:w16sdtfl="http://schemas.microsoft.com/office/word/2024/wordml/sdtformatlock" xmlns:w16se="http://schemas.microsoft.com/office/word/2015/wordml/symex" xmlns:wpg="http://schemas.microsoft.com/office/word/2010/wordprocessingGroup" xmlns:wpi="http://schemas.microsoft.com/office/word/2010/wordprocessingInk" xmlns:wne="http://schemas.microsoft.com/office/word/2006/wordml" xmlns:wps="http://schemas.microsoft.com/office/word/2010/wordprocessingShape" mc:Ignorable="w14 w15 w16se w16cid w16 w16cex w16sdtdh w16sdtfl w16du wp14">
+<w:document xmlns:wpc="http://schemas.microsoft.com/office/word/2010/wordprocessingCanvas" xmlns:cx="http://schemas.microsoft.com/office/drawing/2014/chartex" xmlns:cx1="http://schemas.microsoft.com/office/drawing/2015/9/8/chartex" xmlns:cx2="http://schemas.microsoft.com/office/drawing/2015/10/21/chartex" xmlns:cx3="http://schemas.microsoft.com/office/drawing/2016/5/9/chartex" xmlns:cx4="http://schemas.microsoft.com/office/drawing/2016/5/10/chartex" xmlns:cx5="http://schemas.microsoft.com/office/drawing/2016/5/11/chartex" xmlns:cx6="http://schemas.microsoft.com/office/drawing/2016/5/12/chartex" xmlns:cx7="http://schemas.microsoft.com/office/drawing/2016/5/13/chartex" xmlns:cx8="http://schemas.microsoft.com/office/drawing/2016/5/14/chartex" xmlns:mc="http://schemas.openxmlformats.org/markup-compatibility/2006" xmlns:aink="http://schemas.microsoft.com/office/drawing/2016/ink" xmlns:am3d="http://schemas.microsoft.com/office/drawing/2017/model3d" xmlns:o="urn:schemas-microsoft-com:office:office" xmlns:r="http://schemas.openxmlformats.org/officeDocument/2006/relationships" xmlns:m="http://schemas.openxmlformats.org/officeDocument/2006/math" xmlns:v="urn:schemas-microsoft-com:vml" xmlns:wp14="http://schemas.microsoft.com/office/word/2010/wordprocessingDrawing" xmlns:wp="http://schemas.openxmlformats.org/drawingml/2006/wordprocessingDrawing" xmlns:w10="urn:schemas-microsoft-com:office:word" xmlns:w="http://schemas.openxmlformats.org/wordprocessingml/2006/main" xmlns:w14="http://schemas.microsoft.com/office/word/2010/wordml" xmlns:w15="http://schemas.microsoft.com/office/word/2012/wordml" xmlns:w16cex="http://schemas.microsoft.com/office/word/2018/wordml/cex" xmlns:w16cid="http://schemas.microsoft.com/office/word/2016/wordml/cid" xmlns:w16="http://schemas.microsoft.com/office/word/2018/wordml" xmlns:w16sdtdh="http://schemas.microsoft.com/office/word/2020/wordml/sdtdatahash" xmlns:w16se="http://schemas.microsoft.com/office/word/2015/wordml/symex" xmlns:wpg="http://schemas.microsoft.com/office/word/2010/wordprocessingGroup" xmlns:wpi="http://schemas.microsoft.com/office/word/2010/wordprocessingInk" xmlns:wne="http://schemas.microsoft.com/office/word/2006/wordml" xmlns:wps="http://schemas.microsoft.com/office/word/2010/wordprocessingShape" mc:Ignorable="w14 w15 w16se w16cid w16 w16cex w16sdtdh wp14">
   <w:body>
     <w:sdt>
       <w:sdtPr>
@@ -160,6 +160,7 @@
             <w:dataBinding w:prefixMappings="xmlns:ns0='http://purl.org/dc/elements/1.1/' xmlns:ns1='http://schemas.openxmlformats.org/package/2006/metadata/core-properties' " w:xpath="/ns1:coreProperties[1]/ns0:subject[1]" w:storeItemID="{6C3C8BC8-F283-45AE-878A-BAB7291924A1}"/>
             <w:text/>
           </w:sdtPr>
+          <w:sdtEndPr/>
           <w:sdtContent>
             <w:p>
               <w:pPr>
@@ -1408,15 +1409,7 @@
       </w:r>
       <w:r>
         <w:lastRenderedPageBreak/>
-        <w:t xml:space="preserve">to manage and update their account details, </w:t>
-      </w:r>
-      <w:proofErr w:type="gramStart"/>
-      <w:r>
-        <w:t>in order to</w:t>
-      </w:r>
-      <w:proofErr w:type="gramEnd"/>
-      <w:r>
-        <w:t xml:space="preserve"> make their information successfully up to date. They also appreciate the ability to find their past purchases and reorder items that they liked, and without these functionalities they may feel frustrated or disappointed. This could lead to </w:t>
+        <w:t xml:space="preserve">to manage and update their account details, in order to make their information successfully up to date. They also appreciate the ability to find their past purchases and reorder items that they liked, and without these functionalities they may feel frustrated or disappointed. This could lead to </w:t>
       </w:r>
       <w:r>
         <w:t xml:space="preserve">a loss of customer trust and loyalty, which can result in negative reviews, less sales and even giving competitors with these features an advantage. By allowing customers to manage their accounts and track their orders easily, the digital solution will offer a more personalised and efficient user experience. </w:t>
@@ -1489,15 +1482,7 @@
         <w:t xml:space="preserve">The client wants the solution to include a producer dashboard that makes producers able to manage their stock levels, update product detail and view orders. A professional, industry standard solution should allow producers to efficiently update their available products and quantities. Without this valuable functionality, stock information may have a higher chance of becoming inaccurate or outdated, this could eventually lead to customers ordering products that </w:t>
       </w:r>
       <w:r>
-        <w:t xml:space="preserve">are </w:t>
-      </w:r>
-      <w:proofErr w:type="gramStart"/>
-      <w:r>
-        <w:t>in reality not</w:t>
-      </w:r>
-      <w:proofErr w:type="gramEnd"/>
-      <w:r>
-        <w:t xml:space="preserve"> available. This will cause frustration and trouble keeping things running smoothly. By providing a producer management dashboard personalised for each producer, updating the stock, prices, and product details would be easy and more efficient for producers. This will </w:t>
+        <w:t xml:space="preserve">are in reality not available. This will cause frustration and trouble keeping things running smoothly. By providing a producer management dashboard personalised for each producer, updating the stock, prices, and product details would be easy and more efficient for producers. This will </w:t>
       </w:r>
       <w:r>
         <w:t xml:space="preserve">contribute to accurate listings, and a maintained reliable shopping experience for customers. </w:t>
@@ -2002,15 +1987,7 @@
         <w:t>U</w:t>
       </w:r>
       <w:r>
-        <w:t xml:space="preserve">nfortunately, she has weak </w:t>
-      </w:r>
-      <w:proofErr w:type="gramStart"/>
-      <w:r>
-        <w:t>vision</w:t>
-      </w:r>
-      <w:proofErr w:type="gramEnd"/>
-      <w:r>
-        <w:t xml:space="preserve"> so she needs clear</w:t>
+        <w:t>nfortunately, she has weak vision so she needs clear</w:t>
       </w:r>
       <w:r>
         <w:t>,</w:t>
@@ -2587,16 +2564,11 @@
               <w:lastRenderedPageBreak/>
               <w:t xml:space="preserve">Having an account for Merinda is </w:t>
             </w:r>
-            <w:proofErr w:type="gramStart"/>
             <w:r>
               <w:t xml:space="preserve">necessary,  </w:t>
             </w:r>
             <w:r>
-              <w:t xml:space="preserve"> </w:t>
-            </w:r>
-            <w:proofErr w:type="gramEnd"/>
-            <w:r>
-              <w:t xml:space="preserve">           </w:t>
+              <w:t xml:space="preserve">            </w:t>
             </w:r>
           </w:p>
         </w:tc>
@@ -4231,15 +4203,7 @@
           </w:tcPr>
           <w:p>
             <w:r>
-              <w:t xml:space="preserve">The solution must have consistent low latency speed, </w:t>
-            </w:r>
-            <w:proofErr w:type="gramStart"/>
-            <w:r>
-              <w:t>in order for</w:t>
-            </w:r>
-            <w:proofErr w:type="gramEnd"/>
-            <w:r>
-              <w:t xml:space="preserve"> the users to have a seamless experience without any frustration. </w:t>
+              <w:t xml:space="preserve">The solution must have consistent low latency speed, in order for the users to have a seamless experience without any frustration. </w:t>
             </w:r>
             <w:r>
               <w:t>The digital solution should maintain fast service especially for simple activities.</w:t>
@@ -5268,7 +5232,7 @@
           </w:tcPr>
           <w:p>
             <w:r>
-              <w:t>User account capacity</w:t>
+              <w:t>Multi user capacity</w:t>
             </w:r>
           </w:p>
         </w:tc>
@@ -5290,7 +5254,11 @@
           <w:tcPr>
             <w:tcW w:w="3005" w:type="dxa"/>
           </w:tcPr>
-          <w:p/>
+          <w:p>
+            <w:r>
+              <w:t>Concurrency</w:t>
+            </w:r>
+          </w:p>
         </w:tc>
         <w:tc>
           <w:tcPr>
@@ -5310,7 +5278,11 @@
           <w:tcPr>
             <w:tcW w:w="3005" w:type="dxa"/>
           </w:tcPr>
-          <w:p/>
+          <w:p>
+            <w:r>
+              <w:t>Responsiveness</w:t>
+            </w:r>
+          </w:p>
         </w:tc>
         <w:tc>
           <w:tcPr>
@@ -5330,7 +5302,11 @@
           <w:tcPr>
             <w:tcW w:w="3005" w:type="dxa"/>
           </w:tcPr>
-          <w:p/>
+          <w:p>
+            <w:r>
+              <w:t>Data capacity</w:t>
+            </w:r>
+          </w:p>
         </w:tc>
         <w:tc>
           <w:tcPr>
@@ -5438,7 +5414,11 @@
           <w:tcPr>
             <w:tcW w:w="3005" w:type="dxa"/>
           </w:tcPr>
-          <w:p/>
+          <w:p>
+            <w:r>
+              <w:t>Error handling</w:t>
+            </w:r>
+          </w:p>
         </w:tc>
         <w:tc>
           <w:tcPr>
@@ -5458,7 +5438,11 @@
           <w:tcPr>
             <w:tcW w:w="3005" w:type="dxa"/>
           </w:tcPr>
-          <w:p/>
+          <w:p>
+            <w:r>
+              <w:t>System recovery</w:t>
+            </w:r>
+          </w:p>
         </w:tc>
         <w:tc>
           <w:tcPr>
@@ -5478,7 +5462,35 @@
           <w:tcPr>
             <w:tcW w:w="3005" w:type="dxa"/>
           </w:tcPr>
+          <w:p>
+            <w:r>
+              <w:t>Backups</w:t>
+            </w:r>
+          </w:p>
+        </w:tc>
+        <w:tc>
+          <w:tcPr>
+            <w:tcW w:w="3005" w:type="dxa"/>
+          </w:tcPr>
           <w:p/>
+        </w:tc>
+        <w:tc>
+          <w:tcPr>
+            <w:tcW w:w="3006" w:type="dxa"/>
+          </w:tcPr>
+          <w:p/>
+        </w:tc>
+      </w:tr>
+      <w:tr>
+        <w:tc>
+          <w:tcPr>
+            <w:tcW w:w="3005" w:type="dxa"/>
+          </w:tcPr>
+          <w:p>
+            <w:r>
+              <w:t>Order accuracy</w:t>
+            </w:r>
+          </w:p>
         </w:tc>
         <w:tc>
           <w:tcPr>
@@ -5548,6 +5560,7 @@
                 <w:b/>
                 <w:bCs/>
               </w:rPr>
+              <w:lastRenderedPageBreak/>
               <w:t>Non-Functional Requirement</w:t>
             </w:r>
           </w:p>
@@ -5586,7 +5599,11 @@
           <w:tcPr>
             <w:tcW w:w="3005" w:type="dxa"/>
           </w:tcPr>
-          <w:p/>
+          <w:p>
+            <w:r>
+              <w:t>Mobile responsiveness</w:t>
+            </w:r>
+          </w:p>
         </w:tc>
         <w:tc>
           <w:tcPr>
@@ -5606,7 +5623,11 @@
           <w:tcPr>
             <w:tcW w:w="3005" w:type="dxa"/>
           </w:tcPr>
-          <w:p/>
+          <w:p>
+            <w:r>
+              <w:t>Consistent layout</w:t>
+            </w:r>
+          </w:p>
         </w:tc>
         <w:tc>
           <w:tcPr>
@@ -5626,7 +5647,35 @@
           <w:tcPr>
             <w:tcW w:w="3005" w:type="dxa"/>
           </w:tcPr>
+          <w:p>
+            <w:r>
+              <w:t>Efficient tasks</w:t>
+            </w:r>
+          </w:p>
+        </w:tc>
+        <w:tc>
+          <w:tcPr>
+            <w:tcW w:w="3005" w:type="dxa"/>
+          </w:tcPr>
           <w:p/>
+        </w:tc>
+        <w:tc>
+          <w:tcPr>
+            <w:tcW w:w="3006" w:type="dxa"/>
+          </w:tcPr>
+          <w:p/>
+        </w:tc>
+      </w:tr>
+      <w:tr>
+        <w:tc>
+          <w:tcPr>
+            <w:tcW w:w="3005" w:type="dxa"/>
+          </w:tcPr>
+          <w:p>
+            <w:r>
+              <w:t>Intuitive navigation</w:t>
+            </w:r>
+          </w:p>
         </w:tc>
         <w:tc>
           <w:tcPr>
@@ -5935,19 +5984,11 @@
           <w:rFonts w:ascii="Calibri" w:hAnsi="Calibri" w:cs="Calibri"/>
         </w:rPr>
       </w:pPr>
-      <w:proofErr w:type="gramStart"/>
       <w:r>
         <w:rPr>
           <w:rFonts w:ascii="Calibri" w:hAnsi="Calibri" w:cs="Calibri"/>
         </w:rPr>
-        <w:t>First of all</w:t>
-      </w:r>
-      <w:proofErr w:type="gramEnd"/>
-      <w:r>
-        <w:rPr>
-          <w:rFonts w:ascii="Calibri" w:hAnsi="Calibri" w:cs="Calibri"/>
-        </w:rPr>
-        <w:t>, the colour scheme I am planning to use is clean, industry standard and is connected to nature. The main colours I am using are white/cream,</w:t>
+        <w:t>First of all, the colour scheme I am planning to use is clean, industry standard and is connected to nature. The main colours I am using are white/cream,</w:t>
       </w:r>
       <w:r>
         <w:rPr>
@@ -5971,7 +6012,14 @@
         <w:rPr>
           <w:rFonts w:ascii="Calibri" w:hAnsi="Calibri" w:cs="Calibri"/>
         </w:rPr>
-        <w:t xml:space="preserve"> The dark green I am planning to use will add a sense of freshness, and a connection to organic, high-quality products. It will be mainly used on key elements to draw the users-attention </w:t>
+        <w:t xml:space="preserve"> The dark green I am planning to use will add a </w:t>
+      </w:r>
+      <w:r>
+        <w:rPr>
+          <w:rFonts w:ascii="Calibri" w:hAnsi="Calibri" w:cs="Calibri"/>
+        </w:rPr>
+        <w:lastRenderedPageBreak/>
+        <w:t xml:space="preserve">sense of freshness, and a connection to organic, high-quality products. It will be mainly used on key elements to draw the users-attention </w:t>
       </w:r>
       <w:r>
         <w:rPr>
@@ -5989,14 +6037,7 @@
         <w:rPr>
           <w:rFonts w:ascii="Calibri" w:hAnsi="Calibri" w:cs="Calibri"/>
         </w:rPr>
-        <w:t xml:space="preserve"> it will guide the users through the ordering process. The dark greens hex </w:t>
-      </w:r>
-      <w:r>
-        <w:rPr>
-          <w:rFonts w:ascii="Calibri" w:hAnsi="Calibri" w:cs="Calibri"/>
-        </w:rPr>
-        <w:lastRenderedPageBreak/>
-        <w:t>code I am planning to use is this</w:t>
+        <w:t xml:space="preserve"> it will guide the users through the ordering process. The dark greens hex code I am planning to use is this</w:t>
       </w:r>
       <w:r>
         <w:rPr>
@@ -6925,7 +6966,11 @@
               <w:t xml:space="preserve"> collected </w:t>
             </w:r>
             <w:r>
-              <w:t>lawfully and</w:t>
+              <w:t xml:space="preserve">lawfully </w:t>
+            </w:r>
+            <w:r>
+              <w:lastRenderedPageBreak/>
+              <w:t>and</w:t>
             </w:r>
             <w:r>
               <w:t xml:space="preserve"> only used for its intended purpose only. Greenfield Local Hub must </w:t>
@@ -6937,11 +6982,7 @@
               <w:t xml:space="preserve"> their customers how their data is </w:t>
             </w:r>
             <w:r>
-              <w:t xml:space="preserve">used with a clear privacy policy. Failing to comply with these regulations could lead to data </w:t>
-            </w:r>
-            <w:r>
-              <w:lastRenderedPageBreak/>
-              <w:t xml:space="preserve">breaches, loss of customer trust, reputational loss and legal consequences. </w:t>
+              <w:t xml:space="preserve">used with a clear privacy policy. Failing to comply with these regulations could lead to data breaches, loss of customer trust, reputational loss and legal consequences. </w:t>
             </w:r>
           </w:p>
         </w:tc>
@@ -7037,32 +7078,17 @@
             <w:r>
               <w:t xml:space="preserve"> </w:t>
             </w:r>
-            <w:proofErr w:type="gramStart"/>
             <w:r>
               <w:t>are</w:t>
             </w:r>
-            <w:proofErr w:type="gramEnd"/>
-            <w:r>
-              <w:t xml:space="preserve"> responsible for when businesses </w:t>
-            </w:r>
-            <w:proofErr w:type="gramStart"/>
-            <w:r>
-              <w:t>want</w:t>
+            <w:r>
+              <w:t xml:space="preserve"> responsible for when businesses want</w:t>
             </w:r>
             <w:r>
               <w:t>s</w:t>
             </w:r>
-            <w:proofErr w:type="gramEnd"/>
-            <w:r>
-              <w:t xml:space="preserve"> to promote or sell their products, it makes sure that they will not use deceptive or misleading methods to get their products sold. Therefore, the solution must ensure that all product descriptions, prices, availability information, and special offers, must be accurate and true. </w:t>
-            </w:r>
-            <w:proofErr w:type="gramStart"/>
-            <w:r>
-              <w:t>In order to</w:t>
-            </w:r>
-            <w:proofErr w:type="gramEnd"/>
-            <w:r>
-              <w:t xml:space="preserve"> protect customers and maintain Greenfield Local Hubs credibility, the marketing and product information must be honest and transparent.</w:t>
+            <w:r>
+              <w:t xml:space="preserve"> to promote or sell their products, it makes sure that they will not use deceptive or misleading methods to get their products sold. Therefore, the solution must ensure that all product descriptions, prices, availability information, and special offers, must be accurate and true. In order to protect customers and maintain Greenfield Local Hubs credibility, the marketing and product information must be honest and transparent.</w:t>
             </w:r>
           </w:p>
         </w:tc>
@@ -7140,21 +7166,17 @@
               <w:t>es</w:t>
             </w:r>
             <w:r>
-              <w:t xml:space="preserve"> to make sure that people with disabilities can access services successfully. </w:t>
-            </w:r>
-            <w:proofErr w:type="gramStart"/>
-            <w:r>
-              <w:t>In order for</w:t>
-            </w:r>
-            <w:proofErr w:type="gramEnd"/>
-            <w:r>
-              <w:t xml:space="preserve"> business to meet this they must follow the accessibility guidelines such as Web Content Accessibility Guidelines (WCAG). </w:t>
+              <w:t xml:space="preserve"> to make sure that people with disabilities can access services successfully. In order for business to meet this they must follow the accessibility guidelines such as Web Content Accessibility Guidelines (WCAG). </w:t>
             </w:r>
             <w:r>
               <w:t>Features that help make sure that all users can access and use the solution effectively are readable text, clear navigation and compatibility with screen readers. Including accessibility features will support inclusivity and makes sure that the business does not unintentionally exclude certain users.</w:t>
             </w:r>
             <w:r>
-              <w:t xml:space="preserve"> The solution will include high contrast mode, dark mode, text size increase/decrease to ensure readability. The solution will also be compatible with screen readers and included as an accessibility feature. </w:t>
+              <w:t xml:space="preserve"> The solution will include high contrast mode, dark mode, text size increase/decrease to ensure readability. The solution </w:t>
+            </w:r>
+            <w:r>
+              <w:lastRenderedPageBreak/>
+              <w:t xml:space="preserve">will also be compatible with screen readers and included as an accessibility feature. </w:t>
             </w:r>
           </w:p>
         </w:tc>
@@ -7228,18 +7250,10 @@
           </w:tcPr>
           <w:p>
             <w:r>
-              <w:t xml:space="preserve">Greenfield Local Hub will comply with the Food Information </w:t>
-            </w:r>
-            <w:proofErr w:type="gramStart"/>
-            <w:r>
-              <w:t>Regulations</w:t>
-            </w:r>
-            <w:r>
-              <w:t>,</w:t>
-            </w:r>
-            <w:proofErr w:type="gramEnd"/>
-            <w:r>
-              <w:t xml:space="preserve"> t</w:t>
+              <w:t>Greenfield Local Hub will comply with the Food Information Regulations</w:t>
+            </w:r>
+            <w:r>
+              <w:t>, t</w:t>
             </w:r>
             <w:r>
               <w:t>his means the solution will</w:t>
@@ -7310,7 +7324,7 @@
 </file>
 
 <file path=word/endnotes.xml><?xml version="1.0" encoding="utf-8"?>
-<w:endnotes xmlns:wpc="http://schemas.microsoft.com/office/word/2010/wordprocessingCanvas" xmlns:cx="http://schemas.microsoft.com/office/drawing/2014/chartex" xmlns:cx1="http://schemas.microsoft.com/office/drawing/2015/9/8/chartex" xmlns:cx2="http://schemas.microsoft.com/office/drawing/2015/10/21/chartex" xmlns:cx3="http://schemas.microsoft.com/office/drawing/2016/5/9/chartex" xmlns:cx4="http://schemas.microsoft.com/office/drawing/2016/5/10/chartex" xmlns:cx5="http://schemas.microsoft.com/office/drawing/2016/5/11/chartex" xmlns:cx6="http://schemas.microsoft.com/office/drawing/2016/5/12/chartex" xmlns:cx7="http://schemas.microsoft.com/office/drawing/2016/5/13/chartex" xmlns:cx8="http://schemas.microsoft.com/office/drawing/2016/5/14/chartex" xmlns:mc="http://schemas.openxmlformats.org/markup-compatibility/2006" xmlns:aink="http://schemas.microsoft.com/office/drawing/2016/ink" xmlns:am3d="http://schemas.microsoft.com/office/drawing/2017/model3d" xmlns:o="urn:schemas-microsoft-com:office:office" xmlns:oel="http://schemas.microsoft.com/office/2019/extlst" xmlns:r="http://schemas.openxmlformats.org/officeDocument/2006/relationships" xmlns:m="http://schemas.openxmlformats.org/officeDocument/2006/math" xmlns:v="urn:schemas-microsoft-com:vml" xmlns:wp14="http://schemas.microsoft.com/office/word/2010/wordprocessingDrawing" xmlns:wp="http://schemas.openxmlformats.org/drawingml/2006/wordprocessingDrawing" xmlns:w10="urn:schemas-microsoft-com:office:word" xmlns:w="http://schemas.openxmlformats.org/wordprocessingml/2006/main" xmlns:w14="http://schemas.microsoft.com/office/word/2010/wordml" xmlns:w15="http://schemas.microsoft.com/office/word/2012/wordml" xmlns:w16cex="http://schemas.microsoft.com/office/word/2018/wordml/cex" xmlns:w16cid="http://schemas.microsoft.com/office/word/2016/wordml/cid" xmlns:w16="http://schemas.microsoft.com/office/word/2018/wordml" xmlns:w16du="http://schemas.microsoft.com/office/word/2023/wordml/word16du" xmlns:w16sdtdh="http://schemas.microsoft.com/office/word/2020/wordml/sdtdatahash" xmlns:w16sdtfl="http://schemas.microsoft.com/office/word/2024/wordml/sdtformatlock" xmlns:w16se="http://schemas.microsoft.com/office/word/2015/wordml/symex" xmlns:wpg="http://schemas.microsoft.com/office/word/2010/wordprocessingGroup" xmlns:wpi="http://schemas.microsoft.com/office/word/2010/wordprocessingInk" xmlns:wne="http://schemas.microsoft.com/office/word/2006/wordml" xmlns:wps="http://schemas.microsoft.com/office/word/2010/wordprocessingShape" mc:Ignorable="w14 w15 w16se w16cid w16 w16cex w16sdtdh w16sdtfl w16du wp14">
+<w:endnotes xmlns:wpc="http://schemas.microsoft.com/office/word/2010/wordprocessingCanvas" xmlns:cx="http://schemas.microsoft.com/office/drawing/2014/chartex" xmlns:cx1="http://schemas.microsoft.com/office/drawing/2015/9/8/chartex" xmlns:cx2="http://schemas.microsoft.com/office/drawing/2015/10/21/chartex" xmlns:cx3="http://schemas.microsoft.com/office/drawing/2016/5/9/chartex" xmlns:cx4="http://schemas.microsoft.com/office/drawing/2016/5/10/chartex" xmlns:cx5="http://schemas.microsoft.com/office/drawing/2016/5/11/chartex" xmlns:cx6="http://schemas.microsoft.com/office/drawing/2016/5/12/chartex" xmlns:cx7="http://schemas.microsoft.com/office/drawing/2016/5/13/chartex" xmlns:cx8="http://schemas.microsoft.com/office/drawing/2016/5/14/chartex" xmlns:mc="http://schemas.openxmlformats.org/markup-compatibility/2006" xmlns:aink="http://schemas.microsoft.com/office/drawing/2016/ink" xmlns:am3d="http://schemas.microsoft.com/office/drawing/2017/model3d" xmlns:o="urn:schemas-microsoft-com:office:office" xmlns:r="http://schemas.openxmlformats.org/officeDocument/2006/relationships" xmlns:m="http://schemas.openxmlformats.org/officeDocument/2006/math" xmlns:v="urn:schemas-microsoft-com:vml" xmlns:wp14="http://schemas.microsoft.com/office/word/2010/wordprocessingDrawing" xmlns:wp="http://schemas.openxmlformats.org/drawingml/2006/wordprocessingDrawing" xmlns:w10="urn:schemas-microsoft-com:office:word" xmlns:w="http://schemas.openxmlformats.org/wordprocessingml/2006/main" xmlns:w14="http://schemas.microsoft.com/office/word/2010/wordml" xmlns:w15="http://schemas.microsoft.com/office/word/2012/wordml" xmlns:w16cex="http://schemas.microsoft.com/office/word/2018/wordml/cex" xmlns:w16cid="http://schemas.microsoft.com/office/word/2016/wordml/cid" xmlns:w16="http://schemas.microsoft.com/office/word/2018/wordml" xmlns:w16sdtdh="http://schemas.microsoft.com/office/word/2020/wordml/sdtdatahash" xmlns:w16se="http://schemas.microsoft.com/office/word/2015/wordml/symex" xmlns:wpg="http://schemas.microsoft.com/office/word/2010/wordprocessingGroup" xmlns:wpi="http://schemas.microsoft.com/office/word/2010/wordprocessingInk" xmlns:wne="http://schemas.microsoft.com/office/word/2006/wordml" xmlns:wps="http://schemas.microsoft.com/office/word/2010/wordprocessingShape" mc:Ignorable="w14 w15 w16se w16cid w16 w16cex w16sdtdh wp14">
   <w:endnote w:type="separator" w:id="-1">
     <w:p>
       <w:pPr>
@@ -7335,7 +7349,7 @@
 </file>
 
 <file path=word/footnotes.xml><?xml version="1.0" encoding="utf-8"?>
-<w:footnotes xmlns:wpc="http://schemas.microsoft.com/office/word/2010/wordprocessingCanvas" xmlns:cx="http://schemas.microsoft.com/office/drawing/2014/chartex" xmlns:cx1="http://schemas.microsoft.com/office/drawing/2015/9/8/chartex" xmlns:cx2="http://schemas.microsoft.com/office/drawing/2015/10/21/chartex" xmlns:cx3="http://schemas.microsoft.com/office/drawing/2016/5/9/chartex" xmlns:cx4="http://schemas.microsoft.com/office/drawing/2016/5/10/chartex" xmlns:cx5="http://schemas.microsoft.com/office/drawing/2016/5/11/chartex" xmlns:cx6="http://schemas.microsoft.com/office/drawing/2016/5/12/chartex" xmlns:cx7="http://schemas.microsoft.com/office/drawing/2016/5/13/chartex" xmlns:cx8="http://schemas.microsoft.com/office/drawing/2016/5/14/chartex" xmlns:mc="http://schemas.openxmlformats.org/markup-compatibility/2006" xmlns:aink="http://schemas.microsoft.com/office/drawing/2016/ink" xmlns:am3d="http://schemas.microsoft.com/office/drawing/2017/model3d" xmlns:o="urn:schemas-microsoft-com:office:office" xmlns:oel="http://schemas.microsoft.com/office/2019/extlst" xmlns:r="http://schemas.openxmlformats.org/officeDocument/2006/relationships" xmlns:m="http://schemas.openxmlformats.org/officeDocument/2006/math" xmlns:v="urn:schemas-microsoft-com:vml" xmlns:wp14="http://schemas.microsoft.com/office/word/2010/wordprocessingDrawing" xmlns:wp="http://schemas.openxmlformats.org/drawingml/2006/wordprocessingDrawing" xmlns:w10="urn:schemas-microsoft-com:office:word" xmlns:w="http://schemas.openxmlformats.org/wordprocessingml/2006/main" xmlns:w14="http://schemas.microsoft.com/office/word/2010/wordml" xmlns:w15="http://schemas.microsoft.com/office/word/2012/wordml" xmlns:w16cex="http://schemas.microsoft.com/office/word/2018/wordml/cex" xmlns:w16cid="http://schemas.microsoft.com/office/word/2016/wordml/cid" xmlns:w16="http://schemas.microsoft.com/office/word/2018/wordml" xmlns:w16du="http://schemas.microsoft.com/office/word/2023/wordml/word16du" xmlns:w16sdtdh="http://schemas.microsoft.com/office/word/2020/wordml/sdtdatahash" xmlns:w16sdtfl="http://schemas.microsoft.com/office/word/2024/wordml/sdtformatlock" xmlns:w16se="http://schemas.microsoft.com/office/word/2015/wordml/symex" xmlns:wpg="http://schemas.microsoft.com/office/word/2010/wordprocessingGroup" xmlns:wpi="http://schemas.microsoft.com/office/word/2010/wordprocessingInk" xmlns:wne="http://schemas.microsoft.com/office/word/2006/wordml" xmlns:wps="http://schemas.microsoft.com/office/word/2010/wordprocessingShape" mc:Ignorable="w14 w15 w16se w16cid w16 w16cex w16sdtdh w16sdtfl w16du wp14">
+<w:footnotes xmlns:wpc="http://schemas.microsoft.com/office/word/2010/wordprocessingCanvas" xmlns:cx="http://schemas.microsoft.com/office/drawing/2014/chartex" xmlns:cx1="http://schemas.microsoft.com/office/drawing/2015/9/8/chartex" xmlns:cx2="http://schemas.microsoft.com/office/drawing/2015/10/21/chartex" xmlns:cx3="http://schemas.microsoft.com/office/drawing/2016/5/9/chartex" xmlns:cx4="http://schemas.microsoft.com/office/drawing/2016/5/10/chartex" xmlns:cx5="http://schemas.microsoft.com/office/drawing/2016/5/11/chartex" xmlns:cx6="http://schemas.microsoft.com/office/drawing/2016/5/12/chartex" xmlns:cx7="http://schemas.microsoft.com/office/drawing/2016/5/13/chartex" xmlns:cx8="http://schemas.microsoft.com/office/drawing/2016/5/14/chartex" xmlns:mc="http://schemas.openxmlformats.org/markup-compatibility/2006" xmlns:aink="http://schemas.microsoft.com/office/drawing/2016/ink" xmlns:am3d="http://schemas.microsoft.com/office/drawing/2017/model3d" xmlns:o="urn:schemas-microsoft-com:office:office" xmlns:r="http://schemas.openxmlformats.org/officeDocument/2006/relationships" xmlns:m="http://schemas.openxmlformats.org/officeDocument/2006/math" xmlns:v="urn:schemas-microsoft-com:vml" xmlns:wp14="http://schemas.microsoft.com/office/word/2010/wordprocessingDrawing" xmlns:wp="http://schemas.openxmlformats.org/drawingml/2006/wordprocessingDrawing" xmlns:w10="urn:schemas-microsoft-com:office:word" xmlns:w="http://schemas.openxmlformats.org/wordprocessingml/2006/main" xmlns:w14="http://schemas.microsoft.com/office/word/2010/wordml" xmlns:w15="http://schemas.microsoft.com/office/word/2012/wordml" xmlns:w16cex="http://schemas.microsoft.com/office/word/2018/wordml/cex" xmlns:w16cid="http://schemas.microsoft.com/office/word/2016/wordml/cid" xmlns:w16="http://schemas.microsoft.com/office/word/2018/wordml" xmlns:w16sdtdh="http://schemas.microsoft.com/office/word/2020/wordml/sdtdatahash" xmlns:w16se="http://schemas.microsoft.com/office/word/2015/wordml/symex" xmlns:wpg="http://schemas.microsoft.com/office/word/2010/wordprocessingGroup" xmlns:wpi="http://schemas.microsoft.com/office/word/2010/wordprocessingInk" xmlns:wne="http://schemas.microsoft.com/office/word/2006/wordml" xmlns:wps="http://schemas.microsoft.com/office/word/2010/wordprocessingShape" mc:Ignorable="w14 w15 w16se w16cid w16 w16cex w16sdtdh wp14">
   <w:footnote w:type="separator" w:id="-1">
     <w:p>
       <w:pPr>
@@ -7360,7 +7374,7 @@
 </file>
 
 <file path=word/numbering.xml><?xml version="1.0" encoding="utf-8"?>
-<w:numbering xmlns:wpc="http://schemas.microsoft.com/office/word/2010/wordprocessingCanvas" xmlns:cx="http://schemas.microsoft.com/office/drawing/2014/chartex" xmlns:cx1="http://schemas.microsoft.com/office/drawing/2015/9/8/chartex" xmlns:cx2="http://schemas.microsoft.com/office/drawing/2015/10/21/chartex" xmlns:cx3="http://schemas.microsoft.com/office/drawing/2016/5/9/chartex" xmlns:cx4="http://schemas.microsoft.com/office/drawing/2016/5/10/chartex" xmlns:cx5="http://schemas.microsoft.com/office/drawing/2016/5/11/chartex" xmlns:cx6="http://schemas.microsoft.com/office/drawing/2016/5/12/chartex" xmlns:cx7="http://schemas.microsoft.com/office/drawing/2016/5/13/chartex" xmlns:cx8="http://schemas.microsoft.com/office/drawing/2016/5/14/chartex" xmlns:mc="http://schemas.openxmlformats.org/markup-compatibility/2006" xmlns:aink="http://schemas.microsoft.com/office/drawing/2016/ink" xmlns:am3d="http://schemas.microsoft.com/office/drawing/2017/model3d" xmlns:o="urn:schemas-microsoft-com:office:office" xmlns:oel="http://schemas.microsoft.com/office/2019/extlst" xmlns:r="http://schemas.openxmlformats.org/officeDocument/2006/relationships" xmlns:m="http://schemas.openxmlformats.org/officeDocument/2006/math" xmlns:v="urn:schemas-microsoft-com:vml" xmlns:wp14="http://schemas.microsoft.com/office/word/2010/wordprocessingDrawing" xmlns:wp="http://schemas.openxmlformats.org/drawingml/2006/wordprocessingDrawing" xmlns:w10="urn:schemas-microsoft-com:office:word" xmlns:w="http://schemas.openxmlformats.org/wordprocessingml/2006/main" xmlns:w14="http://schemas.microsoft.com/office/word/2010/wordml" xmlns:w15="http://schemas.microsoft.com/office/word/2012/wordml" xmlns:w16cex="http://schemas.microsoft.com/office/word/2018/wordml/cex" xmlns:w16cid="http://schemas.microsoft.com/office/word/2016/wordml/cid" xmlns:w16="http://schemas.microsoft.com/office/word/2018/wordml" xmlns:w16du="http://schemas.microsoft.com/office/word/2023/wordml/word16du" xmlns:w16sdtdh="http://schemas.microsoft.com/office/word/2020/wordml/sdtdatahash" xmlns:w16sdtfl="http://schemas.microsoft.com/office/word/2024/wordml/sdtformatlock" xmlns:w16se="http://schemas.microsoft.com/office/word/2015/wordml/symex" xmlns:wpg="http://schemas.microsoft.com/office/word/2010/wordprocessingGroup" xmlns:wpi="http://schemas.microsoft.com/office/word/2010/wordprocessingInk" xmlns:wne="http://schemas.microsoft.com/office/word/2006/wordml" xmlns:wps="http://schemas.microsoft.com/office/word/2010/wordprocessingShape" mc:Ignorable="w14 w15 w16se w16cid w16 w16cex w16sdtdh w16sdtfl w16du wp14">
+<w:numbering xmlns:wpc="http://schemas.microsoft.com/office/word/2010/wordprocessingCanvas" xmlns:cx="http://schemas.microsoft.com/office/drawing/2014/chartex" xmlns:cx1="http://schemas.microsoft.com/office/drawing/2015/9/8/chartex" xmlns:cx2="http://schemas.microsoft.com/office/drawing/2015/10/21/chartex" xmlns:cx3="http://schemas.microsoft.com/office/drawing/2016/5/9/chartex" xmlns:cx4="http://schemas.microsoft.com/office/drawing/2016/5/10/chartex" xmlns:cx5="http://schemas.microsoft.com/office/drawing/2016/5/11/chartex" xmlns:cx6="http://schemas.microsoft.com/office/drawing/2016/5/12/chartex" xmlns:cx7="http://schemas.microsoft.com/office/drawing/2016/5/13/chartex" xmlns:cx8="http://schemas.microsoft.com/office/drawing/2016/5/14/chartex" xmlns:mc="http://schemas.openxmlformats.org/markup-compatibility/2006" xmlns:aink="http://schemas.microsoft.com/office/drawing/2016/ink" xmlns:am3d="http://schemas.microsoft.com/office/drawing/2017/model3d" xmlns:o="urn:schemas-microsoft-com:office:office" xmlns:r="http://schemas.openxmlformats.org/officeDocument/2006/relationships" xmlns:m="http://schemas.openxmlformats.org/officeDocument/2006/math" xmlns:v="urn:schemas-microsoft-com:vml" xmlns:wp14="http://schemas.microsoft.com/office/word/2010/wordprocessingDrawing" xmlns:wp="http://schemas.openxmlformats.org/drawingml/2006/wordprocessingDrawing" xmlns:w10="urn:schemas-microsoft-com:office:word" xmlns:w="http://schemas.openxmlformats.org/wordprocessingml/2006/main" xmlns:w14="http://schemas.microsoft.com/office/word/2010/wordml" xmlns:w15="http://schemas.microsoft.com/office/word/2012/wordml" xmlns:w16cex="http://schemas.microsoft.com/office/word/2018/wordml/cex" xmlns:w16cid="http://schemas.microsoft.com/office/word/2016/wordml/cid" xmlns:w16="http://schemas.microsoft.com/office/word/2018/wordml" xmlns:w16sdtdh="http://schemas.microsoft.com/office/word/2020/wordml/sdtdatahash" xmlns:w16se="http://schemas.microsoft.com/office/word/2015/wordml/symex" xmlns:wpg="http://schemas.microsoft.com/office/word/2010/wordprocessingGroup" xmlns:wpi="http://schemas.microsoft.com/office/word/2010/wordprocessingInk" xmlns:wne="http://schemas.microsoft.com/office/word/2006/wordml" xmlns:wps="http://schemas.microsoft.com/office/word/2010/wordprocessingShape" mc:Ignorable="w14 w15 w16se w16cid w16 w16cex w16sdtdh wp14">
   <w:abstractNum w:abstractNumId="0" w15:restartNumberingAfterBreak="0">
     <w:nsid w:val="00000001"/>
     <w:multiLevelType w:val="hybridMultilevel"/>
@@ -9835,80 +9849,80 @@
       </w:rPr>
     </w:lvl>
   </w:abstractNum>
-  <w:num w:numId="1" w16cid:durableId="15544250">
+  <w:num w:numId="1">
     <w:abstractNumId w:val="19"/>
   </w:num>
-  <w:num w:numId="2" w16cid:durableId="240913415">
+  <w:num w:numId="2">
     <w:abstractNumId w:val="0"/>
   </w:num>
-  <w:num w:numId="3" w16cid:durableId="1554534537">
+  <w:num w:numId="3">
     <w:abstractNumId w:val="22"/>
   </w:num>
-  <w:num w:numId="4" w16cid:durableId="1461267549">
+  <w:num w:numId="4">
     <w:abstractNumId w:val="4"/>
   </w:num>
-  <w:num w:numId="5" w16cid:durableId="590628215">
+  <w:num w:numId="5">
     <w:abstractNumId w:val="17"/>
   </w:num>
-  <w:num w:numId="6" w16cid:durableId="458651924">
+  <w:num w:numId="6">
     <w:abstractNumId w:val="14"/>
   </w:num>
-  <w:num w:numId="7" w16cid:durableId="858740831">
+  <w:num w:numId="7">
     <w:abstractNumId w:val="18"/>
   </w:num>
-  <w:num w:numId="8" w16cid:durableId="1754546689">
+  <w:num w:numId="8">
     <w:abstractNumId w:val="6"/>
   </w:num>
-  <w:num w:numId="9" w16cid:durableId="1177428979">
+  <w:num w:numId="9">
     <w:abstractNumId w:val="3"/>
   </w:num>
-  <w:num w:numId="10" w16cid:durableId="1314335334">
+  <w:num w:numId="10">
     <w:abstractNumId w:val="21"/>
   </w:num>
-  <w:num w:numId="11" w16cid:durableId="2109276197">
+  <w:num w:numId="11">
     <w:abstractNumId w:val="9"/>
   </w:num>
-  <w:num w:numId="12" w16cid:durableId="807404261">
+  <w:num w:numId="12">
     <w:abstractNumId w:val="12"/>
   </w:num>
-  <w:num w:numId="13" w16cid:durableId="1100487879">
+  <w:num w:numId="13">
     <w:abstractNumId w:val="8"/>
   </w:num>
-  <w:num w:numId="14" w16cid:durableId="1797523282">
+  <w:num w:numId="14">
     <w:abstractNumId w:val="2"/>
   </w:num>
-  <w:num w:numId="15" w16cid:durableId="1567455624">
+  <w:num w:numId="15">
     <w:abstractNumId w:val="5"/>
   </w:num>
-  <w:num w:numId="16" w16cid:durableId="748384031">
+  <w:num w:numId="16">
     <w:abstractNumId w:val="15"/>
   </w:num>
-  <w:num w:numId="17" w16cid:durableId="1550535132">
+  <w:num w:numId="17">
     <w:abstractNumId w:val="11"/>
   </w:num>
-  <w:num w:numId="18" w16cid:durableId="1529879444">
+  <w:num w:numId="18">
     <w:abstractNumId w:val="13"/>
   </w:num>
-  <w:num w:numId="19" w16cid:durableId="176164602">
+  <w:num w:numId="19">
     <w:abstractNumId w:val="20"/>
   </w:num>
-  <w:num w:numId="20" w16cid:durableId="1987737104">
+  <w:num w:numId="20">
     <w:abstractNumId w:val="7"/>
   </w:num>
-  <w:num w:numId="21" w16cid:durableId="78020053">
+  <w:num w:numId="21">
     <w:abstractNumId w:val="10"/>
   </w:num>
-  <w:num w:numId="22" w16cid:durableId="755055647">
+  <w:num w:numId="22">
     <w:abstractNumId w:val="16"/>
   </w:num>
-  <w:num w:numId="23" w16cid:durableId="1610969929">
+  <w:num w:numId="23">
     <w:abstractNumId w:val="1"/>
   </w:num>
 </w:numbering>
 </file>
 
 <file path=word/styles.xml><?xml version="1.0" encoding="utf-8"?>
-<w:styles xmlns:mc="http://schemas.openxmlformats.org/markup-compatibility/2006" xmlns:r="http://schemas.openxmlformats.org/officeDocument/2006/relationships" xmlns:w="http://schemas.openxmlformats.org/wordprocessingml/2006/main" xmlns:w14="http://schemas.microsoft.com/office/word/2010/wordml" xmlns:w15="http://schemas.microsoft.com/office/word/2012/wordml" xmlns:w16cex="http://schemas.microsoft.com/office/word/2018/wordml/cex" xmlns:w16cid="http://schemas.microsoft.com/office/word/2016/wordml/cid" xmlns:w16="http://schemas.microsoft.com/office/word/2018/wordml" xmlns:w16du="http://schemas.microsoft.com/office/word/2023/wordml/word16du" xmlns:w16sdtdh="http://schemas.microsoft.com/office/word/2020/wordml/sdtdatahash" xmlns:w16sdtfl="http://schemas.microsoft.com/office/word/2024/wordml/sdtformatlock" xmlns:w16se="http://schemas.microsoft.com/office/word/2015/wordml/symex" mc:Ignorable="w14 w15 w16se w16cid w16 w16cex w16sdtdh w16sdtfl w16du">
+<w:styles xmlns:mc="http://schemas.openxmlformats.org/markup-compatibility/2006" xmlns:r="http://schemas.openxmlformats.org/officeDocument/2006/relationships" xmlns:w="http://schemas.openxmlformats.org/wordprocessingml/2006/main" xmlns:w14="http://schemas.microsoft.com/office/word/2010/wordml" xmlns:w15="http://schemas.microsoft.com/office/word/2012/wordml" xmlns:w16cex="http://schemas.microsoft.com/office/word/2018/wordml/cex" xmlns:w16cid="http://schemas.microsoft.com/office/word/2016/wordml/cid" xmlns:w16="http://schemas.microsoft.com/office/word/2018/wordml" xmlns:w16sdtdh="http://schemas.microsoft.com/office/word/2020/wordml/sdtdatahash" xmlns:w16se="http://schemas.microsoft.com/office/word/2015/wordml/symex" mc:Ignorable="w14 w15 w16se w16cid w16 w16cex w16sdtdh">
   <w:docDefaults>
     <w:rPrDefault>
       <w:rPr>
@@ -10634,7 +10648,7 @@
 </file>
 
 <file path=word/glossary/document.xml><?xml version="1.0" encoding="utf-8"?>
-<w:glossaryDocument xmlns:wpc="http://schemas.microsoft.com/office/word/2010/wordprocessingCanvas" xmlns:cx="http://schemas.microsoft.com/office/drawing/2014/chartex" xmlns:cx1="http://schemas.microsoft.com/office/drawing/2015/9/8/chartex" xmlns:cx2="http://schemas.microsoft.com/office/drawing/2015/10/21/chartex" xmlns:cx3="http://schemas.microsoft.com/office/drawing/2016/5/9/chartex" xmlns:cx4="http://schemas.microsoft.com/office/drawing/2016/5/10/chartex" xmlns:cx5="http://schemas.microsoft.com/office/drawing/2016/5/11/chartex" xmlns:cx6="http://schemas.microsoft.com/office/drawing/2016/5/12/chartex" xmlns:cx7="http://schemas.microsoft.com/office/drawing/2016/5/13/chartex" xmlns:cx8="http://schemas.microsoft.com/office/drawing/2016/5/14/chartex" xmlns:mc="http://schemas.openxmlformats.org/markup-compatibility/2006" xmlns:aink="http://schemas.microsoft.com/office/drawing/2016/ink" xmlns:am3d="http://schemas.microsoft.com/office/drawing/2017/model3d" xmlns:o="urn:schemas-microsoft-com:office:office" xmlns:oel="http://schemas.microsoft.com/office/2019/extlst" xmlns:r="http://schemas.openxmlformats.org/officeDocument/2006/relationships" xmlns:m="http://schemas.openxmlformats.org/officeDocument/2006/math" xmlns:v="urn:schemas-microsoft-com:vml" xmlns:wp14="http://schemas.microsoft.com/office/word/2010/wordprocessingDrawing" xmlns:wp="http://schemas.openxmlformats.org/drawingml/2006/wordprocessingDrawing" xmlns:w10="urn:schemas-microsoft-com:office:word" xmlns:w="http://schemas.openxmlformats.org/wordprocessingml/2006/main" xmlns:w14="http://schemas.microsoft.com/office/word/2010/wordml" xmlns:w15="http://schemas.microsoft.com/office/word/2012/wordml" xmlns:w16cex="http://schemas.microsoft.com/office/word/2018/wordml/cex" xmlns:w16cid="http://schemas.microsoft.com/office/word/2016/wordml/cid" xmlns:w16="http://schemas.microsoft.com/office/word/2018/wordml" xmlns:w16du="http://schemas.microsoft.com/office/word/2023/wordml/word16du" xmlns:w16sdtdh="http://schemas.microsoft.com/office/word/2020/wordml/sdtdatahash" xmlns:w16sdtfl="http://schemas.microsoft.com/office/word/2024/wordml/sdtformatlock" xmlns:w16se="http://schemas.microsoft.com/office/word/2015/wordml/symex" xmlns:wpg="http://schemas.microsoft.com/office/word/2010/wordprocessingGroup" xmlns:wpi="http://schemas.microsoft.com/office/word/2010/wordprocessingInk" xmlns:wne="http://schemas.microsoft.com/office/word/2006/wordml" xmlns:wps="http://schemas.microsoft.com/office/word/2010/wordprocessingShape" mc:Ignorable="w14 w15 w16se w16cid w16 w16cex w16sdtdh w16sdtfl w16du wp14">
+<w:glossaryDocument xmlns:wpc="http://schemas.microsoft.com/office/word/2010/wordprocessingCanvas" xmlns:cx="http://schemas.microsoft.com/office/drawing/2014/chartex" xmlns:cx1="http://schemas.microsoft.com/office/drawing/2015/9/8/chartex" xmlns:cx2="http://schemas.microsoft.com/office/drawing/2015/10/21/chartex" xmlns:cx3="http://schemas.microsoft.com/office/drawing/2016/5/9/chartex" xmlns:cx4="http://schemas.microsoft.com/office/drawing/2016/5/10/chartex" xmlns:cx5="http://schemas.microsoft.com/office/drawing/2016/5/11/chartex" xmlns:cx6="http://schemas.microsoft.com/office/drawing/2016/5/12/chartex" xmlns:cx7="http://schemas.microsoft.com/office/drawing/2016/5/13/chartex" xmlns:cx8="http://schemas.microsoft.com/office/drawing/2016/5/14/chartex" xmlns:mc="http://schemas.openxmlformats.org/markup-compatibility/2006" xmlns:aink="http://schemas.microsoft.com/office/drawing/2016/ink" xmlns:am3d="http://schemas.microsoft.com/office/drawing/2017/model3d" xmlns:o="urn:schemas-microsoft-com:office:office" xmlns:r="http://schemas.openxmlformats.org/officeDocument/2006/relationships" xmlns:m="http://schemas.openxmlformats.org/officeDocument/2006/math" xmlns:v="urn:schemas-microsoft-com:vml" xmlns:wp14="http://schemas.microsoft.com/office/word/2010/wordprocessingDrawing" xmlns:wp="http://schemas.openxmlformats.org/drawingml/2006/wordprocessingDrawing" xmlns:w10="urn:schemas-microsoft-com:office:word" xmlns:w="http://schemas.openxmlformats.org/wordprocessingml/2006/main" xmlns:w14="http://schemas.microsoft.com/office/word/2010/wordml" xmlns:w15="http://schemas.microsoft.com/office/word/2012/wordml" xmlns:w16cex="http://schemas.microsoft.com/office/word/2018/wordml/cex" xmlns:w16cid="http://schemas.microsoft.com/office/word/2016/wordml/cid" xmlns:w16="http://schemas.microsoft.com/office/word/2018/wordml" xmlns:w16sdtdh="http://schemas.microsoft.com/office/word/2020/wordml/sdtdatahash" xmlns:w16se="http://schemas.microsoft.com/office/word/2015/wordml/symex" xmlns:wpg="http://schemas.microsoft.com/office/word/2010/wordprocessingGroup" xmlns:wpi="http://schemas.microsoft.com/office/word/2010/wordprocessingInk" xmlns:wne="http://schemas.microsoft.com/office/word/2006/wordml" xmlns:wps="http://schemas.microsoft.com/office/word/2010/wordprocessingShape" mc:Ignorable="w14 w15 w16se w16cid w16 w16cex w16sdtdh wp14">
   <w:docParts>
     <w:docPart>
       <w:docPartPr>
@@ -10660,7 +10674,7 @@
             <w:rPr>
               <w:rFonts w:asciiTheme="majorHAnsi" w:eastAsiaTheme="majorEastAsia" w:hAnsiTheme="majorHAnsi" w:cstheme="majorBidi"/>
               <w:caps/>
-              <w:color w:val="156082" w:themeColor="accent1"/>
+              <w:color w:val="4472C4" w:themeColor="accent1"/>
               <w:sz w:val="80"/>
               <w:szCs w:val="80"/>
             </w:rPr>
@@ -10691,7 +10705,7 @@
           </w:pPr>
           <w:r>
             <w:rPr>
-              <w:color w:val="156082" w:themeColor="accent1"/>
+              <w:color w:val="4472C4" w:themeColor="accent1"/>
               <w:sz w:val="28"/>
               <w:szCs w:val="28"/>
             </w:rPr>
@@ -10705,7 +10719,7 @@
 </file>
 
 <file path=word/glossary/fontTable.xml><?xml version="1.0" encoding="utf-8"?>
-<w:fonts xmlns:mc="http://schemas.openxmlformats.org/markup-compatibility/2006" xmlns:r="http://schemas.openxmlformats.org/officeDocument/2006/relationships" xmlns:w="http://schemas.openxmlformats.org/wordprocessingml/2006/main" xmlns:w14="http://schemas.microsoft.com/office/word/2010/wordml" xmlns:w15="http://schemas.microsoft.com/office/word/2012/wordml" xmlns:w16cex="http://schemas.microsoft.com/office/word/2018/wordml/cex" xmlns:w16cid="http://schemas.microsoft.com/office/word/2016/wordml/cid" xmlns:w16="http://schemas.microsoft.com/office/word/2018/wordml" xmlns:w16du="http://schemas.microsoft.com/office/word/2023/wordml/word16du" xmlns:w16sdtdh="http://schemas.microsoft.com/office/word/2020/wordml/sdtdatahash" xmlns:w16sdtfl="http://schemas.microsoft.com/office/word/2024/wordml/sdtformatlock" xmlns:w16se="http://schemas.microsoft.com/office/word/2015/wordml/symex" mc:Ignorable="w14 w15 w16se w16cid w16 w16cex w16sdtdh w16sdtfl w16du">
+<w:fonts xmlns:mc="http://schemas.openxmlformats.org/markup-compatibility/2006" xmlns:r="http://schemas.openxmlformats.org/officeDocument/2006/relationships" xmlns:w="http://schemas.openxmlformats.org/wordprocessingml/2006/main" xmlns:w14="http://schemas.microsoft.com/office/word/2010/wordml" xmlns:w15="http://schemas.microsoft.com/office/word/2012/wordml" xmlns:w16cex="http://schemas.microsoft.com/office/word/2018/wordml/cex" xmlns:w16cid="http://schemas.microsoft.com/office/word/2016/wordml/cid" xmlns:w16="http://schemas.microsoft.com/office/word/2018/wordml" xmlns:w16sdtdh="http://schemas.microsoft.com/office/word/2020/wordml/sdtdatahash" xmlns:w16se="http://schemas.microsoft.com/office/word/2015/wordml/symex" mc:Ignorable="w14 w15 w16se w16cid w16 w16cex w16sdtdh">
   <w:font w:name="Symbol">
     <w:panose1 w:val="05050102010706020507"/>
     <w:charset w:val="02"/>
@@ -10718,7 +10732,7 @@
     <w:charset w:val="00"/>
     <w:family w:val="roman"/>
     <w:pitch w:val="variable"/>
-    <w:sig w:usb0="E0002EFF" w:usb1="C000785B" w:usb2="00000009" w:usb3="00000000" w:csb0="000001FF" w:csb1="00000000"/>
+    <w:sig w:usb0="E0002AFF" w:usb1="C0007841" w:usb2="00000009" w:usb3="00000000" w:csb0="000001FF" w:csb1="00000000"/>
   </w:font>
   <w:font w:name="Courier New">
     <w:panose1 w:val="02070309020205020404"/>
@@ -10739,39 +10753,27 @@
     <w:charset w:val="00"/>
     <w:family w:val="swiss"/>
     <w:pitch w:val="variable"/>
-    <w:sig w:usb0="E4002EFF" w:usb1="C200ACFF" w:usb2="00000009" w:usb3="00000000" w:csb0="000001FF" w:csb1="00000000"/>
+    <w:sig w:usb0="E0002AFF" w:usb1="4000ACFF" w:usb2="00000001" w:usb3="00000000" w:csb0="000001FF" w:csb1="00000000"/>
   </w:font>
   <w:font w:name="Arial">
     <w:panose1 w:val="020B0604020202020204"/>
     <w:charset w:val="00"/>
     <w:family w:val="swiss"/>
     <w:pitch w:val="variable"/>
-    <w:sig w:usb0="E0002EFF" w:usb1="C000785B" w:usb2="00000009" w:usb3="00000000" w:csb0="000001FF" w:csb1="00000000"/>
+    <w:sig w:usb0="E0002AFF" w:usb1="C0007843" w:usb2="00000009" w:usb3="00000000" w:csb0="000001FF" w:csb1="00000000"/>
   </w:font>
   <w:font w:name="Calibri Light">
     <w:panose1 w:val="020F0302020204030204"/>
     <w:charset w:val="00"/>
     <w:family w:val="swiss"/>
     <w:pitch w:val="variable"/>
-    <w:sig w:usb0="E4002EFF" w:usb1="C200247B" w:usb2="00000009" w:usb3="00000000" w:csb0="000001FF" w:csb1="00000000"/>
-  </w:font>
-  <w:font w:name="Aptos">
-    <w:charset w:val="00"/>
-    <w:family w:val="swiss"/>
-    <w:pitch w:val="variable"/>
-    <w:sig w:usb0="20000287" w:usb1="00000003" w:usb2="00000000" w:usb3="00000000" w:csb0="0000019F" w:csb1="00000000"/>
-  </w:font>
-  <w:font w:name="Aptos Display">
-    <w:charset w:val="00"/>
-    <w:family w:val="swiss"/>
-    <w:pitch w:val="variable"/>
-    <w:sig w:usb0="20000287" w:usb1="00000003" w:usb2="00000000" w:usb3="00000000" w:csb0="0000019F" w:csb1="00000000"/>
+    <w:sig w:usb0="A0002AEF" w:usb1="4000207B" w:usb2="00000000" w:usb3="00000000" w:csb0="000001FF" w:csb1="00000000"/>
   </w:font>
 </w:fonts>
 </file>
 
 <file path=word/glossary/settings.xml><?xml version="1.0" encoding="utf-8"?>
-<w:settings xmlns:mc="http://schemas.openxmlformats.org/markup-compatibility/2006" xmlns:o="urn:schemas-microsoft-com:office:office" xmlns:r="http://schemas.openxmlformats.org/officeDocument/2006/relationships" xmlns:m="http://schemas.openxmlformats.org/officeDocument/2006/math" xmlns:v="urn:schemas-microsoft-com:vml" xmlns:w10="urn:schemas-microsoft-com:office:word" xmlns:w="http://schemas.openxmlformats.org/wordprocessingml/2006/main" xmlns:w14="http://schemas.microsoft.com/office/word/2010/wordml" xmlns:w15="http://schemas.microsoft.com/office/word/2012/wordml" xmlns:w16cex="http://schemas.microsoft.com/office/word/2018/wordml/cex" xmlns:w16cid="http://schemas.microsoft.com/office/word/2016/wordml/cid" xmlns:w16="http://schemas.microsoft.com/office/word/2018/wordml" xmlns:w16du="http://schemas.microsoft.com/office/word/2023/wordml/word16du" xmlns:w16sdtdh="http://schemas.microsoft.com/office/word/2020/wordml/sdtdatahash" xmlns:w16sdtfl="http://schemas.microsoft.com/office/word/2024/wordml/sdtformatlock" xmlns:w16se="http://schemas.microsoft.com/office/word/2015/wordml/symex" xmlns:sl="http://schemas.openxmlformats.org/schemaLibrary/2006/main" mc:Ignorable="w14 w15 w16se w16cid w16 w16cex w16sdtdh w16sdtfl w16du">
+<w:settings xmlns:mc="http://schemas.openxmlformats.org/markup-compatibility/2006" xmlns:o="urn:schemas-microsoft-com:office:office" xmlns:r="http://schemas.openxmlformats.org/officeDocument/2006/relationships" xmlns:m="http://schemas.openxmlformats.org/officeDocument/2006/math" xmlns:v="urn:schemas-microsoft-com:vml" xmlns:w10="urn:schemas-microsoft-com:office:word" xmlns:w="http://schemas.openxmlformats.org/wordprocessingml/2006/main" xmlns:w14="http://schemas.microsoft.com/office/word/2010/wordml" xmlns:w15="http://schemas.microsoft.com/office/word/2012/wordml" xmlns:w16cex="http://schemas.microsoft.com/office/word/2018/wordml/cex" xmlns:w16cid="http://schemas.microsoft.com/office/word/2016/wordml/cid" xmlns:w16="http://schemas.microsoft.com/office/word/2018/wordml" xmlns:w16sdtdh="http://schemas.microsoft.com/office/word/2020/wordml/sdtdatahash" xmlns:w16se="http://schemas.microsoft.com/office/word/2015/wordml/symex" xmlns:sl="http://schemas.openxmlformats.org/schemaLibrary/2006/main" mc:Ignorable="w14 w15 w16se w16cid w16 w16cex w16sdtdh">
   <w:view w:val="normal"/>
   <w:defaultTabStop w:val="720"/>
   <w:characterSpacingControl w:val="doNotCompress"/>
@@ -10796,6 +10798,7 @@
     <w:rsid w:val="00917A83"/>
     <w:rsid w:val="009D2B66"/>
     <w:rsid w:val="00B03F3A"/>
+    <w:rsid w:val="00B246F6"/>
     <w:rsid w:val="00E72ADF"/>
     <w:rsid w:val="00EC41CE"/>
     <w:rsid w:val="00ED6983"/>
@@ -10824,7 +10827,7 @@
 </file>
 
 <file path=word/glossary/styles.xml><?xml version="1.0" encoding="utf-8"?>
-<w:styles xmlns:mc="http://schemas.openxmlformats.org/markup-compatibility/2006" xmlns:r="http://schemas.openxmlformats.org/officeDocument/2006/relationships" xmlns:w="http://schemas.openxmlformats.org/wordprocessingml/2006/main" xmlns:w14="http://schemas.microsoft.com/office/word/2010/wordml" xmlns:w15="http://schemas.microsoft.com/office/word/2012/wordml" xmlns:w16cex="http://schemas.microsoft.com/office/word/2018/wordml/cex" xmlns:w16cid="http://schemas.microsoft.com/office/word/2016/wordml/cid" xmlns:w16="http://schemas.microsoft.com/office/word/2018/wordml" xmlns:w16du="http://schemas.microsoft.com/office/word/2023/wordml/word16du" xmlns:w16sdtdh="http://schemas.microsoft.com/office/word/2020/wordml/sdtdatahash" xmlns:w16sdtfl="http://schemas.microsoft.com/office/word/2024/wordml/sdtformatlock" xmlns:w16se="http://schemas.microsoft.com/office/word/2015/wordml/symex" mc:Ignorable="w14 w15 w16se w16cid w16 w16cex w16sdtdh w16sdtfl w16du">
+<w:styles xmlns:mc="http://schemas.openxmlformats.org/markup-compatibility/2006" xmlns:r="http://schemas.openxmlformats.org/officeDocument/2006/relationships" xmlns:w="http://schemas.openxmlformats.org/wordprocessingml/2006/main" xmlns:w14="http://schemas.microsoft.com/office/word/2010/wordml" xmlns:w15="http://schemas.microsoft.com/office/word/2012/wordml" xmlns:w16cex="http://schemas.microsoft.com/office/word/2018/wordml/cex" xmlns:w16cid="http://schemas.microsoft.com/office/word/2016/wordml/cid" xmlns:w16="http://schemas.microsoft.com/office/word/2018/wordml" xmlns:w16sdtdh="http://schemas.microsoft.com/office/word/2020/wordml/sdtdatahash" xmlns:w16se="http://schemas.microsoft.com/office/word/2015/wordml/symex" mc:Ignorable="w14 w15 w16se w16cid w16 w16cex w16sdtdh">
   <w:docDefaults>
     <w:rPrDefault>
       <w:rPr>
@@ -11261,7 +11264,7 @@
 </file>
 
 <file path=word/glossary/webSettings.xml><?xml version="1.0" encoding="utf-8"?>
-<w:webSettings xmlns:mc="http://schemas.openxmlformats.org/markup-compatibility/2006" xmlns:r="http://schemas.openxmlformats.org/officeDocument/2006/relationships" xmlns:w="http://schemas.openxmlformats.org/wordprocessingml/2006/main" xmlns:w14="http://schemas.microsoft.com/office/word/2010/wordml" xmlns:w15="http://schemas.microsoft.com/office/word/2012/wordml" xmlns:w16cex="http://schemas.microsoft.com/office/word/2018/wordml/cex" xmlns:w16cid="http://schemas.microsoft.com/office/word/2016/wordml/cid" xmlns:w16="http://schemas.microsoft.com/office/word/2018/wordml" xmlns:w16du="http://schemas.microsoft.com/office/word/2023/wordml/word16du" xmlns:w16sdtdh="http://schemas.microsoft.com/office/word/2020/wordml/sdtdatahash" xmlns:w16sdtfl="http://schemas.microsoft.com/office/word/2024/wordml/sdtformatlock" xmlns:w16se="http://schemas.microsoft.com/office/word/2015/wordml/symex" mc:Ignorable="w14 w15 w16se w16cid w16 w16cex w16sdtdh w16sdtfl w16du">
+<w:webSettings xmlns:mc="http://schemas.openxmlformats.org/markup-compatibility/2006" xmlns:r="http://schemas.openxmlformats.org/officeDocument/2006/relationships" xmlns:w="http://schemas.openxmlformats.org/wordprocessingml/2006/main" xmlns:w14="http://schemas.microsoft.com/office/word/2010/wordml" xmlns:w15="http://schemas.microsoft.com/office/word/2012/wordml" xmlns:w16cex="http://schemas.microsoft.com/office/word/2018/wordml/cex" xmlns:w16cid="http://schemas.microsoft.com/office/word/2016/wordml/cid" xmlns:w16="http://schemas.microsoft.com/office/word/2018/wordml" xmlns:w16sdtdh="http://schemas.microsoft.com/office/word/2020/wordml/sdtdatahash" xmlns:w16se="http://schemas.microsoft.com/office/word/2015/wordml/symex" mc:Ignorable="w14 w15 w16se w16cid w16 w16cex w16sdtdh">
   <w:optimizeForBrowser/>
   <w:allowPNG/>
 </w:webSettings>

</xml_diff>

<commit_message>
Tuesday morning day 5
17 march morning before exam
</commit_message>
<xml_diff>
--- a/Task 1/Task 1a/Task1_Proposal_LL-000020914__Naser_A.docx
+++ b/Task 1/Task 1a/Task1_Proposal_LL-000020914__Naser_A.docx
@@ -1407,15 +1407,7 @@
       </w:r>
       <w:r>
         <w:lastRenderedPageBreak/>
-        <w:t xml:space="preserve">to manage and update their account details, </w:t>
-      </w:r>
-      <w:proofErr w:type="gramStart"/>
-      <w:r>
-        <w:t>in order to</w:t>
-      </w:r>
-      <w:proofErr w:type="gramEnd"/>
-      <w:r>
-        <w:t xml:space="preserve"> make their information successfully up to date. They also appreciate the ability to find their past purchases and reorder items that they liked, and without these functionalities they may feel frustrated or disappointed. This could lead to </w:t>
+        <w:t xml:space="preserve">to manage and update their account details, in order to make their information successfully up to date. They also appreciate the ability to find their past purchases and reorder items that they liked, and without these functionalities they may feel frustrated or disappointed. This could lead to </w:t>
       </w:r>
       <w:r>
         <w:t xml:space="preserve">a loss of customer trust and loyalty, which can result in negative reviews, less sales and even giving competitors with these features an advantage. By allowing customers to manage their accounts and track their orders easily, the digital solution will offer a more personalised and efficient user experience. </w:t>
@@ -1488,15 +1480,7 @@
         <w:t xml:space="preserve">The client wants the solution to include a producer dashboard that makes producers able to manage their stock levels, update product detail and view orders. A professional, industry standard solution should allow producers to efficiently update their available products and quantities. Without this valuable functionality, stock information may have a higher chance of becoming inaccurate or outdated, this could eventually lead to customers ordering products that </w:t>
       </w:r>
       <w:r>
-        <w:t xml:space="preserve">are </w:t>
-      </w:r>
-      <w:proofErr w:type="gramStart"/>
-      <w:r>
-        <w:t>in reality not</w:t>
-      </w:r>
-      <w:proofErr w:type="gramEnd"/>
-      <w:r>
-        <w:t xml:space="preserve"> available. This will cause frustration and trouble keeping things running smoothly. By providing a producer management dashboard personalised for each producer, updating the stock, prices, and product details would be easy and more efficient for producers. This will </w:t>
+        <w:t xml:space="preserve">are in reality not available. This will cause frustration and trouble keeping things running smoothly. By providing a producer management dashboard personalised for each producer, updating the stock, prices, and product details would be easy and more efficient for producers. This will </w:t>
       </w:r>
       <w:r>
         <w:t xml:space="preserve">contribute to accurate listings, and a maintained reliable shopping experience for customers. </w:t>
@@ -2001,15 +1985,7 @@
         <w:t>U</w:t>
       </w:r>
       <w:r>
-        <w:t xml:space="preserve">nfortunately, she has weak </w:t>
-      </w:r>
-      <w:proofErr w:type="gramStart"/>
-      <w:r>
-        <w:t>vision</w:t>
-      </w:r>
-      <w:proofErr w:type="gramEnd"/>
-      <w:r>
-        <w:t xml:space="preserve"> so she needs clear</w:t>
+        <w:t>nfortunately, she has weak vision so she needs clear</w:t>
       </w:r>
       <w:r>
         <w:t>,</w:t>
@@ -2586,16 +2562,11 @@
               <w:lastRenderedPageBreak/>
               <w:t xml:space="preserve">Having an account for Merinda is </w:t>
             </w:r>
-            <w:proofErr w:type="gramStart"/>
             <w:r>
               <w:t xml:space="preserve">necessary,  </w:t>
             </w:r>
             <w:r>
-              <w:t xml:space="preserve"> </w:t>
-            </w:r>
-            <w:proofErr w:type="gramEnd"/>
-            <w:r>
-              <w:t xml:space="preserve">           </w:t>
+              <w:t xml:space="preserve">            </w:t>
             </w:r>
           </w:p>
         </w:tc>
@@ -3859,6 +3830,69 @@
                 <w:numId w:val="33"/>
               </w:numPr>
             </w:pPr>
+            <w:r>
+              <w:t>Access the homepage</w:t>
+            </w:r>
+          </w:p>
+          <w:p>
+            <w:pPr>
+              <w:pStyle w:val="ListParagraph"/>
+              <w:numPr>
+                <w:ilvl w:val="0"/>
+                <w:numId w:val="33"/>
+              </w:numPr>
+            </w:pPr>
+            <w:r>
+              <w:t>Navigate to the shop</w:t>
+            </w:r>
+          </w:p>
+          <w:p>
+            <w:pPr>
+              <w:pStyle w:val="ListParagraph"/>
+              <w:numPr>
+                <w:ilvl w:val="0"/>
+                <w:numId w:val="33"/>
+              </w:numPr>
+            </w:pPr>
+            <w:r>
+              <w:t>Add items to shopping cart</w:t>
+            </w:r>
+          </w:p>
+          <w:p>
+            <w:pPr>
+              <w:pStyle w:val="ListParagraph"/>
+              <w:numPr>
+                <w:ilvl w:val="0"/>
+                <w:numId w:val="33"/>
+              </w:numPr>
+            </w:pPr>
+            <w:r>
+              <w:t xml:space="preserve">Select delivery </w:t>
+            </w:r>
+          </w:p>
+          <w:p>
+            <w:pPr>
+              <w:pStyle w:val="ListParagraph"/>
+              <w:numPr>
+                <w:ilvl w:val="0"/>
+                <w:numId w:val="33"/>
+              </w:numPr>
+            </w:pPr>
+            <w:r>
+              <w:t>Enter details</w:t>
+            </w:r>
+          </w:p>
+          <w:p>
+            <w:pPr>
+              <w:pStyle w:val="ListParagraph"/>
+              <w:numPr>
+                <w:ilvl w:val="0"/>
+                <w:numId w:val="33"/>
+              </w:numPr>
+            </w:pPr>
+            <w:r>
+              <w:t>Confirm order</w:t>
+            </w:r>
           </w:p>
         </w:tc>
         <w:tc>
@@ -3900,7 +3934,81 @@
                 <w:ilvl w:val="0"/>
                 <w:numId w:val="33"/>
               </w:numPr>
-            </w:pPr>
+              <w:spacing w:after="160" w:line="259" w:lineRule="auto"/>
+            </w:pPr>
+            <w:r>
+              <w:t>Access the homepage</w:t>
+            </w:r>
+          </w:p>
+          <w:p>
+            <w:pPr>
+              <w:pStyle w:val="ListParagraph"/>
+              <w:numPr>
+                <w:ilvl w:val="0"/>
+                <w:numId w:val="33"/>
+              </w:numPr>
+              <w:spacing w:after="160" w:line="259" w:lineRule="auto"/>
+            </w:pPr>
+            <w:r>
+              <w:t>Navigate to the shop</w:t>
+            </w:r>
+          </w:p>
+          <w:p>
+            <w:pPr>
+              <w:pStyle w:val="ListParagraph"/>
+              <w:numPr>
+                <w:ilvl w:val="0"/>
+                <w:numId w:val="33"/>
+              </w:numPr>
+              <w:spacing w:after="160" w:line="259" w:lineRule="auto"/>
+            </w:pPr>
+            <w:r>
+              <w:t>Add items to shopping cart</w:t>
+            </w:r>
+          </w:p>
+          <w:p>
+            <w:pPr>
+              <w:pStyle w:val="ListParagraph"/>
+              <w:numPr>
+                <w:ilvl w:val="0"/>
+                <w:numId w:val="33"/>
+              </w:numPr>
+              <w:spacing w:after="160" w:line="259" w:lineRule="auto"/>
+            </w:pPr>
+            <w:r>
+              <w:t xml:space="preserve">Select </w:t>
+            </w:r>
+            <w:r>
+              <w:t>collection</w:t>
+            </w:r>
+            <w:r>
+              <w:t xml:space="preserve"> </w:t>
+            </w:r>
+          </w:p>
+          <w:p>
+            <w:pPr>
+              <w:pStyle w:val="ListParagraph"/>
+              <w:numPr>
+                <w:ilvl w:val="0"/>
+                <w:numId w:val="33"/>
+              </w:numPr>
+              <w:spacing w:after="160" w:line="259" w:lineRule="auto"/>
+            </w:pPr>
+            <w:r>
+              <w:t>Enter details</w:t>
+            </w:r>
+          </w:p>
+          <w:p>
+            <w:pPr>
+              <w:pStyle w:val="ListParagraph"/>
+              <w:numPr>
+                <w:ilvl w:val="0"/>
+                <w:numId w:val="33"/>
+              </w:numPr>
+            </w:pPr>
+            <w:r>
+              <w:t>Confirm order</w:t>
+            </w:r>
           </w:p>
         </w:tc>
         <w:tc>
@@ -3935,7 +4043,78 @@
           <w:tcPr>
             <w:tcW w:w="2976" w:type="dxa"/>
           </w:tcPr>
-          <w:p/>
+          <w:p>
+            <w:pPr>
+              <w:pStyle w:val="ListParagraph"/>
+              <w:numPr>
+                <w:ilvl w:val="0"/>
+                <w:numId w:val="34"/>
+              </w:numPr>
+            </w:pPr>
+            <w:r>
+              <w:t>Make sure to login</w:t>
+            </w:r>
+          </w:p>
+          <w:p>
+            <w:pPr>
+              <w:pStyle w:val="ListParagraph"/>
+              <w:numPr>
+                <w:ilvl w:val="0"/>
+                <w:numId w:val="34"/>
+              </w:numPr>
+            </w:pPr>
+            <w:r>
+              <w:t>Navigate to producer dashboard</w:t>
+            </w:r>
+          </w:p>
+          <w:p>
+            <w:pPr>
+              <w:pStyle w:val="ListParagraph"/>
+              <w:numPr>
+                <w:ilvl w:val="0"/>
+                <w:numId w:val="34"/>
+              </w:numPr>
+            </w:pPr>
+            <w:r>
+              <w:t>Select the product management section</w:t>
+            </w:r>
+          </w:p>
+          <w:p>
+            <w:pPr>
+              <w:pStyle w:val="ListParagraph"/>
+              <w:numPr>
+                <w:ilvl w:val="0"/>
+                <w:numId w:val="34"/>
+              </w:numPr>
+            </w:pPr>
+            <w:r>
+              <w:t>Click edit on the selected product</w:t>
+            </w:r>
+          </w:p>
+          <w:p>
+            <w:pPr>
+              <w:pStyle w:val="ListParagraph"/>
+              <w:numPr>
+                <w:ilvl w:val="0"/>
+                <w:numId w:val="34"/>
+              </w:numPr>
+            </w:pPr>
+            <w:r>
+              <w:t>Update stock if needed</w:t>
+            </w:r>
+          </w:p>
+          <w:p>
+            <w:pPr>
+              <w:pStyle w:val="ListParagraph"/>
+              <w:numPr>
+                <w:ilvl w:val="0"/>
+                <w:numId w:val="34"/>
+              </w:numPr>
+            </w:pPr>
+            <w:r>
+              <w:t>Save changes</w:t>
+            </w:r>
+          </w:p>
         </w:tc>
         <w:tc>
           <w:tcPr>
@@ -3981,7 +4160,93 @@
           <w:tcPr>
             <w:tcW w:w="2976" w:type="dxa"/>
           </w:tcPr>
-          <w:p/>
+          <w:p>
+            <w:pPr>
+              <w:pStyle w:val="ListParagraph"/>
+              <w:numPr>
+                <w:ilvl w:val="0"/>
+                <w:numId w:val="34"/>
+              </w:numPr>
+              <w:spacing w:after="160" w:line="259" w:lineRule="auto"/>
+            </w:pPr>
+            <w:r>
+              <w:t>Make sure to login</w:t>
+            </w:r>
+          </w:p>
+          <w:p>
+            <w:pPr>
+              <w:pStyle w:val="ListParagraph"/>
+              <w:numPr>
+                <w:ilvl w:val="0"/>
+                <w:numId w:val="34"/>
+              </w:numPr>
+              <w:spacing w:after="160" w:line="259" w:lineRule="auto"/>
+            </w:pPr>
+            <w:r>
+              <w:t>Navigate to producer dashboard</w:t>
+            </w:r>
+          </w:p>
+          <w:p>
+            <w:pPr>
+              <w:pStyle w:val="ListParagraph"/>
+              <w:numPr>
+                <w:ilvl w:val="0"/>
+                <w:numId w:val="34"/>
+              </w:numPr>
+              <w:spacing w:after="160" w:line="259" w:lineRule="auto"/>
+            </w:pPr>
+            <w:r>
+              <w:t>Select the product management section</w:t>
+            </w:r>
+          </w:p>
+          <w:p>
+            <w:pPr>
+              <w:pStyle w:val="ListParagraph"/>
+              <w:numPr>
+                <w:ilvl w:val="0"/>
+                <w:numId w:val="34"/>
+              </w:numPr>
+              <w:spacing w:after="160" w:line="259" w:lineRule="auto"/>
+            </w:pPr>
+            <w:r>
+              <w:t>Click edit on the selected product</w:t>
+            </w:r>
+          </w:p>
+          <w:p>
+            <w:pPr>
+              <w:pStyle w:val="ListParagraph"/>
+              <w:numPr>
+                <w:ilvl w:val="0"/>
+                <w:numId w:val="34"/>
+              </w:numPr>
+              <w:spacing w:after="160" w:line="259" w:lineRule="auto"/>
+            </w:pPr>
+            <w:r>
+              <w:t>Update</w:t>
+            </w:r>
+            <w:r>
+              <w:t xml:space="preserve"> the</w:t>
+            </w:r>
+            <w:r>
+              <w:t xml:space="preserve"> </w:t>
+            </w:r>
+            <w:r>
+              <w:t>product details</w:t>
+            </w:r>
+          </w:p>
+          <w:p>
+            <w:pPr>
+              <w:pStyle w:val="ListParagraph"/>
+              <w:numPr>
+                <w:ilvl w:val="0"/>
+                <w:numId w:val="34"/>
+              </w:numPr>
+              <w:spacing w:after="160" w:line="259" w:lineRule="auto"/>
+            </w:pPr>
+            <w:r>
+              <w:t>Save changes</w:t>
+            </w:r>
+          </w:p>
         </w:tc>
         <w:tc>
           <w:tcPr>
@@ -4009,13 +4274,103 @@
             <w:r>
               <w:t>As Tom I want to view customer orders so that I</w:t>
             </w:r>
+            <w:r>
+              <w:t xml:space="preserve"> can manage their status.</w:t>
+            </w:r>
           </w:p>
         </w:tc>
         <w:tc>
           <w:tcPr>
             <w:tcW w:w="2976" w:type="dxa"/>
           </w:tcPr>
-          <w:p/>
+          <w:p>
+            <w:pPr>
+              <w:pStyle w:val="ListParagraph"/>
+              <w:numPr>
+                <w:ilvl w:val="0"/>
+                <w:numId w:val="34"/>
+              </w:numPr>
+              <w:spacing w:after="160" w:line="259" w:lineRule="auto"/>
+            </w:pPr>
+            <w:r>
+              <w:t>Make sure to login</w:t>
+            </w:r>
+          </w:p>
+          <w:p>
+            <w:pPr>
+              <w:pStyle w:val="ListParagraph"/>
+              <w:numPr>
+                <w:ilvl w:val="0"/>
+                <w:numId w:val="34"/>
+              </w:numPr>
+              <w:spacing w:after="160" w:line="259" w:lineRule="auto"/>
+            </w:pPr>
+            <w:r>
+              <w:t>Navigate to producer dashboard</w:t>
+            </w:r>
+          </w:p>
+          <w:p>
+            <w:pPr>
+              <w:pStyle w:val="ListParagraph"/>
+              <w:numPr>
+                <w:ilvl w:val="0"/>
+                <w:numId w:val="34"/>
+              </w:numPr>
+              <w:spacing w:after="160" w:line="259" w:lineRule="auto"/>
+            </w:pPr>
+            <w:r>
+              <w:t xml:space="preserve">Select the </w:t>
+            </w:r>
+            <w:r>
+              <w:t>order</w:t>
+            </w:r>
+            <w:r>
+              <w:t xml:space="preserve"> management section</w:t>
+            </w:r>
+          </w:p>
+          <w:p>
+            <w:pPr>
+              <w:pStyle w:val="ListParagraph"/>
+              <w:numPr>
+                <w:ilvl w:val="0"/>
+                <w:numId w:val="34"/>
+              </w:numPr>
+              <w:spacing w:after="160" w:line="259" w:lineRule="auto"/>
+            </w:pPr>
+            <w:r>
+              <w:lastRenderedPageBreak/>
+              <w:t>View all customer orders</w:t>
+            </w:r>
+          </w:p>
+          <w:p>
+            <w:pPr>
+              <w:pStyle w:val="ListParagraph"/>
+              <w:numPr>
+                <w:ilvl w:val="0"/>
+                <w:numId w:val="34"/>
+              </w:numPr>
+              <w:spacing w:after="160" w:line="259" w:lineRule="auto"/>
+            </w:pPr>
+            <w:r>
+              <w:t>Change status</w:t>
+            </w:r>
+            <w:r>
+              <w:t xml:space="preserve"> if needed</w:t>
+            </w:r>
+          </w:p>
+          <w:p>
+            <w:pPr>
+              <w:pStyle w:val="ListParagraph"/>
+              <w:numPr>
+                <w:ilvl w:val="0"/>
+                <w:numId w:val="34"/>
+              </w:numPr>
+              <w:spacing w:after="160" w:line="259" w:lineRule="auto"/>
+            </w:pPr>
+            <w:r>
+              <w:t>Save changes</w:t>
+            </w:r>
+          </w:p>
         </w:tc>
         <w:tc>
           <w:tcPr>
@@ -4043,13 +4398,78 @@
             <w:r>
               <w:t>As Jack I want to get discounts and special offers after purchasing so that I</w:t>
             </w:r>
+            <w:r>
+              <w:t xml:space="preserve"> can save money.</w:t>
+            </w:r>
           </w:p>
         </w:tc>
         <w:tc>
           <w:tcPr>
             <w:tcW w:w="2976" w:type="dxa"/>
           </w:tcPr>
-          <w:p/>
+          <w:p>
+            <w:pPr>
+              <w:pStyle w:val="ListParagraph"/>
+              <w:numPr>
+                <w:ilvl w:val="0"/>
+                <w:numId w:val="35"/>
+              </w:numPr>
+            </w:pPr>
+            <w:r>
+              <w:t>Successfully make an order</w:t>
+            </w:r>
+          </w:p>
+          <w:p>
+            <w:pPr>
+              <w:pStyle w:val="ListParagraph"/>
+              <w:numPr>
+                <w:ilvl w:val="0"/>
+                <w:numId w:val="35"/>
+              </w:numPr>
+            </w:pPr>
+            <w:r>
+              <w:t>Navigate to account</w:t>
+            </w:r>
+          </w:p>
+          <w:p>
+            <w:pPr>
+              <w:pStyle w:val="ListParagraph"/>
+              <w:numPr>
+                <w:ilvl w:val="0"/>
+                <w:numId w:val="35"/>
+              </w:numPr>
+            </w:pPr>
+            <w:r>
+              <w:t>Select My Loyalty section</w:t>
+            </w:r>
+          </w:p>
+          <w:p>
+            <w:pPr>
+              <w:pStyle w:val="ListParagraph"/>
+              <w:numPr>
+                <w:ilvl w:val="0"/>
+                <w:numId w:val="35"/>
+              </w:numPr>
+            </w:pPr>
+            <w:r>
+              <w:t>View loyalty points received</w:t>
+            </w:r>
+            <w:r>
+              <w:t xml:space="preserve"> from purchase</w:t>
+            </w:r>
+          </w:p>
+          <w:p>
+            <w:pPr>
+              <w:pStyle w:val="ListParagraph"/>
+              <w:numPr>
+                <w:ilvl w:val="0"/>
+                <w:numId w:val="35"/>
+              </w:numPr>
+            </w:pPr>
+            <w:r>
+              <w:t>Redeem offers with loyalty points</w:t>
+            </w:r>
+          </w:p>
         </w:tc>
         <w:tc>
           <w:tcPr>
@@ -4077,13 +4497,80 @@
             <w:r>
               <w:t>As Merinda I want to get discounts and special offers after purchasing so that I</w:t>
             </w:r>
+            <w:r>
+              <w:t xml:space="preserve"> can continue to buy from the local producers.</w:t>
+            </w:r>
           </w:p>
         </w:tc>
         <w:tc>
           <w:tcPr>
             <w:tcW w:w="2976" w:type="dxa"/>
           </w:tcPr>
-          <w:p/>
+          <w:p>
+            <w:pPr>
+              <w:pStyle w:val="ListParagraph"/>
+              <w:numPr>
+                <w:ilvl w:val="0"/>
+                <w:numId w:val="35"/>
+              </w:numPr>
+              <w:spacing w:after="160" w:line="259" w:lineRule="auto"/>
+            </w:pPr>
+            <w:r>
+              <w:t>Successfully make an order</w:t>
+            </w:r>
+          </w:p>
+          <w:p>
+            <w:pPr>
+              <w:pStyle w:val="ListParagraph"/>
+              <w:numPr>
+                <w:ilvl w:val="0"/>
+                <w:numId w:val="35"/>
+              </w:numPr>
+              <w:spacing w:after="160" w:line="259" w:lineRule="auto"/>
+            </w:pPr>
+            <w:r>
+              <w:t>Navigate to account</w:t>
+            </w:r>
+          </w:p>
+          <w:p>
+            <w:pPr>
+              <w:pStyle w:val="ListParagraph"/>
+              <w:numPr>
+                <w:ilvl w:val="0"/>
+                <w:numId w:val="35"/>
+              </w:numPr>
+              <w:spacing w:after="160" w:line="259" w:lineRule="auto"/>
+            </w:pPr>
+            <w:r>
+              <w:t>Select My Loyalty section</w:t>
+            </w:r>
+          </w:p>
+          <w:p>
+            <w:pPr>
+              <w:pStyle w:val="ListParagraph"/>
+              <w:numPr>
+                <w:ilvl w:val="0"/>
+                <w:numId w:val="35"/>
+              </w:numPr>
+              <w:spacing w:after="160" w:line="259" w:lineRule="auto"/>
+            </w:pPr>
+            <w:r>
+              <w:t>View loyalty points received from purchase</w:t>
+            </w:r>
+          </w:p>
+          <w:p>
+            <w:pPr>
+              <w:pStyle w:val="ListParagraph"/>
+              <w:numPr>
+                <w:ilvl w:val="0"/>
+                <w:numId w:val="35"/>
+              </w:numPr>
+              <w:spacing w:after="160" w:line="259" w:lineRule="auto"/>
+            </w:pPr>
+            <w:r>
+              <w:t>Redeem offers with loyalty points</w:t>
+            </w:r>
+          </w:p>
         </w:tc>
         <w:tc>
           <w:tcPr>
@@ -4143,11 +4630,10 @@
           </w:tcPr>
           <w:p>
             <w:r>
-              <w:t xml:space="preserve">As Jack I want to have access to accessibility features so that I can turn the </w:t>
-            </w:r>
-            <w:r>
-              <w:lastRenderedPageBreak/>
-              <w:t>website into dark mode</w:t>
+              <w:t>As Jack I want to have access to accessibility features so that I can turn the website into dark mode</w:t>
+            </w:r>
+            <w:r>
+              <w:t>.</w:t>
             </w:r>
           </w:p>
         </w:tc>
@@ -4155,7 +4641,15 @@
           <w:tcPr>
             <w:tcW w:w="2976" w:type="dxa"/>
           </w:tcPr>
-          <w:p/>
+          <w:p>
+            <w:pPr>
+              <w:pStyle w:val="ListParagraph"/>
+              <w:numPr>
+                <w:ilvl w:val="0"/>
+                <w:numId w:val="36"/>
+              </w:numPr>
+            </w:pPr>
+          </w:p>
         </w:tc>
         <w:tc>
           <w:tcPr>
@@ -4311,15 +4805,7 @@
           </w:tcPr>
           <w:p>
             <w:r>
-              <w:t xml:space="preserve">The solution must have consistent low latency speed, </w:t>
-            </w:r>
-            <w:proofErr w:type="gramStart"/>
-            <w:r>
-              <w:t>in order for</w:t>
-            </w:r>
-            <w:proofErr w:type="gramEnd"/>
-            <w:r>
-              <w:t xml:space="preserve"> the users to have a seamless experience without any frustration. </w:t>
+              <w:t xml:space="preserve">The solution must have consistent low latency speed, in order for the users to have a seamless experience without any frustration. </w:t>
             </w:r>
             <w:r>
               <w:t>The digital solution should maintain fast service especially for simple activities.</w:t>
@@ -4481,7 +4967,6 @@
               </w:numPr>
             </w:pPr>
             <w:r>
-              <w:lastRenderedPageBreak/>
               <w:t>99% of orders should be processed successfully without errors</w:t>
             </w:r>
             <w:r>
@@ -4512,7 +4997,6 @@
           </w:tcPr>
           <w:p>
             <w:r>
-              <w:lastRenderedPageBreak/>
               <w:t>Efficient filtering products performance</w:t>
             </w:r>
           </w:p>
@@ -4678,6 +5162,7 @@
           </w:tcPr>
           <w:p>
             <w:r>
+              <w:lastRenderedPageBreak/>
               <w:t>Authorisation</w:t>
             </w:r>
           </w:p>
@@ -4888,7 +5373,6 @@
           </w:tcPr>
           <w:p>
             <w:r>
-              <w:lastRenderedPageBreak/>
               <w:t>Two</w:t>
             </w:r>
             <w:r>
@@ -4908,15 +5392,7 @@
           </w:tcPr>
           <w:p>
             <w:r>
-              <w:t xml:space="preserve">Two-factor authentication adds an extra layer of security when users log in. Even if someone knows a user’s password, they should still need a second code to access the account. This helps protect accounts from being hacked and keep user data </w:t>
-            </w:r>
-            <w:proofErr w:type="gramStart"/>
-            <w:r>
-              <w:t>more safe</w:t>
-            </w:r>
-            <w:proofErr w:type="gramEnd"/>
-            <w:r>
-              <w:t>.</w:t>
+              <w:t>Two-factor authentication adds an extra layer of security when users log in. Even if someone knows a user’s password, they should still need a second code to access the account. This helps protect accounts from being hacked and keep user data more safe.</w:t>
             </w:r>
           </w:p>
         </w:tc>
@@ -5095,6 +5571,7 @@
               </w:numPr>
             </w:pPr>
             <w:r>
+              <w:lastRenderedPageBreak/>
               <w:t>95% of orders should be processed within 5 seconds.</w:t>
             </w:r>
           </w:p>
@@ -5119,6 +5596,7 @@
           </w:tcPr>
           <w:p>
             <w:r>
+              <w:lastRenderedPageBreak/>
               <w:t>Load tolerance</w:t>
             </w:r>
           </w:p>
@@ -5355,7 +5833,6 @@
                 <w:sz w:val="32"/>
                 <w:szCs w:val="32"/>
               </w:rPr>
-              <w:lastRenderedPageBreak/>
               <w:t>Capacity</w:t>
             </w:r>
           </w:p>
@@ -5518,6 +5995,7 @@
           </w:tcPr>
           <w:p>
             <w:r>
+              <w:lastRenderedPageBreak/>
               <w:t>Responsiveness</w:t>
             </w:r>
           </w:p>
@@ -5925,7 +6403,6 @@
               </w:numPr>
             </w:pPr>
             <w:r>
-              <w:lastRenderedPageBreak/>
               <w:t>All orders logged with date, time and User Id.</w:t>
             </w:r>
           </w:p>
@@ -6123,6 +6600,7 @@
               </w:numPr>
             </w:pPr>
             <w:r>
+              <w:lastRenderedPageBreak/>
               <w:t>All the pages should follow the same design template</w:t>
             </w:r>
             <w:r>
@@ -6138,6 +6616,7 @@
           </w:tcPr>
           <w:p>
             <w:r>
+              <w:lastRenderedPageBreak/>
               <w:t>Efficient tasks</w:t>
             </w:r>
           </w:p>
@@ -6535,7 +7014,6 @@
               </w:numPr>
             </w:pPr>
             <w:r>
-              <w:lastRenderedPageBreak/>
               <w:t>Links and buttons have clear visual contrast.</w:t>
             </w:r>
           </w:p>
@@ -6556,6 +7034,7 @@
       </w:pPr>
       <w:bookmarkStart w:id="5" w:name="_Toc224242723"/>
       <w:r>
+        <w:lastRenderedPageBreak/>
         <w:t>Hierarchy Diagram</w:t>
       </w:r>
       <w:bookmarkEnd w:id="5"/>
@@ -6773,14 +7252,7 @@
         <w:rPr>
           <w:rFonts w:ascii="Calibri" w:hAnsi="Calibri" w:cs="Calibri"/>
         </w:rPr>
-        <w:t xml:space="preserve"> The dark green I am planning to use will add a sense of freshness, and a connection to organic, high-quality products. It will be mainly used on key elements to draw the </w:t>
-      </w:r>
-      <w:r>
-        <w:rPr>
-          <w:rFonts w:ascii="Calibri" w:hAnsi="Calibri" w:cs="Calibri"/>
-        </w:rPr>
-        <w:lastRenderedPageBreak/>
-        <w:t xml:space="preserve">users-attention </w:t>
+        <w:t xml:space="preserve"> The dark green I am planning to use will add a sense of freshness, and a connection to organic, high-quality products. It will be mainly used on key elements to draw the users-attention </w:t>
       </w:r>
       <w:r>
         <w:rPr>
@@ -6923,6 +7395,7 @@
       </w:pPr>
       <w:bookmarkStart w:id="7" w:name="_Toc224242725"/>
       <w:r>
+        <w:lastRenderedPageBreak/>
         <w:t>Security Considerations &amp; Risk Mitigation</w:t>
       </w:r>
       <w:bookmarkEnd w:id="7"/>
@@ -7988,15 +8461,7 @@
           </w:tcPr>
           <w:p>
             <w:r>
-              <w:t xml:space="preserve">This will reduce the impact of the risk because wrong listings could be corrected quickly. It stops customers from ordering products that are </w:t>
-            </w:r>
-            <w:proofErr w:type="gramStart"/>
-            <w:r>
-              <w:t>actually out</w:t>
-            </w:r>
-            <w:proofErr w:type="gramEnd"/>
-            <w:r>
-              <w:t xml:space="preserve"> of stock, and this will help maintain customer satisfaction and compliance with the consumer protection from unfair trading regulations.</w:t>
+              <w:t>This will reduce the impact of the risk because wrong listings could be corrected quickly. It stops customers from ordering products that are actually out of stock, and this will help maintain customer satisfaction and compliance with the consumer protection from unfair trading regulations.</w:t>
             </w:r>
           </w:p>
         </w:tc>
@@ -8018,7 +8483,11 @@
           </w:tcPr>
           <w:p>
             <w:r>
-              <w:t xml:space="preserve">Proper error handling, logging and request validation could be implemented in the solution. If the digital solution fails, an error page could be shown while the issue is </w:t>
+              <w:t xml:space="preserve">Proper error handling, logging and request validation could be implemented in the solution. If the digital solution fails, an </w:t>
+            </w:r>
+            <w:r>
+              <w:lastRenderedPageBreak/>
+              <w:t xml:space="preserve">error page could be shown while the issue is </w:t>
             </w:r>
             <w:r>
               <w:t>being logged for developers to fix.</w:t>
@@ -8031,7 +8500,12 @@
           </w:tcPr>
           <w:p>
             <w:r>
-              <w:t>Error logging lets developers quickly identify and fix the problem, while the page stops users from seeing technical crash messages. This reduces the impact because users will not lose their order information if an error occurs.</w:t>
+              <w:lastRenderedPageBreak/>
+              <w:t xml:space="preserve">Error logging lets developers quickly identify and fix the problem, while the page stops users from seeing technical crash messages. This reduces </w:t>
+            </w:r>
+            <w:r>
+              <w:lastRenderedPageBreak/>
+              <w:t>the impact because users will not lose their order information if an error occurs.</w:t>
             </w:r>
           </w:p>
         </w:tc>
@@ -8043,6 +8517,7 @@
           </w:tcPr>
           <w:p>
             <w:r>
+              <w:lastRenderedPageBreak/>
               <w:t>R3</w:t>
             </w:r>
           </w:p>
@@ -8406,11 +8881,7 @@
               <w:t xml:space="preserve"> described and of reasonable quality.</w:t>
             </w:r>
             <w:r>
-              <w:t xml:space="preserve"> The solution will follow this legislation by accurately describing the items in the product listings, and that also includes the price, quantity and condition. The customers have </w:t>
-            </w:r>
-            <w:r>
-              <w:lastRenderedPageBreak/>
-              <w:t>the right to request a refund or replacement if they received incorrect or bad quality products. For the business to be deemed trustworthy and have a great reputation, this legislation is important to comply with.</w:t>
+              <w:t xml:space="preserve"> The solution will follow this legislation by accurately describing the items in the product listings, and that also includes the price, quantity and condition. The customers have the right to request a refund or replacement if they received incorrect or bad quality products. For the business to be deemed trustworthy and have a great reputation, this legislation is important to comply with.</w:t>
             </w:r>
           </w:p>
         </w:tc>
@@ -8433,7 +8904,6 @@
                 <w:b/>
                 <w:bCs/>
               </w:rPr>
-              <w:lastRenderedPageBreak/>
               <w:t>Consumer Protection from Unfair Trading Regulations 2008</w:t>
             </w:r>
           </w:p>
@@ -8464,32 +8934,17 @@
             <w:r>
               <w:t xml:space="preserve"> </w:t>
             </w:r>
-            <w:proofErr w:type="gramStart"/>
             <w:r>
               <w:t>are</w:t>
             </w:r>
-            <w:proofErr w:type="gramEnd"/>
-            <w:r>
-              <w:t xml:space="preserve"> responsible for when businesses </w:t>
-            </w:r>
-            <w:proofErr w:type="gramStart"/>
-            <w:r>
-              <w:t>want</w:t>
+            <w:r>
+              <w:t xml:space="preserve"> responsible for when businesses want</w:t>
             </w:r>
             <w:r>
               <w:t>s</w:t>
             </w:r>
-            <w:proofErr w:type="gramEnd"/>
-            <w:r>
-              <w:t xml:space="preserve"> to promote or sell their products, it makes sure that they will not use deceptive or misleading methods to get their products sold. Therefore, the solution must ensure that all product descriptions, prices, availability information, and special offers, must be accurate and true. </w:t>
-            </w:r>
-            <w:proofErr w:type="gramStart"/>
-            <w:r>
-              <w:t>In order to</w:t>
-            </w:r>
-            <w:proofErr w:type="gramEnd"/>
-            <w:r>
-              <w:t xml:space="preserve"> protect customers and maintain Greenfield Local Hubs credibility, the marketing and product information must be honest and transparent.</w:t>
+            <w:r>
+              <w:t xml:space="preserve"> to promote or sell their products, it makes sure that they will not use deceptive or misleading methods to get their products sold. Therefore, the solution must ensure that all product descriptions, prices, availability information, and special offers, must be accurate and true. In order to protect customers and maintain Greenfield Local Hubs credibility, the marketing and product information must be honest and transparent.</w:t>
             </w:r>
           </w:p>
         </w:tc>
@@ -8512,6 +8967,7 @@
                 <w:b/>
                 <w:bCs/>
               </w:rPr>
+              <w:lastRenderedPageBreak/>
               <w:t>Electronic Commerce (EC Directive) Regulations 2002</w:t>
             </w:r>
           </w:p>
@@ -8567,15 +9023,7 @@
               <w:t>es</w:t>
             </w:r>
             <w:r>
-              <w:t xml:space="preserve"> to make sure that people with disabilities can access services successfully. </w:t>
-            </w:r>
-            <w:proofErr w:type="gramStart"/>
-            <w:r>
-              <w:t>In order for</w:t>
-            </w:r>
-            <w:proofErr w:type="gramEnd"/>
-            <w:r>
-              <w:t xml:space="preserve"> business to meet this they must follow the accessibility guidelines such as Web Content Accessibility Guidelines (WCAG). </w:t>
+              <w:t xml:space="preserve"> to make sure that people with disabilities can access services successfully. In order for business to meet this they must follow the accessibility guidelines such as Web Content Accessibility Guidelines (WCAG). </w:t>
             </w:r>
             <w:r>
               <w:t>Features that help make sure that all users can access and use the solution effectively are readable text, clear navigation and compatibility with screen readers. Including accessibility features will support inclusivity and makes sure that the business does not unintentionally exclude certain users.</w:t>
@@ -8654,18 +9102,10 @@
           </w:tcPr>
           <w:p>
             <w:r>
-              <w:t xml:space="preserve">Greenfield Local Hub will comply with the Food Information </w:t>
-            </w:r>
-            <w:proofErr w:type="gramStart"/>
-            <w:r>
-              <w:t>Regulations</w:t>
-            </w:r>
-            <w:r>
-              <w:t>,</w:t>
-            </w:r>
-            <w:proofErr w:type="gramEnd"/>
-            <w:r>
-              <w:t xml:space="preserve"> t</w:t>
+              <w:t>Greenfield Local Hub will comply with the Food Information Regulations</w:t>
+            </w:r>
+            <w:r>
+              <w:t>, t</w:t>
             </w:r>
             <w:r>
               <w:t>his means the solution will</w:t>
@@ -8689,11 +9129,7 @@
               <w:t xml:space="preserve"> all</w:t>
             </w:r>
             <w:r>
-              <w:t xml:space="preserve"> food </w:t>
-            </w:r>
-            <w:r>
-              <w:lastRenderedPageBreak/>
-              <w:t>products</w:t>
+              <w:t xml:space="preserve"> food products</w:t>
             </w:r>
             <w:r>
               <w:t>. This will include listing all the</w:t>
@@ -9421,6 +9857,119 @@
     </w:lvl>
   </w:abstractNum>
   <w:abstractNum w:abstractNumId="6" w15:restartNumberingAfterBreak="0">
+    <w:nsid w:val="121016D5"/>
+    <w:multiLevelType w:val="hybridMultilevel"/>
+    <w:tmpl w:val="2AE274B8"/>
+    <w:lvl w:ilvl="0" w:tplc="08090001">
+      <w:start w:val="1"/>
+      <w:numFmt w:val="bullet"/>
+      <w:lvlText w:val=""/>
+      <w:lvlJc w:val="left"/>
+      <w:pPr>
+        <w:ind w:left="360" w:hanging="360"/>
+      </w:pPr>
+      <w:rPr>
+        <w:rFonts w:ascii="Symbol" w:hAnsi="Symbol" w:hint="default"/>
+      </w:rPr>
+    </w:lvl>
+    <w:lvl w:ilvl="1" w:tplc="08090003" w:tentative="1">
+      <w:start w:val="1"/>
+      <w:numFmt w:val="bullet"/>
+      <w:lvlText w:val="o"/>
+      <w:lvlJc w:val="left"/>
+      <w:pPr>
+        <w:ind w:left="1080" w:hanging="360"/>
+      </w:pPr>
+      <w:rPr>
+        <w:rFonts w:ascii="Courier New" w:hAnsi="Courier New" w:cs="Courier New" w:hint="default"/>
+      </w:rPr>
+    </w:lvl>
+    <w:lvl w:ilvl="2" w:tplc="08090005" w:tentative="1">
+      <w:start w:val="1"/>
+      <w:numFmt w:val="bullet"/>
+      <w:lvlText w:val=""/>
+      <w:lvlJc w:val="left"/>
+      <w:pPr>
+        <w:ind w:left="1800" w:hanging="360"/>
+      </w:pPr>
+      <w:rPr>
+        <w:rFonts w:ascii="Wingdings" w:hAnsi="Wingdings" w:hint="default"/>
+      </w:rPr>
+    </w:lvl>
+    <w:lvl w:ilvl="3" w:tplc="08090001" w:tentative="1">
+      <w:start w:val="1"/>
+      <w:numFmt w:val="bullet"/>
+      <w:lvlText w:val=""/>
+      <w:lvlJc w:val="left"/>
+      <w:pPr>
+        <w:ind w:left="2520" w:hanging="360"/>
+      </w:pPr>
+      <w:rPr>
+        <w:rFonts w:ascii="Symbol" w:hAnsi="Symbol" w:hint="default"/>
+      </w:rPr>
+    </w:lvl>
+    <w:lvl w:ilvl="4" w:tplc="08090003" w:tentative="1">
+      <w:start w:val="1"/>
+      <w:numFmt w:val="bullet"/>
+      <w:lvlText w:val="o"/>
+      <w:lvlJc w:val="left"/>
+      <w:pPr>
+        <w:ind w:left="3240" w:hanging="360"/>
+      </w:pPr>
+      <w:rPr>
+        <w:rFonts w:ascii="Courier New" w:hAnsi="Courier New" w:cs="Courier New" w:hint="default"/>
+      </w:rPr>
+    </w:lvl>
+    <w:lvl w:ilvl="5" w:tplc="08090005" w:tentative="1">
+      <w:start w:val="1"/>
+      <w:numFmt w:val="bullet"/>
+      <w:lvlText w:val=""/>
+      <w:lvlJc w:val="left"/>
+      <w:pPr>
+        <w:ind w:left="3960" w:hanging="360"/>
+      </w:pPr>
+      <w:rPr>
+        <w:rFonts w:ascii="Wingdings" w:hAnsi="Wingdings" w:hint="default"/>
+      </w:rPr>
+    </w:lvl>
+    <w:lvl w:ilvl="6" w:tplc="08090001" w:tentative="1">
+      <w:start w:val="1"/>
+      <w:numFmt w:val="bullet"/>
+      <w:lvlText w:val=""/>
+      <w:lvlJc w:val="left"/>
+      <w:pPr>
+        <w:ind w:left="4680" w:hanging="360"/>
+      </w:pPr>
+      <w:rPr>
+        <w:rFonts w:ascii="Symbol" w:hAnsi="Symbol" w:hint="default"/>
+      </w:rPr>
+    </w:lvl>
+    <w:lvl w:ilvl="7" w:tplc="08090003" w:tentative="1">
+      <w:start w:val="1"/>
+      <w:numFmt w:val="bullet"/>
+      <w:lvlText w:val="o"/>
+      <w:lvlJc w:val="left"/>
+      <w:pPr>
+        <w:ind w:left="5400" w:hanging="360"/>
+      </w:pPr>
+      <w:rPr>
+        <w:rFonts w:ascii="Courier New" w:hAnsi="Courier New" w:cs="Courier New" w:hint="default"/>
+      </w:rPr>
+    </w:lvl>
+    <w:lvl w:ilvl="8" w:tplc="08090005" w:tentative="1">
+      <w:start w:val="1"/>
+      <w:numFmt w:val="bullet"/>
+      <w:lvlText w:val=""/>
+      <w:lvlJc w:val="left"/>
+      <w:pPr>
+        <w:ind w:left="6120" w:hanging="360"/>
+      </w:pPr>
+      <w:rPr>
+        <w:rFonts w:ascii="Wingdings" w:hAnsi="Wingdings" w:hint="default"/>
+      </w:rPr>
+    </w:lvl>
+  </w:abstractNum>
+  <w:abstractNum w:abstractNumId="7" w15:restartNumberingAfterBreak="0">
     <w:nsid w:val="15841240"/>
     <w:multiLevelType w:val="hybridMultilevel"/>
     <w:tmpl w:val="A99AE342"/>
@@ -9533,7 +10082,7 @@
       </w:rPr>
     </w:lvl>
   </w:abstractNum>
-  <w:abstractNum w:abstractNumId="7" w15:restartNumberingAfterBreak="0">
+  <w:abstractNum w:abstractNumId="8" w15:restartNumberingAfterBreak="0">
     <w:nsid w:val="163F320F"/>
     <w:multiLevelType w:val="hybridMultilevel"/>
     <w:tmpl w:val="57629F84"/>
@@ -9619,7 +10168,7 @@
       </w:pPr>
     </w:lvl>
   </w:abstractNum>
-  <w:abstractNum w:abstractNumId="8" w15:restartNumberingAfterBreak="0">
+  <w:abstractNum w:abstractNumId="9" w15:restartNumberingAfterBreak="0">
     <w:nsid w:val="1AB70FBF"/>
     <w:multiLevelType w:val="hybridMultilevel"/>
     <w:tmpl w:val="A990AAB8"/>
@@ -9732,7 +10281,7 @@
       </w:rPr>
     </w:lvl>
   </w:abstractNum>
-  <w:abstractNum w:abstractNumId="9" w15:restartNumberingAfterBreak="0">
+  <w:abstractNum w:abstractNumId="10" w15:restartNumberingAfterBreak="0">
     <w:nsid w:val="1C274BF3"/>
     <w:multiLevelType w:val="hybridMultilevel"/>
     <w:tmpl w:val="C8EC8BFC"/>
@@ -9845,7 +10394,7 @@
       </w:rPr>
     </w:lvl>
   </w:abstractNum>
-  <w:abstractNum w:abstractNumId="10" w15:restartNumberingAfterBreak="0">
+  <w:abstractNum w:abstractNumId="11" w15:restartNumberingAfterBreak="0">
     <w:nsid w:val="1C4C51EC"/>
     <w:multiLevelType w:val="hybridMultilevel"/>
     <w:tmpl w:val="215E58E4"/>
@@ -9958,7 +10507,7 @@
       </w:rPr>
     </w:lvl>
   </w:abstractNum>
-  <w:abstractNum w:abstractNumId="11" w15:restartNumberingAfterBreak="0">
+  <w:abstractNum w:abstractNumId="12" w15:restartNumberingAfterBreak="0">
     <w:nsid w:val="1F2D2608"/>
     <w:multiLevelType w:val="hybridMultilevel"/>
     <w:tmpl w:val="A7CA6A2C"/>
@@ -10071,7 +10620,7 @@
       </w:rPr>
     </w:lvl>
   </w:abstractNum>
-  <w:abstractNum w:abstractNumId="12" w15:restartNumberingAfterBreak="0">
+  <w:abstractNum w:abstractNumId="13" w15:restartNumberingAfterBreak="0">
     <w:nsid w:val="23401465"/>
     <w:multiLevelType w:val="hybridMultilevel"/>
     <w:tmpl w:val="40D81BB2"/>
@@ -10184,7 +10733,7 @@
       </w:rPr>
     </w:lvl>
   </w:abstractNum>
-  <w:abstractNum w:abstractNumId="13" w15:restartNumberingAfterBreak="0">
+  <w:abstractNum w:abstractNumId="14" w15:restartNumberingAfterBreak="0">
     <w:nsid w:val="3037689D"/>
     <w:multiLevelType w:val="hybridMultilevel"/>
     <w:tmpl w:val="29642C6C"/>
@@ -10297,7 +10846,7 @@
       </w:rPr>
     </w:lvl>
   </w:abstractNum>
-  <w:abstractNum w:abstractNumId="14" w15:restartNumberingAfterBreak="0">
+  <w:abstractNum w:abstractNumId="15" w15:restartNumberingAfterBreak="0">
     <w:nsid w:val="34137DC3"/>
     <w:multiLevelType w:val="hybridMultilevel"/>
     <w:tmpl w:val="F62EE4A6"/>
@@ -10410,7 +10959,7 @@
       </w:rPr>
     </w:lvl>
   </w:abstractNum>
-  <w:abstractNum w:abstractNumId="15" w15:restartNumberingAfterBreak="0">
+  <w:abstractNum w:abstractNumId="16" w15:restartNumberingAfterBreak="0">
     <w:nsid w:val="343C2359"/>
     <w:multiLevelType w:val="hybridMultilevel"/>
     <w:tmpl w:val="A1AA6704"/>
@@ -10523,7 +11072,7 @@
       </w:rPr>
     </w:lvl>
   </w:abstractNum>
-  <w:abstractNum w:abstractNumId="16" w15:restartNumberingAfterBreak="0">
+  <w:abstractNum w:abstractNumId="17" w15:restartNumberingAfterBreak="0">
     <w:nsid w:val="3C8C0238"/>
     <w:multiLevelType w:val="hybridMultilevel"/>
     <w:tmpl w:val="B412883C"/>
@@ -10636,7 +11185,7 @@
       </w:rPr>
     </w:lvl>
   </w:abstractNum>
-  <w:abstractNum w:abstractNumId="17" w15:restartNumberingAfterBreak="0">
+  <w:abstractNum w:abstractNumId="18" w15:restartNumberingAfterBreak="0">
     <w:nsid w:val="3CA42D14"/>
     <w:multiLevelType w:val="hybridMultilevel"/>
     <w:tmpl w:val="989E8E60"/>
@@ -10749,7 +11298,7 @@
       </w:rPr>
     </w:lvl>
   </w:abstractNum>
-  <w:abstractNum w:abstractNumId="18" w15:restartNumberingAfterBreak="0">
+  <w:abstractNum w:abstractNumId="19" w15:restartNumberingAfterBreak="0">
     <w:nsid w:val="40AE2793"/>
     <w:multiLevelType w:val="hybridMultilevel"/>
     <w:tmpl w:val="CC8E11F4"/>
@@ -10862,7 +11411,7 @@
       </w:rPr>
     </w:lvl>
   </w:abstractNum>
-  <w:abstractNum w:abstractNumId="19" w15:restartNumberingAfterBreak="0">
+  <w:abstractNum w:abstractNumId="20" w15:restartNumberingAfterBreak="0">
     <w:nsid w:val="40DD2DEA"/>
     <w:multiLevelType w:val="hybridMultilevel"/>
     <w:tmpl w:val="4D4E024E"/>
@@ -10951,7 +11500,7 @@
       </w:pPr>
     </w:lvl>
   </w:abstractNum>
-  <w:abstractNum w:abstractNumId="20" w15:restartNumberingAfterBreak="0">
+  <w:abstractNum w:abstractNumId="21" w15:restartNumberingAfterBreak="0">
     <w:nsid w:val="41575AEC"/>
     <w:multiLevelType w:val="hybridMultilevel"/>
     <w:tmpl w:val="A93AAB8A"/>
@@ -11064,7 +11613,7 @@
       </w:rPr>
     </w:lvl>
   </w:abstractNum>
-  <w:abstractNum w:abstractNumId="21" w15:restartNumberingAfterBreak="0">
+  <w:abstractNum w:abstractNumId="22" w15:restartNumberingAfterBreak="0">
     <w:nsid w:val="42CD739C"/>
     <w:multiLevelType w:val="hybridMultilevel"/>
     <w:tmpl w:val="D034DBEC"/>
@@ -11177,7 +11726,7 @@
       </w:rPr>
     </w:lvl>
   </w:abstractNum>
-  <w:abstractNum w:abstractNumId="22" w15:restartNumberingAfterBreak="0">
+  <w:abstractNum w:abstractNumId="23" w15:restartNumberingAfterBreak="0">
     <w:nsid w:val="43AB38DD"/>
     <w:multiLevelType w:val="hybridMultilevel"/>
     <w:tmpl w:val="690C8AE2"/>
@@ -11290,7 +11839,7 @@
       </w:rPr>
     </w:lvl>
   </w:abstractNum>
-  <w:abstractNum w:abstractNumId="23" w15:restartNumberingAfterBreak="0">
+  <w:abstractNum w:abstractNumId="24" w15:restartNumberingAfterBreak="0">
     <w:nsid w:val="45964BD0"/>
     <w:multiLevelType w:val="hybridMultilevel"/>
     <w:tmpl w:val="DE10AA60"/>
@@ -11403,7 +11952,7 @@
       </w:rPr>
     </w:lvl>
   </w:abstractNum>
-  <w:abstractNum w:abstractNumId="24" w15:restartNumberingAfterBreak="0">
+  <w:abstractNum w:abstractNumId="25" w15:restartNumberingAfterBreak="0">
     <w:nsid w:val="493A76E7"/>
     <w:multiLevelType w:val="hybridMultilevel"/>
     <w:tmpl w:val="B746B0B0"/>
@@ -11516,7 +12065,7 @@
       </w:rPr>
     </w:lvl>
   </w:abstractNum>
-  <w:abstractNum w:abstractNumId="25" w15:restartNumberingAfterBreak="0">
+  <w:abstractNum w:abstractNumId="26" w15:restartNumberingAfterBreak="0">
     <w:nsid w:val="4B7051F5"/>
     <w:multiLevelType w:val="hybridMultilevel"/>
     <w:tmpl w:val="B4C6B37A"/>
@@ -11605,7 +12154,7 @@
       </w:pPr>
     </w:lvl>
   </w:abstractNum>
-  <w:abstractNum w:abstractNumId="26" w15:restartNumberingAfterBreak="0">
+  <w:abstractNum w:abstractNumId="27" w15:restartNumberingAfterBreak="0">
     <w:nsid w:val="4CCB478E"/>
     <w:multiLevelType w:val="hybridMultilevel"/>
     <w:tmpl w:val="F32A2A9E"/>
@@ -11718,7 +12267,7 @@
       </w:rPr>
     </w:lvl>
   </w:abstractNum>
-  <w:abstractNum w:abstractNumId="27" w15:restartNumberingAfterBreak="0">
+  <w:abstractNum w:abstractNumId="28" w15:restartNumberingAfterBreak="0">
     <w:nsid w:val="516D7CF9"/>
     <w:multiLevelType w:val="hybridMultilevel"/>
     <w:tmpl w:val="53ECDE3A"/>
@@ -11831,7 +12380,7 @@
       </w:rPr>
     </w:lvl>
   </w:abstractNum>
-  <w:abstractNum w:abstractNumId="28" w15:restartNumberingAfterBreak="0">
+  <w:abstractNum w:abstractNumId="29" w15:restartNumberingAfterBreak="0">
     <w:nsid w:val="53871932"/>
     <w:multiLevelType w:val="hybridMultilevel"/>
     <w:tmpl w:val="A67A36CE"/>
@@ -11944,7 +12493,7 @@
       </w:rPr>
     </w:lvl>
   </w:abstractNum>
-  <w:abstractNum w:abstractNumId="29" w15:restartNumberingAfterBreak="0">
+  <w:abstractNum w:abstractNumId="30" w15:restartNumberingAfterBreak="0">
     <w:nsid w:val="55643494"/>
     <w:multiLevelType w:val="hybridMultilevel"/>
     <w:tmpl w:val="2DB60AEA"/>
@@ -12057,7 +12606,7 @@
       </w:rPr>
     </w:lvl>
   </w:abstractNum>
-  <w:abstractNum w:abstractNumId="30" w15:restartNumberingAfterBreak="0">
+  <w:abstractNum w:abstractNumId="31" w15:restartNumberingAfterBreak="0">
     <w:nsid w:val="5F186F0E"/>
     <w:multiLevelType w:val="hybridMultilevel"/>
     <w:tmpl w:val="3042A60A"/>
@@ -12169,7 +12718,7 @@
       </w:rPr>
     </w:lvl>
   </w:abstractNum>
-  <w:abstractNum w:abstractNumId="31" w15:restartNumberingAfterBreak="0">
+  <w:abstractNum w:abstractNumId="32" w15:restartNumberingAfterBreak="0">
     <w:nsid w:val="62726812"/>
     <w:multiLevelType w:val="hybridMultilevel"/>
     <w:tmpl w:val="B2D04382"/>
@@ -12282,7 +12831,233 @@
       </w:rPr>
     </w:lvl>
   </w:abstractNum>
-  <w:abstractNum w:abstractNumId="32" w15:restartNumberingAfterBreak="0">
+  <w:abstractNum w:abstractNumId="33" w15:restartNumberingAfterBreak="0">
+    <w:nsid w:val="6E905679"/>
+    <w:multiLevelType w:val="hybridMultilevel"/>
+    <w:tmpl w:val="742C4D2C"/>
+    <w:lvl w:ilvl="0" w:tplc="08090001">
+      <w:start w:val="1"/>
+      <w:numFmt w:val="bullet"/>
+      <w:lvlText w:val=""/>
+      <w:lvlJc w:val="left"/>
+      <w:pPr>
+        <w:ind w:left="360" w:hanging="360"/>
+      </w:pPr>
+      <w:rPr>
+        <w:rFonts w:ascii="Symbol" w:hAnsi="Symbol" w:hint="default"/>
+      </w:rPr>
+    </w:lvl>
+    <w:lvl w:ilvl="1" w:tplc="08090003" w:tentative="1">
+      <w:start w:val="1"/>
+      <w:numFmt w:val="bullet"/>
+      <w:lvlText w:val="o"/>
+      <w:lvlJc w:val="left"/>
+      <w:pPr>
+        <w:ind w:left="1080" w:hanging="360"/>
+      </w:pPr>
+      <w:rPr>
+        <w:rFonts w:ascii="Courier New" w:hAnsi="Courier New" w:cs="Courier New" w:hint="default"/>
+      </w:rPr>
+    </w:lvl>
+    <w:lvl w:ilvl="2" w:tplc="08090005" w:tentative="1">
+      <w:start w:val="1"/>
+      <w:numFmt w:val="bullet"/>
+      <w:lvlText w:val=""/>
+      <w:lvlJc w:val="left"/>
+      <w:pPr>
+        <w:ind w:left="1800" w:hanging="360"/>
+      </w:pPr>
+      <w:rPr>
+        <w:rFonts w:ascii="Wingdings" w:hAnsi="Wingdings" w:hint="default"/>
+      </w:rPr>
+    </w:lvl>
+    <w:lvl w:ilvl="3" w:tplc="08090001" w:tentative="1">
+      <w:start w:val="1"/>
+      <w:numFmt w:val="bullet"/>
+      <w:lvlText w:val=""/>
+      <w:lvlJc w:val="left"/>
+      <w:pPr>
+        <w:ind w:left="2520" w:hanging="360"/>
+      </w:pPr>
+      <w:rPr>
+        <w:rFonts w:ascii="Symbol" w:hAnsi="Symbol" w:hint="default"/>
+      </w:rPr>
+    </w:lvl>
+    <w:lvl w:ilvl="4" w:tplc="08090003" w:tentative="1">
+      <w:start w:val="1"/>
+      <w:numFmt w:val="bullet"/>
+      <w:lvlText w:val="o"/>
+      <w:lvlJc w:val="left"/>
+      <w:pPr>
+        <w:ind w:left="3240" w:hanging="360"/>
+      </w:pPr>
+      <w:rPr>
+        <w:rFonts w:ascii="Courier New" w:hAnsi="Courier New" w:cs="Courier New" w:hint="default"/>
+      </w:rPr>
+    </w:lvl>
+    <w:lvl w:ilvl="5" w:tplc="08090005" w:tentative="1">
+      <w:start w:val="1"/>
+      <w:numFmt w:val="bullet"/>
+      <w:lvlText w:val=""/>
+      <w:lvlJc w:val="left"/>
+      <w:pPr>
+        <w:ind w:left="3960" w:hanging="360"/>
+      </w:pPr>
+      <w:rPr>
+        <w:rFonts w:ascii="Wingdings" w:hAnsi="Wingdings" w:hint="default"/>
+      </w:rPr>
+    </w:lvl>
+    <w:lvl w:ilvl="6" w:tplc="08090001" w:tentative="1">
+      <w:start w:val="1"/>
+      <w:numFmt w:val="bullet"/>
+      <w:lvlText w:val=""/>
+      <w:lvlJc w:val="left"/>
+      <w:pPr>
+        <w:ind w:left="4680" w:hanging="360"/>
+      </w:pPr>
+      <w:rPr>
+        <w:rFonts w:ascii="Symbol" w:hAnsi="Symbol" w:hint="default"/>
+      </w:rPr>
+    </w:lvl>
+    <w:lvl w:ilvl="7" w:tplc="08090003" w:tentative="1">
+      <w:start w:val="1"/>
+      <w:numFmt w:val="bullet"/>
+      <w:lvlText w:val="o"/>
+      <w:lvlJc w:val="left"/>
+      <w:pPr>
+        <w:ind w:left="5400" w:hanging="360"/>
+      </w:pPr>
+      <w:rPr>
+        <w:rFonts w:ascii="Courier New" w:hAnsi="Courier New" w:cs="Courier New" w:hint="default"/>
+      </w:rPr>
+    </w:lvl>
+    <w:lvl w:ilvl="8" w:tplc="08090005" w:tentative="1">
+      <w:start w:val="1"/>
+      <w:numFmt w:val="bullet"/>
+      <w:lvlText w:val=""/>
+      <w:lvlJc w:val="left"/>
+      <w:pPr>
+        <w:ind w:left="6120" w:hanging="360"/>
+      </w:pPr>
+      <w:rPr>
+        <w:rFonts w:ascii="Wingdings" w:hAnsi="Wingdings" w:hint="default"/>
+      </w:rPr>
+    </w:lvl>
+  </w:abstractNum>
+  <w:abstractNum w:abstractNumId="34" w15:restartNumberingAfterBreak="0">
+    <w:nsid w:val="752C699B"/>
+    <w:multiLevelType w:val="hybridMultilevel"/>
+    <w:tmpl w:val="6986A462"/>
+    <w:lvl w:ilvl="0" w:tplc="08090001">
+      <w:start w:val="1"/>
+      <w:numFmt w:val="bullet"/>
+      <w:lvlText w:val=""/>
+      <w:lvlJc w:val="left"/>
+      <w:pPr>
+        <w:ind w:left="360" w:hanging="360"/>
+      </w:pPr>
+      <w:rPr>
+        <w:rFonts w:ascii="Symbol" w:hAnsi="Symbol" w:hint="default"/>
+      </w:rPr>
+    </w:lvl>
+    <w:lvl w:ilvl="1" w:tplc="08090003" w:tentative="1">
+      <w:start w:val="1"/>
+      <w:numFmt w:val="bullet"/>
+      <w:lvlText w:val="o"/>
+      <w:lvlJc w:val="left"/>
+      <w:pPr>
+        <w:ind w:left="1080" w:hanging="360"/>
+      </w:pPr>
+      <w:rPr>
+        <w:rFonts w:ascii="Courier New" w:hAnsi="Courier New" w:cs="Courier New" w:hint="default"/>
+      </w:rPr>
+    </w:lvl>
+    <w:lvl w:ilvl="2" w:tplc="08090005" w:tentative="1">
+      <w:start w:val="1"/>
+      <w:numFmt w:val="bullet"/>
+      <w:lvlText w:val=""/>
+      <w:lvlJc w:val="left"/>
+      <w:pPr>
+        <w:ind w:left="1800" w:hanging="360"/>
+      </w:pPr>
+      <w:rPr>
+        <w:rFonts w:ascii="Wingdings" w:hAnsi="Wingdings" w:hint="default"/>
+      </w:rPr>
+    </w:lvl>
+    <w:lvl w:ilvl="3" w:tplc="08090001" w:tentative="1">
+      <w:start w:val="1"/>
+      <w:numFmt w:val="bullet"/>
+      <w:lvlText w:val=""/>
+      <w:lvlJc w:val="left"/>
+      <w:pPr>
+        <w:ind w:left="2520" w:hanging="360"/>
+      </w:pPr>
+      <w:rPr>
+        <w:rFonts w:ascii="Symbol" w:hAnsi="Symbol" w:hint="default"/>
+      </w:rPr>
+    </w:lvl>
+    <w:lvl w:ilvl="4" w:tplc="08090003" w:tentative="1">
+      <w:start w:val="1"/>
+      <w:numFmt w:val="bullet"/>
+      <w:lvlText w:val="o"/>
+      <w:lvlJc w:val="left"/>
+      <w:pPr>
+        <w:ind w:left="3240" w:hanging="360"/>
+      </w:pPr>
+      <w:rPr>
+        <w:rFonts w:ascii="Courier New" w:hAnsi="Courier New" w:cs="Courier New" w:hint="default"/>
+      </w:rPr>
+    </w:lvl>
+    <w:lvl w:ilvl="5" w:tplc="08090005" w:tentative="1">
+      <w:start w:val="1"/>
+      <w:numFmt w:val="bullet"/>
+      <w:lvlText w:val=""/>
+      <w:lvlJc w:val="left"/>
+      <w:pPr>
+        <w:ind w:left="3960" w:hanging="360"/>
+      </w:pPr>
+      <w:rPr>
+        <w:rFonts w:ascii="Wingdings" w:hAnsi="Wingdings" w:hint="default"/>
+      </w:rPr>
+    </w:lvl>
+    <w:lvl w:ilvl="6" w:tplc="08090001" w:tentative="1">
+      <w:start w:val="1"/>
+      <w:numFmt w:val="bullet"/>
+      <w:lvlText w:val=""/>
+      <w:lvlJc w:val="left"/>
+      <w:pPr>
+        <w:ind w:left="4680" w:hanging="360"/>
+      </w:pPr>
+      <w:rPr>
+        <w:rFonts w:ascii="Symbol" w:hAnsi="Symbol" w:hint="default"/>
+      </w:rPr>
+    </w:lvl>
+    <w:lvl w:ilvl="7" w:tplc="08090003" w:tentative="1">
+      <w:start w:val="1"/>
+      <w:numFmt w:val="bullet"/>
+      <w:lvlText w:val="o"/>
+      <w:lvlJc w:val="left"/>
+      <w:pPr>
+        <w:ind w:left="5400" w:hanging="360"/>
+      </w:pPr>
+      <w:rPr>
+        <w:rFonts w:ascii="Courier New" w:hAnsi="Courier New" w:cs="Courier New" w:hint="default"/>
+      </w:rPr>
+    </w:lvl>
+    <w:lvl w:ilvl="8" w:tplc="08090005" w:tentative="1">
+      <w:start w:val="1"/>
+      <w:numFmt w:val="bullet"/>
+      <w:lvlText w:val=""/>
+      <w:lvlJc w:val="left"/>
+      <w:pPr>
+        <w:ind w:left="6120" w:hanging="360"/>
+      </w:pPr>
+      <w:rPr>
+        <w:rFonts w:ascii="Wingdings" w:hAnsi="Wingdings" w:hint="default"/>
+      </w:rPr>
+    </w:lvl>
+  </w:abstractNum>
+  <w:abstractNum w:abstractNumId="35" w15:restartNumberingAfterBreak="0">
     <w:nsid w:val="7EB2560C"/>
     <w:multiLevelType w:val="hybridMultilevel"/>
     <w:tmpl w:val="8A30D110"/>
@@ -12396,103 +13171,112 @@
     </w:lvl>
   </w:abstractNum>
   <w:num w:numId="1" w16cid:durableId="419330874">
-    <w:abstractNumId w:val="26"/>
+    <w:abstractNumId w:val="27"/>
   </w:num>
   <w:num w:numId="2" w16cid:durableId="1657300222">
     <w:abstractNumId w:val="0"/>
   </w:num>
   <w:num w:numId="3" w16cid:durableId="1837185418">
-    <w:abstractNumId w:val="30"/>
+    <w:abstractNumId w:val="31"/>
   </w:num>
   <w:num w:numId="4" w16cid:durableId="1094787509">
+    <w:abstractNumId w:val="8"/>
+  </w:num>
+  <w:num w:numId="5" w16cid:durableId="1538853044">
+    <w:abstractNumId w:val="24"/>
+  </w:num>
+  <w:num w:numId="6" w16cid:durableId="318577571">
+    <w:abstractNumId w:val="20"/>
+  </w:num>
+  <w:num w:numId="7" w16cid:durableId="1520509371">
+    <w:abstractNumId w:val="26"/>
+  </w:num>
+  <w:num w:numId="8" w16cid:durableId="259871077">
+    <w:abstractNumId w:val="10"/>
+  </w:num>
+  <w:num w:numId="9" w16cid:durableId="1829861366">
     <w:abstractNumId w:val="7"/>
   </w:num>
-  <w:num w:numId="5" w16cid:durableId="1538853044">
-    <w:abstractNumId w:val="23"/>
-  </w:num>
-  <w:num w:numId="6" w16cid:durableId="318577571">
-    <w:abstractNumId w:val="19"/>
-  </w:num>
-  <w:num w:numId="7" w16cid:durableId="1520509371">
-    <w:abstractNumId w:val="25"/>
-  </w:num>
-  <w:num w:numId="8" w16cid:durableId="259871077">
-    <w:abstractNumId w:val="9"/>
-  </w:num>
-  <w:num w:numId="9" w16cid:durableId="1829861366">
-    <w:abstractNumId w:val="6"/>
-  </w:num>
   <w:num w:numId="10" w16cid:durableId="5712501">
-    <w:abstractNumId w:val="28"/>
+    <w:abstractNumId w:val="29"/>
   </w:num>
   <w:num w:numId="11" w16cid:durableId="102775889">
-    <w:abstractNumId w:val="13"/>
+    <w:abstractNumId w:val="14"/>
   </w:num>
   <w:num w:numId="12" w16cid:durableId="345718503">
-    <w:abstractNumId w:val="16"/>
+    <w:abstractNumId w:val="17"/>
   </w:num>
   <w:num w:numId="13" w16cid:durableId="1751927110">
-    <w:abstractNumId w:val="12"/>
+    <w:abstractNumId w:val="13"/>
   </w:num>
   <w:num w:numId="14" w16cid:durableId="1683894115">
     <w:abstractNumId w:val="2"/>
   </w:num>
   <w:num w:numId="15" w16cid:durableId="1437096682">
-    <w:abstractNumId w:val="8"/>
+    <w:abstractNumId w:val="9"/>
   </w:num>
   <w:num w:numId="16" w16cid:durableId="329673521">
-    <w:abstractNumId w:val="21"/>
+    <w:abstractNumId w:val="22"/>
   </w:num>
   <w:num w:numId="17" w16cid:durableId="1086221100">
+    <w:abstractNumId w:val="16"/>
+  </w:num>
+  <w:num w:numId="18" w16cid:durableId="2089040013">
+    <w:abstractNumId w:val="19"/>
+  </w:num>
+  <w:num w:numId="19" w16cid:durableId="2121215578">
+    <w:abstractNumId w:val="28"/>
+  </w:num>
+  <w:num w:numId="20" w16cid:durableId="1689021601">
+    <w:abstractNumId w:val="11"/>
+  </w:num>
+  <w:num w:numId="21" w16cid:durableId="1641613092">
     <w:abstractNumId w:val="15"/>
   </w:num>
-  <w:num w:numId="18" w16cid:durableId="2089040013">
-    <w:abstractNumId w:val="18"/>
-  </w:num>
-  <w:num w:numId="19" w16cid:durableId="2121215578">
-    <w:abstractNumId w:val="27"/>
-  </w:num>
-  <w:num w:numId="20" w16cid:durableId="1689021601">
-    <w:abstractNumId w:val="10"/>
-  </w:num>
-  <w:num w:numId="21" w16cid:durableId="1641613092">
-    <w:abstractNumId w:val="14"/>
-  </w:num>
   <w:num w:numId="22" w16cid:durableId="1377509871">
-    <w:abstractNumId w:val="22"/>
+    <w:abstractNumId w:val="23"/>
   </w:num>
   <w:num w:numId="23" w16cid:durableId="1911110528">
     <w:abstractNumId w:val="1"/>
   </w:num>
   <w:num w:numId="24" w16cid:durableId="343292322">
-    <w:abstractNumId w:val="24"/>
+    <w:abstractNumId w:val="25"/>
   </w:num>
   <w:num w:numId="25" w16cid:durableId="1200168973">
-    <w:abstractNumId w:val="20"/>
+    <w:abstractNumId w:val="21"/>
   </w:num>
   <w:num w:numId="26" w16cid:durableId="1423070140">
     <w:abstractNumId w:val="3"/>
   </w:num>
   <w:num w:numId="27" w16cid:durableId="917977918">
-    <w:abstractNumId w:val="32"/>
+    <w:abstractNumId w:val="35"/>
   </w:num>
   <w:num w:numId="28" w16cid:durableId="1552113307">
-    <w:abstractNumId w:val="11"/>
+    <w:abstractNumId w:val="12"/>
   </w:num>
   <w:num w:numId="29" w16cid:durableId="360017347">
     <w:abstractNumId w:val="4"/>
   </w:num>
   <w:num w:numId="30" w16cid:durableId="1904680936">
-    <w:abstractNumId w:val="17"/>
+    <w:abstractNumId w:val="18"/>
   </w:num>
   <w:num w:numId="31" w16cid:durableId="1368026336">
     <w:abstractNumId w:val="5"/>
   </w:num>
   <w:num w:numId="32" w16cid:durableId="463353631">
-    <w:abstractNumId w:val="29"/>
+    <w:abstractNumId w:val="30"/>
   </w:num>
   <w:num w:numId="33" w16cid:durableId="42144761">
-    <w:abstractNumId w:val="31"/>
+    <w:abstractNumId w:val="32"/>
+  </w:num>
+  <w:num w:numId="34" w16cid:durableId="1643150548">
+    <w:abstractNumId w:val="6"/>
+  </w:num>
+  <w:num w:numId="35" w16cid:durableId="2099011299">
+    <w:abstractNumId w:val="33"/>
+  </w:num>
+  <w:num w:numId="36" w16cid:durableId="1108546570">
+    <w:abstractNumId w:val="34"/>
   </w:num>
 </w:numbering>
 </file>
@@ -12895,7 +13679,7 @@
   <w:style w:type="paragraph" w:default="1" w:styleId="Normal">
     <w:name w:val="Normal"/>
     <w:qFormat/>
-    <w:rsid w:val="00B862DA"/>
+    <w:rsid w:val="005C7A4A"/>
   </w:style>
   <w:style w:type="paragraph" w:styleId="Heading1">
     <w:name w:val="heading 1"/>
@@ -12965,6 +13749,7 @@
   <w:style w:type="character" w:default="1" w:styleId="DefaultParagraphFont">
     <w:name w:val="Default Paragraph Font"/>
     <w:uiPriority w:val="1"/>
+    <w:semiHidden/>
     <w:unhideWhenUsed/>
   </w:style>
   <w:style w:type="table" w:default="1" w:styleId="TableNormal">
@@ -13384,8 +14169,10 @@
     <w:rsid w:val="002E5903"/>
     <w:rsid w:val="002F56F6"/>
     <w:rsid w:val="00340BFA"/>
+    <w:rsid w:val="00436BE1"/>
     <w:rsid w:val="00491129"/>
     <w:rsid w:val="005A1777"/>
+    <w:rsid w:val="0063372C"/>
     <w:rsid w:val="0065743D"/>
     <w:rsid w:val="00755A77"/>
     <w:rsid w:val="00917A83"/>

</xml_diff>